<commit_message>
Point availability statement at the released repository and release assets
</commit_message>
<xml_diff>
--- a/paper_vnr/main.docx
+++ b/paper_vnr/main.docx
@@ -10231,7 +10231,7 @@
       </w:r>
     </w:p>
     <w:bookmarkEnd w:id="69"/>
-    <w:bookmarkStart w:id="102" w:name="declarations"/>
+    <w:bookmarkStart w:id="103" w:name="declarations"/>
     <w:p>
       <w:pPr>
         <w:pStyle w:val="Heading1"/>
@@ -10240,7 +10240,7 @@
         <w:t xml:space="preserve">Declarations</w:t>
       </w:r>
     </w:p>
-    <w:bookmarkStart w:id="70" w:name="availability-of-data-and-materials."/>
+    <w:bookmarkStart w:id="71" w:name="availability-of-data-and-materials."/>
     <w:p>
       <w:pPr>
         <w:pStyle w:val="Heading4"/>
@@ -10266,46 +10266,63 @@
         <w:t xml:space="preserve"> </w:t>
       </w:r>
       <w:r>
-        <w:t xml:space="preserve">development and test), the generator-distribution benchmark, the enumerated</w:t>
-      </w:r>
-      <w:r>
-        <w:t xml:space="preserve"> </w:t>
-      </w:r>
-      <w:r>
-        <w:t xml:space="preserve">candidate sets, all per-item system outputs, the trained character-level</w:t>
-      </w:r>
-      <w:r>
-        <w:t xml:space="preserve"> </w:t>
-      </w:r>
-      <w:r>
-        <w:t xml:space="preserve">generator, and the code reproducing every table and figure are prepared for</w:t>
-      </w:r>
-      <w:r>
-        <w:t xml:space="preserve"> </w:t>
-      </w:r>
-      <w:r>
-        <w:t xml:space="preserve">public release at</w:t>
-      </w:r>
-      <w:r>
-        <w:t xml:space="preserve"> </w:t>
-      </w:r>
-      <w:r>
-        <w:t xml:space="preserve">[REPOSITORY URL TO BE INSERTED]</w:t>
-      </w:r>
-      <w:r>
-        <w:t xml:space="preserve">. Source</w:t>
-      </w:r>
-      <w:r>
-        <w:t xml:space="preserve"> </w:t>
-      </w:r>
-      <w:r>
-        <w:t xml:space="preserve">molecules are from the public GuacaMol/ChEMBL corpus. The code is released</w:t>
-      </w:r>
-      <w:r>
-        <w:t xml:space="preserve"> </w:t>
-      </w:r>
-      <w:r>
-        <w:t xml:space="preserve">under the MIT licence.</w:t>
+        <w:t xml:space="preserve">development and test), the multi-edit and external benchmarks, all per-item</w:t>
+      </w:r>
+      <w:r>
+        <w:t xml:space="preserve"> </w:t>
+      </w:r>
+      <w:r>
+        <w:t xml:space="preserve">system outputs, and the code reproducing every table and figure are available at</w:t>
+      </w:r>
+      <w:r>
+        <w:t xml:space="preserve"> </w:t>
+      </w:r>
+      <w:hyperlink r:id="rId70">
+        <w:r>
+          <w:rPr>
+            <w:rStyle w:val="Hyperlink"/>
+          </w:rPr>
+          <w:t xml:space="preserve">https://github.com/Sridharasyamch/validity-is-not-recovery</w:t>
+        </w:r>
+      </w:hyperlink>
+      <w:r>
+        <w:t xml:space="preserve">. The trained</w:t>
+      </w:r>
+      <w:r>
+        <w:t xml:space="preserve"> </w:t>
+      </w:r>
+      <w:r>
+        <w:t xml:space="preserve">generators and the supervised-corrector baseline are published as release assets</w:t>
+      </w:r>
+      <w:r>
+        <w:t xml:space="preserve"> </w:t>
+      </w:r>
+      <w:r>
+        <w:t xml:space="preserve">in the same repository. The enumerated candidate sets and the 245</w:t>
+      </w:r>
+      <w:r>
+        <w:t xml:space="preserve">,</w:t>
+      </w:r>
+      <w:r>
+        <w:t xml:space="preserve">000-pair</w:t>
+      </w:r>
+      <w:r>
+        <w:t xml:space="preserve"> </w:t>
+      </w:r>
+      <w:r>
+        <w:t xml:space="preserve">supervised-training corpus are omitted for size and regenerate deterministically</w:t>
+      </w:r>
+      <w:r>
+        <w:t xml:space="preserve"> </w:t>
+      </w:r>
+      <w:r>
+        <w:t xml:space="preserve">from the released code. Source molecules are from the public GuacaMol/ChEMBL</w:t>
+      </w:r>
+      <w:r>
+        <w:t xml:space="preserve"> </w:t>
+      </w:r>
+      <w:r>
+        <w:t xml:space="preserve">corpus. The code is released under the MIT licence.</w:t>
       </w:r>
       <w:r>
         <w:t xml:space="preserve"> </w:t>
@@ -10320,8 +10337,8 @@
         <w:t xml:space="preserve">from its authors’ released implementation.</w:t>
       </w:r>
     </w:p>
-    <w:bookmarkEnd w:id="70"/>
-    <w:bookmarkStart w:id="71" w:name="Xfdcbdbe9303d731d2b2f7fb9726fa52252c70dc"/>
+    <w:bookmarkEnd w:id="71"/>
+    <w:bookmarkStart w:id="72" w:name="Xfdcbdbe9303d731d2b2f7fb9726fa52252c70dc"/>
     <w:p>
       <w:pPr>
         <w:pStyle w:val="Heading4"/>
@@ -10338,8 +10355,8 @@
         <w:t xml:space="preserve">Not applicable. This work involves no human participants, human data, or animals.</w:t>
       </w:r>
     </w:p>
-    <w:bookmarkEnd w:id="71"/>
-    <w:bookmarkStart w:id="72" w:name="consent-for-publication."/>
+    <w:bookmarkEnd w:id="72"/>
+    <w:bookmarkStart w:id="73" w:name="consent-for-publication."/>
     <w:p>
       <w:pPr>
         <w:pStyle w:val="Heading4"/>
@@ -10356,8 +10373,8 @@
         <w:t xml:space="preserve">Not applicable.</w:t>
       </w:r>
     </w:p>
-    <w:bookmarkEnd w:id="72"/>
-    <w:bookmarkStart w:id="73" w:name="competing-interests."/>
+    <w:bookmarkEnd w:id="73"/>
+    <w:bookmarkStart w:id="74" w:name="competing-interests."/>
     <w:p>
       <w:pPr>
         <w:pStyle w:val="Heading4"/>
@@ -10374,8 +10391,8 @@
         <w:t xml:space="preserve">The authors declare no competing interests.</w:t>
       </w:r>
     </w:p>
-    <w:bookmarkEnd w:id="73"/>
-    <w:bookmarkStart w:id="74" w:name="funding."/>
+    <w:bookmarkEnd w:id="74"/>
+    <w:bookmarkStart w:id="75" w:name="funding."/>
     <w:p>
       <w:pPr>
         <w:pStyle w:val="Heading4"/>
@@ -10392,8 +10409,8 @@
         <w:t xml:space="preserve">Not applicable.</w:t>
       </w:r>
     </w:p>
-    <w:bookmarkEnd w:id="74"/>
-    <w:bookmarkStart w:id="75" w:name="authors-contributions."/>
+    <w:bookmarkEnd w:id="75"/>
+    <w:bookmarkStart w:id="76" w:name="authors-contributions."/>
     <w:p>
       <w:pPr>
         <w:pStyle w:val="Heading4"/>
@@ -10422,8 +10439,8 @@
         <w:t xml:space="preserve">method, analysed the results, and wrote and approved the manuscript.</w:t>
       </w:r>
     </w:p>
-    <w:bookmarkEnd w:id="75"/>
-    <w:bookmarkStart w:id="101" w:name="acknowledgements."/>
+    <w:bookmarkEnd w:id="76"/>
+    <w:bookmarkStart w:id="102" w:name="acknowledgements."/>
     <w:p>
       <w:pPr>
         <w:pStyle w:val="Heading4"/>
@@ -10440,8 +10457,8 @@
         <w:t xml:space="preserve">Not applicable.</w:t>
       </w:r>
     </w:p>
-    <w:bookmarkStart w:id="100" w:name="refs"/>
-    <w:bookmarkStart w:id="76" w:name="ref-bemis1996properties"/>
+    <w:bookmarkStart w:id="101" w:name="refs"/>
+    <w:bookmarkStart w:id="77" w:name="ref-bemis1996properties"/>
     <w:p>
       <w:pPr>
         <w:pStyle w:val="Bibliography"/>
@@ -10472,8 +10489,8 @@
         <w:t xml:space="preserve">39 (15): 2887–93.</w:t>
       </w:r>
     </w:p>
-    <w:bookmarkEnd w:id="76"/>
-    <w:bookmarkStart w:id="77" w:name="ref-brown2019guacamol"/>
+    <w:bookmarkEnd w:id="77"/>
+    <w:bookmarkStart w:id="78" w:name="ref-brown2019guacamol"/>
     <w:p>
       <w:pPr>
         <w:pStyle w:val="Bibliography"/>
@@ -10510,8 +10527,8 @@
         <w:t xml:space="preserve">59 (3): 1096–108.</w:t>
       </w:r>
     </w:p>
-    <w:bookmarkEnd w:id="77"/>
-    <w:bookmarkStart w:id="78" w:name="ref-dai2018syntax"/>
+    <w:bookmarkEnd w:id="78"/>
+    <w:bookmarkStart w:id="79" w:name="ref-dai2018syntax"/>
     <w:p>
       <w:pPr>
         <w:pStyle w:val="Bibliography"/>
@@ -10539,8 +10556,8 @@
         <w:t xml:space="preserve">.</w:t>
       </w:r>
     </w:p>
-    <w:bookmarkEnd w:id="78"/>
-    <w:bookmarkStart w:id="79" w:name="ref-garcez2023neurosymbolic"/>
+    <w:bookmarkEnd w:id="79"/>
+    <w:bookmarkStart w:id="80" w:name="ref-garcez2023neurosymbolic"/>
     <w:p>
       <w:pPr>
         <w:pStyle w:val="Bibliography"/>
@@ -10580,8 +10597,8 @@
         <w:t xml:space="preserve">56: 12387–406.</w:t>
       </w:r>
     </w:p>
-    <w:bookmarkEnd w:id="79"/>
-    <w:bookmarkStart w:id="80" w:name="ref-geng2023grammar"/>
+    <w:bookmarkEnd w:id="80"/>
+    <w:bookmarkStart w:id="81" w:name="ref-geng2023grammar"/>
     <w:p>
       <w:pPr>
         <w:pStyle w:val="Bibliography"/>
@@ -10621,8 +10638,8 @@
         <w:t xml:space="preserve">.</w:t>
       </w:r>
     </w:p>
-    <w:bookmarkEnd w:id="80"/>
-    <w:bookmarkStart w:id="81" w:name="ref-gou2024critic"/>
+    <w:bookmarkEnd w:id="81"/>
+    <w:bookmarkStart w:id="82" w:name="ref-gou2024critic"/>
     <w:p>
       <w:pPr>
         <w:pStyle w:val="Bibliography"/>
@@ -10659,8 +10676,8 @@
         <w:t xml:space="preserve">.</w:t>
       </w:r>
     </w:p>
-    <w:bookmarkEnd w:id="81"/>
-    <w:bookmarkStart w:id="82" w:name="ref-krenn2022selfies"/>
+    <w:bookmarkEnd w:id="82"/>
+    <w:bookmarkStart w:id="83" w:name="ref-krenn2022selfies"/>
     <w:p>
       <w:pPr>
         <w:pStyle w:val="Bibliography"/>
@@ -10703,8 +10720,8 @@
         <w:t xml:space="preserve">3 (10): 100588.</w:t>
       </w:r>
     </w:p>
-    <w:bookmarkEnd w:id="82"/>
-    <w:bookmarkStart w:id="83" w:name="ref-krenn2020selfies"/>
+    <w:bookmarkEnd w:id="83"/>
+    <w:bookmarkStart w:id="84" w:name="ref-krenn2020selfies"/>
     <w:p>
       <w:pPr>
         <w:pStyle w:val="Bibliography"/>
@@ -10741,8 +10758,8 @@
         <w:t xml:space="preserve">1 (4): 045024.</w:t>
       </w:r>
     </w:p>
-    <w:bookmarkEnd w:id="83"/>
-    <w:bookmarkStart w:id="84" w:name="ref-kusner2017grammar"/>
+    <w:bookmarkEnd w:id="84"/>
+    <w:bookmarkStart w:id="85" w:name="ref-kusner2017grammar"/>
     <w:p>
       <w:pPr>
         <w:pStyle w:val="Bibliography"/>
@@ -10770,8 +10787,8 @@
         <w:t xml:space="preserve">, 1945–54.</w:t>
       </w:r>
     </w:p>
-    <w:bookmarkEnd w:id="84"/>
-    <w:bookmarkStart w:id="86" w:name="ref-rdkit"/>
+    <w:bookmarkEnd w:id="85"/>
+    <w:bookmarkStart w:id="87" w:name="ref-rdkit"/>
     <w:p>
       <w:pPr>
         <w:pStyle w:val="Bibliography"/>
@@ -10805,7 +10822,7 @@
       <w:r>
         <w:t xml:space="preserve"> </w:t>
       </w:r>
-      <w:hyperlink r:id="rId85">
+      <w:hyperlink r:id="rId86">
         <w:r>
           <w:rPr>
             <w:rStyle w:val="Hyperlink"/>
@@ -10817,8 +10834,8 @@
         <w:t xml:space="preserve">.</w:t>
       </w:r>
     </w:p>
-    <w:bookmarkEnd w:id="86"/>
-    <w:bookmarkStart w:id="87" w:name="ref-madaan2023selfrefine"/>
+    <w:bookmarkEnd w:id="87"/>
+    <w:bookmarkStart w:id="88" w:name="ref-madaan2023selfrefine"/>
     <w:p>
       <w:pPr>
         <w:pStyle w:val="Bibliography"/>
@@ -10855,8 +10872,8 @@
         <w:t xml:space="preserve">.</w:t>
       </w:r>
     </w:p>
-    <w:bookmarkEnd w:id="87"/>
-    <w:bookmarkStart w:id="88" w:name="ref-polykovskiy2020moses"/>
+    <w:bookmarkEnd w:id="88"/>
+    <w:bookmarkStart w:id="89" w:name="ref-polykovskiy2020moses"/>
     <w:p>
       <w:pPr>
         <w:pStyle w:val="Bibliography"/>
@@ -10896,8 +10913,8 @@
         <w:t xml:space="preserve">11: 565644.</w:t>
       </w:r>
     </w:p>
-    <w:bookmarkEnd w:id="88"/>
-    <w:bookmarkStart w:id="89" w:name="ref-qwen2025"/>
+    <w:bookmarkEnd w:id="89"/>
+    <w:bookmarkStart w:id="90" w:name="ref-qwen2025"/>
     <w:p>
       <w:pPr>
         <w:pStyle w:val="Bibliography"/>
@@ -10933,8 +10950,8 @@
         <w:t xml:space="preserve">. Alibaba Group.</w:t>
       </w:r>
     </w:p>
-    <w:bookmarkEnd w:id="89"/>
-    <w:bookmarkStart w:id="90" w:name="ref-rogers2010extended"/>
+    <w:bookmarkEnd w:id="90"/>
+    <w:bookmarkStart w:id="91" w:name="ref-rogers2010extended"/>
     <w:p>
       <w:pPr>
         <w:pStyle w:val="Bibliography"/>
@@ -10965,8 +10982,8 @@
         <w:t xml:space="preserve">50 (5): 742–54.</w:t>
       </w:r>
     </w:p>
-    <w:bookmarkEnd w:id="90"/>
-    <w:bookmarkStart w:id="92" w:name="ref-schoenmaker2023uncorrupt"/>
+    <w:bookmarkEnd w:id="91"/>
+    <w:bookmarkStart w:id="93" w:name="ref-schoenmaker2023uncorrupt"/>
     <w:p>
       <w:pPr>
         <w:pStyle w:val="Bibliography"/>
@@ -11011,7 +11028,7 @@
       <w:r>
         <w:t xml:space="preserve"> </w:t>
       </w:r>
-      <w:hyperlink r:id="rId91">
+      <w:hyperlink r:id="rId92">
         <w:r>
           <w:rPr>
             <w:rStyle w:val="Hyperlink"/>
@@ -11023,8 +11040,8 @@
         <w:t xml:space="preserve">.</w:t>
       </w:r>
     </w:p>
-    <w:bookmarkEnd w:id="92"/>
-    <w:bookmarkStart w:id="94" w:name="ref-skinnider2024invalid"/>
+    <w:bookmarkEnd w:id="93"/>
+    <w:bookmarkStart w:id="95" w:name="ref-skinnider2024invalid"/>
     <w:p>
       <w:pPr>
         <w:pStyle w:val="Bibliography"/>
@@ -11069,7 +11086,7 @@
       <w:r>
         <w:t xml:space="preserve"> </w:t>
       </w:r>
-      <w:hyperlink r:id="rId93">
+      <w:hyperlink r:id="rId94">
         <w:r>
           <w:rPr>
             <w:rStyle w:val="Hyperlink"/>
@@ -11081,8 +11098,8 @@
         <w:t xml:space="preserve">.</w:t>
       </w:r>
     </w:p>
-    <w:bookmarkEnd w:id="94"/>
-    <w:bookmarkStart w:id="96" w:name="ref-smiself2025"/>
+    <w:bookmarkEnd w:id="95"/>
+    <w:bookmarkStart w:id="97" w:name="ref-smiself2025"/>
     <w:p>
       <w:pPr>
         <w:pStyle w:val="Bibliography"/>
@@ -11124,7 +11141,7 @@
       <w:r>
         <w:t xml:space="preserve"> </w:t>
       </w:r>
-      <w:hyperlink r:id="rId95">
+      <w:hyperlink r:id="rId96">
         <w:r>
           <w:rPr>
             <w:rStyle w:val="Hyperlink"/>
@@ -11136,8 +11153,8 @@
         <w:t xml:space="preserve">.</w:t>
       </w:r>
     </w:p>
-    <w:bookmarkEnd w:id="96"/>
-    <w:bookmarkStart w:id="97" w:name="ref-weininger1988smiles"/>
+    <w:bookmarkEnd w:id="97"/>
+    <w:bookmarkStart w:id="98" w:name="ref-weininger1988smiles"/>
     <w:p>
       <w:pPr>
         <w:pStyle w:val="Bibliography"/>
@@ -11174,8 +11191,8 @@
         <w:t xml:space="preserve">28 (1): 31–36.</w:t>
       </w:r>
     </w:p>
-    <w:bookmarkEnd w:id="97"/>
-    <w:bookmarkStart w:id="98" w:name="ref-welleck2023generating"/>
+    <w:bookmarkEnd w:id="98"/>
+    <w:bookmarkStart w:id="99" w:name="ref-welleck2023generating"/>
     <w:p>
       <w:pPr>
         <w:pStyle w:val="Bibliography"/>
@@ -11206,8 +11223,8 @@
         <w:t xml:space="preserve">.</w:t>
       </w:r>
     </w:p>
-    <w:bookmarkEnd w:id="98"/>
-    <w:bookmarkStart w:id="99" w:name="ref-amrec"/>
+    <w:bookmarkEnd w:id="99"/>
+    <w:bookmarkStart w:id="100" w:name="ref-amrec"/>
     <w:p>
       <w:pPr>
         <w:pStyle w:val="Bibliography"/>
@@ -11235,10 +11252,10 @@
         <w:t xml:space="preserve">.</w:t>
       </w:r>
     </w:p>
-    <w:bookmarkEnd w:id="99"/>
     <w:bookmarkEnd w:id="100"/>
     <w:bookmarkEnd w:id="101"/>
     <w:bookmarkEnd w:id="102"/>
+    <w:bookmarkEnd w:id="103"/>
     <w:sectPr>
       <w:footnotePr>
         <w:numRestart w:val="eachSect"/>

</xml_diff>

<commit_message>
Support the sampling-temperature claim with our own measurement; normalise Qwen2.5 citation year
</commit_message>
<xml_diff>
--- a/paper_vnr/main.docx
+++ b/paper_vnr/main.docx
@@ -560,13 +560,13 @@
         <w:t xml:space="preserve"> </w:t>
       </w:r>
       <w:r>
-        <w:t xml:space="preserve">un-kekulizable. Depending on architecture and sampling temperature, between a</w:t>
-      </w:r>
-      <w:r>
-        <w:t xml:space="preserve"> </w:t>
-      </w:r>
-      <w:r>
-        <w:t xml:space="preserve">few percent and a large minority of sampled strings fail to</w:t>
+        <w:t xml:space="preserve">un-kekulizable. Depending on architecture, between a few percent and a large</w:t>
+      </w:r>
+      <w:r>
+        <w:t xml:space="preserve"> </w:t>
+      </w:r>
+      <w:r>
+        <w:t xml:space="preserve">minority of sampled strings fail to</w:t>
       </w:r>
       <w:r>
         <w:t xml:space="preserve"> </w:t>
@@ -589,6 +589,84 @@
       <w:r>
         <w:t xml:space="preserve">2020)</w:t>
       </w:r>
+      <w:r>
+        <w:t xml:space="preserve">. Sampling temperature</w:t>
+      </w:r>
+      <w:r>
+        <w:t xml:space="preserve"> </w:t>
+      </w:r>
+      <w:r>
+        <w:t xml:space="preserve">compounds this: the character-level generator we use throughout falls from</w:t>
+      </w:r>
+      <w:r>
+        <w:t xml:space="preserve"> </w:t>
+      </w:r>
+      <w:r>
+        <w:t xml:space="preserve">93.3% valid at</w:t>
+      </w:r>
+      <w:r>
+        <w:t xml:space="preserve"> </w:t>
+      </w:r>
+      <m:oMath>
+        <m:r>
+          <m:t>T</m:t>
+        </m:r>
+        <m:r>
+          <m:rPr>
+            <m:sty m:val="p"/>
+          </m:rPr>
+          <m:t>=</m:t>
+        </m:r>
+        <m:r>
+          <m:t>1.0</m:t>
+        </m:r>
+      </m:oMath>
+      <w:r>
+        <w:t xml:space="preserve"> </w:t>
+      </w:r>
+      <w:r>
+        <w:t xml:space="preserve">to 85.3% at</w:t>
+      </w:r>
+      <w:r>
+        <w:t xml:space="preserve"> </w:t>
+      </w:r>
+      <m:oMath>
+        <m:r>
+          <m:t>T</m:t>
+        </m:r>
+        <m:r>
+          <m:rPr>
+            <m:sty m:val="p"/>
+          </m:rPr>
+          <m:t>=</m:t>
+        </m:r>
+        <m:r>
+          <m:t>1.2</m:t>
+        </m:r>
+      </m:oMath>
+      <w:r>
+        <w:t xml:space="preserve"> </w:t>
+      </w:r>
+      <w:r>
+        <w:t xml:space="preserve">and 64.1% at</w:t>
+      </w:r>
+      <w:r>
+        <w:t xml:space="preserve"> </w:t>
+      </w:r>
+      <m:oMath>
+        <m:r>
+          <m:t>T</m:t>
+        </m:r>
+        <m:r>
+          <m:rPr>
+            <m:sty m:val="p"/>
+          </m:rPr>
+          <m:t>=</m:t>
+        </m:r>
+        <m:r>
+          <m:t>1.5</m:t>
+        </m:r>
+      </m:oMath>
       <w:r>
         <w:t xml:space="preserve">.</w:t>
       </w:r>
@@ -5109,7 +5187,7 @@
               <w:t xml:space="preserve">General LLM likelihood (Qwen2.5-14B </w:t>
             </w:r>
             <w:r>
-              <w:t xml:space="preserve">(Qwen Team 2025)</w:t>
+              <w:t xml:space="preserve">(Qwen Team 2024)</w:t>
             </w:r>
             <w:r>
               <w:t xml:space="preserve">, 14.7B params)</w:t>
@@ -10920,7 +10998,7 @@
         <w:pStyle w:val="Bibliography"/>
       </w:pPr>
       <w:r>
-        <w:t xml:space="preserve">Qwen Team. 2025.</w:t>
+        <w:t xml:space="preserve">Qwen Team. 2024.</w:t>
       </w:r>
       <w:r>
         <w:t xml:space="preserve"> </w:t>

</xml_diff>

<commit_message>
Correct characterisation of prior work: credit reconstruction-rate and exact-match metrics in Schoenmaker and Tao, fix Skinnider polarity, cite the directly comparable UnCorrupt figure
</commit_message>
<xml_diff>
--- a/paper_vnr/main.docx
+++ b/paper_vnr/main.docx
@@ -197,13 +197,7 @@
         <w:t xml:space="preserve"> </w:t>
       </w:r>
       <w:r>
-        <w:t xml:space="preserve">them. That</w:t>
-      </w:r>
-      <w:r>
-        <w:t xml:space="preserve"> </w:t>
-      </w:r>
-      <w:r>
-        <w:t xml:space="preserve">literature is evaluated almost entirely by</w:t>
+        <w:t xml:space="preserve">them.</w:t>
       </w:r>
       <w:r>
         <w:t xml:space="preserve"> </w:t>
@@ -213,22 +207,22 @@
           <w:i/>
           <w:iCs/>
         </w:rPr>
-        <w:t xml:space="preserve">validity</w:t>
-      </w:r>
-      <w:r>
-        <w:t xml:space="preserve">: the fraction of</w:t>
-      </w:r>
-      <w:r>
-        <w:t xml:space="preserve"> </w:t>
-      </w:r>
-      <w:r>
-        <w:t xml:space="preserve">repaired strings that parse. We show that validity is a weak proxy for what</w:t>
-      </w:r>
-      <w:r>
-        <w:t xml:space="preserve"> </w:t>
-      </w:r>
-      <w:r>
-        <w:t xml:space="preserve">actually matters, namely whether the</w:t>
+        <w:t xml:space="preserve">Validity</w:t>
+      </w:r>
+      <w:r>
+        <w:t xml:space="preserve">, the fraction of repaired strings that parse, is the headline by</w:t>
+      </w:r>
+      <w:r>
+        <w:t xml:space="preserve"> </w:t>
+      </w:r>
+      <w:r>
+        <w:t xml:space="preserve">which that work is claimed, even where identity metrics are reported too. We show</w:t>
+      </w:r>
+      <w:r>
+        <w:t xml:space="preserve"> </w:t>
+      </w:r>
+      <w:r>
+        <w:t xml:space="preserve">validity is a weak proxy for whether the</w:t>
       </w:r>
       <w:r>
         <w:t xml:space="preserve"> </w:t>
@@ -244,19 +238,13 @@
         <w:t xml:space="preserve"> </w:t>
       </w:r>
       <w:r>
-        <w:t xml:space="preserve">molecule is</w:t>
-      </w:r>
-      <w:r>
-        <w:t xml:space="preserve"> </w:t>
-      </w:r>
-      <w:r>
-        <w:t xml:space="preserve">recovered, and that validity-only evaluation can substantially mis-rank</w:t>
-      </w:r>
-      <w:r>
-        <w:t xml:space="preserve"> </w:t>
-      </w:r>
-      <w:r>
-        <w:t xml:space="preserve">molecular recovery systems.</w:t>
+        <w:t xml:space="preserve">molecule is recovered,</w:t>
+      </w:r>
+      <w:r>
+        <w:t xml:space="preserve"> </w:t>
+      </w:r>
+      <w:r>
+        <w:t xml:space="preserve">and that validity-only evaluation can substantially mis-rank recovery systems.</w:t>
       </w:r>
     </w:p>
     <w:p>
@@ -294,13 +282,13 @@
         <w:t xml:space="preserve"> </w:t>
       </w:r>
       <w:r>
-        <w:t xml:space="preserve">intended molecule for only 1.2% of inputs: it emits roughly 74 valid molecules</w:t>
-      </w:r>
-      <w:r>
-        <w:t xml:space="preserve"> </w:t>
-      </w:r>
-      <w:r>
-        <w:t xml:space="preserve">for every correct one. An unconstrained large-language-model repair loop shows</w:t>
+        <w:t xml:space="preserve">intended molecule for 1.2% of inputs: roughly 74 valid molecules per correct</w:t>
+      </w:r>
+      <w:r>
+        <w:t xml:space="preserve"> </w:t>
+      </w:r>
+      <w:r>
+        <w:t xml:space="preserve">one. An unconstrained large-language-model repair loop shows</w:t>
       </w:r>
       <w:r>
         <w:t xml:space="preserve"> </w:t>
@@ -712,51 +700,43 @@
         <w:t xml:space="preserve"> </w:t>
       </w:r>
       <w:r>
-        <w:t xml:space="preserve">broken string and repair it. Correction is attractive because invalid outputs</w:t>
-      </w:r>
-      <w:r>
-        <w:t xml:space="preserve"> </w:t>
-      </w:r>
-      <w:r>
-        <w:t xml:space="preserve">are not noise. They are concentrated in the regions of chemical space where the</w:t>
-      </w:r>
-      <w:r>
-        <w:t xml:space="preserve"> </w:t>
-      </w:r>
-      <w:r>
-        <w:t xml:space="preserve">model is least certain, and discarding them biases the sampled distribution;</w:t>
-      </w:r>
-      <w:r>
-        <w:t xml:space="preserve"> </w:t>
-      </w:r>
-      <w:r>
-        <w:t xml:space="preserve">indeed, invalid SMILES appear to carry useful training</w:t>
-      </w:r>
-      <w:r>
-        <w:t xml:space="preserve"> </w:t>
-      </w:r>
-      <w:r>
-        <w:t xml:space="preserve">signal </w:t>
-      </w:r>
-      <w:r>
-        <w:t xml:space="preserve">(Skinnider 2024)</w:t>
-      </w:r>
-      <w:r>
-        <w:t xml:space="preserve">.</w:t>
-      </w:r>
-    </w:p>
-    <w:p>
-      <w:pPr>
-        <w:pStyle w:val="BodyText"/>
-      </w:pPr>
-      <w:r>
-        <w:t xml:space="preserve">Both prevention and correction are, however, almost always scored the same way:</w:t>
-      </w:r>
-      <w:r>
-        <w:t xml:space="preserve"> </w:t>
-      </w:r>
-      <w:r>
-        <w:t xml:space="preserve">by</w:t>
+        <w:t xml:space="preserve">broken string and repair it. Correction is attractive because invalid strings are</w:t>
+      </w:r>
+      <w:r>
+        <w:t xml:space="preserve"> </w:t>
+      </w:r>
+      <w:r>
+        <w:t xml:space="preserve">concentrated where the model is least certain, so discarding them throws away the</w:t>
+      </w:r>
+      <w:r>
+        <w:t xml:space="preserve"> </w:t>
+      </w:r>
+      <w:r>
+        <w:t xml:space="preserve">model’s hardest cases. The premise deserves care, however:</w:t>
+      </w:r>
+      <w:r>
+        <w:t xml:space="preserve"> </w:t>
+      </w:r>
+      <w:r>
+        <w:t xml:space="preserve">Skinnider (2024)</w:t>
+      </w:r>
+      <w:r>
+        <w:t xml:space="preserve"> </w:t>
+      </w:r>
+      <w:r>
+        <w:t xml:space="preserve">shows that the ability to emit invalid strings is</w:t>
+      </w:r>
+      <w:r>
+        <w:t xml:space="preserve"> </w:t>
+      </w:r>
+      <w:r>
+        <w:t xml:space="preserve">itself beneficial, acting as a self-corrective filter on low-likelihood samples,</w:t>
+      </w:r>
+      <w:r>
+        <w:t xml:space="preserve"> </w:t>
+      </w:r>
+      <w:r>
+        <w:t xml:space="preserve">and that</w:t>
       </w:r>
       <w:r>
         <w:t xml:space="preserve"> </w:t>
@@ -766,34 +746,120 @@
           <w:i/>
           <w:iCs/>
         </w:rPr>
-        <w:t xml:space="preserve">validity</w:t>
-      </w:r>
-      <w:r>
-        <w:t xml:space="preserve">, the fraction of outputs a toolkit will parse. Validity is</w:t>
-      </w:r>
-      <w:r>
-        <w:t xml:space="preserve"> </w:t>
-      </w:r>
-      <w:r>
-        <w:t xml:space="preserve">easy to compute, needs no ground truth, and is the headline number in most of</w:t>
-      </w:r>
-      <w:r>
-        <w:t xml:space="preserve"> </w:t>
-      </w:r>
-      <w:r>
-        <w:t xml:space="preserve">this literature. That it is not the whole story has been argued</w:t>
-      </w:r>
-      <w:r>
-        <w:t xml:space="preserve"> </w:t>
-      </w:r>
-      <w:r>
-        <w:t xml:space="preserve">before </w:t>
-      </w:r>
-      <w:r>
-        <w:t xml:space="preserve">(Yoon and Lee 2026; Skinnider 2024)</w:t>
-      </w:r>
-      <w:r>
-        <w:t xml:space="preserve">. What has not been established is how</w:t>
+        <w:t xml:space="preserve">enforcing</w:t>
+      </w:r>
+      <w:r>
+        <w:t xml:space="preserve"> </w:t>
+      </w:r>
+      <w:r>
+        <w:t xml:space="preserve">validity introduces structural bias. That argument</w:t>
+      </w:r>
+      <w:r>
+        <w:t xml:space="preserve"> </w:t>
+      </w:r>
+      <w:r>
+        <w:t xml:space="preserve">tells against prevention rather than against correction, since a repaired string</w:t>
+      </w:r>
+      <w:r>
+        <w:t xml:space="preserve"> </w:t>
+      </w:r>
+      <w:r>
+        <w:t xml:space="preserve">is recovered after the fact rather than forced during sampling. It does mean the</w:t>
+      </w:r>
+      <w:r>
+        <w:t xml:space="preserve"> </w:t>
+      </w:r>
+      <w:r>
+        <w:t xml:space="preserve">case for repair rests on recovering the intended molecule, not merely on raising</w:t>
+      </w:r>
+      <w:r>
+        <w:t xml:space="preserve"> </w:t>
+      </w:r>
+      <w:r>
+        <w:t xml:space="preserve">a validity count.</w:t>
+      </w:r>
+    </w:p>
+    <w:p>
+      <w:pPr>
+        <w:pStyle w:val="BodyText"/>
+      </w:pPr>
+      <w:r>
+        <w:t xml:space="preserve">Validity is easy to compute, needs no ground truth, and is the number these</w:t>
+      </w:r>
+      <w:r>
+        <w:t xml:space="preserve"> </w:t>
+      </w:r>
+      <w:r>
+        <w:t xml:space="preserve">systems are named and compared by. It is not the only number reported.</w:t>
+      </w:r>
+      <w:r>
+        <w:t xml:space="preserve"> </w:t>
+      </w:r>
+      <w:r>
+        <w:t xml:space="preserve">Schoenmaker et al. (2023)</w:t>
+      </w:r>
+      <w:r>
+        <w:t xml:space="preserve"> </w:t>
+      </w:r>
+      <w:r>
+        <w:t xml:space="preserve">measure a molecule reconstruction rate of 78%</w:t>
+      </w:r>
+      <w:r>
+        <w:t xml:space="preserve"> </w:t>
+      </w:r>
+      <w:r>
+        <w:t xml:space="preserve">and observe that</w:t>
+      </w:r>
+      <w:r>
+        <w:t xml:space="preserve"> </w:t>
+      </w:r>
+      <w:r>
+        <w:t xml:space="preserve">“fixed molecules do not necessarily represent the original</w:t>
+      </w:r>
+      <w:r>
+        <w:t xml:space="preserve"> </w:t>
+      </w:r>
+      <w:r>
+        <w:t xml:space="preserve">molecule”</w:t>
+      </w:r>
+      <w:r>
+        <w:t xml:space="preserve">;</w:t>
+      </w:r>
+      <w:r>
+        <w:t xml:space="preserve"> </w:t>
+      </w:r>
+      <w:r>
+        <w:t xml:space="preserve">Tao et al. (2025)</w:t>
+      </w:r>
+      <w:r>
+        <w:t xml:space="preserve"> </w:t>
+      </w:r>
+      <w:r>
+        <w:t xml:space="preserve">report exact match to the ground truth alongside</w:t>
+      </w:r>
+      <w:r>
+        <w:t xml:space="preserve"> </w:t>
+      </w:r>
+      <w:r>
+        <w:t xml:space="preserve">validity; and</w:t>
+      </w:r>
+      <w:r>
+        <w:t xml:space="preserve"> </w:t>
+      </w:r>
+      <w:r>
+        <w:t xml:space="preserve">Yoon and Lee (2026)</w:t>
+      </w:r>
+      <w:r>
+        <w:t xml:space="preserve"> </w:t>
+      </w:r>
+      <w:r>
+        <w:t xml:space="preserve">argue the distinction directly. The gap between</w:t>
+      </w:r>
+      <w:r>
+        <w:t xml:space="preserve"> </w:t>
+      </w:r>
+      <w:r>
+        <w:t xml:space="preserve">validity and identity is therefore known. What has not been established is how</w:t>
       </w:r>
       <w:r>
         <w:t xml:space="preserve"> </w:t>
@@ -1430,52 +1496,55 @@
         <w:t xml:space="preserve">(Schoenmaker et al. 2023)</w:t>
       </w:r>
       <w:r>
-        <w:t xml:space="preserve">. A more recent</w:t>
-      </w:r>
-      <w:r>
-        <w:t xml:space="preserve"> </w:t>
-      </w:r>
-      <w:r>
-        <w:t xml:space="preserve">approach converts an invalid SMILES into SELFIES via grammar rules, obtaining</w:t>
-      </w:r>
-      <w:r>
-        <w:t xml:space="preserve"> </w:t>
-      </w:r>
-      <w:r>
-        <w:t xml:space="preserve">essentially complete validity </w:t>
+        <w:t xml:space="preserve">, which</w:t>
+      </w:r>
+      <w:r>
+        <w:t xml:space="preserve"> </w:t>
+      </w:r>
+      <w:r>
+        <w:t xml:space="preserve">reports a 78% molecule reconstruction rate and 70.5% at one error per input.</w:t>
+      </w:r>
+      <w:r>
+        <w:t xml:space="preserve"> </w:t>
+      </w:r>
+      <w:r>
+        <w:t xml:space="preserve">A more recent approach converts an invalid SMILES into SELFIES via grammar rules,</w:t>
+      </w:r>
+      <w:r>
+        <w:t xml:space="preserve"> </w:t>
+      </w:r>
+      <w:r>
+        <w:t xml:space="preserve">obtaining essentially complete validity </w:t>
       </w:r>
       <w:r>
         <w:t xml:space="preserve">(Tao et al. 2025)</w:t>
       </w:r>
       <w:r>
-        <w:t xml:space="preserve">. Both are evaluated primarily</w:t>
-      </w:r>
-      <w:r>
-        <w:t xml:space="preserve"> </w:t>
-      </w:r>
-      <w:r>
-        <w:t xml:space="preserve">by validity, and </w:t>
-      </w:r>
-      <w:r>
-        <w:t xml:space="preserve">Tao et al. (2025)</w:t>
-      </w:r>
-      <w:r>
-        <w:t xml:space="preserve"> </w:t>
-      </w:r>
-      <w:r>
-        <w:t xml:space="preserve">additionally report that language-model</w:t>
-      </w:r>
-      <w:r>
-        <w:t xml:space="preserve"> </w:t>
-      </w:r>
-      <w:r>
-        <w:t xml:space="preserve">correction is of limited benefit, a conclusion our results qualify, since it</w:t>
-      </w:r>
-      <w:r>
-        <w:t xml:space="preserve"> </w:t>
-      </w:r>
-      <w:r>
-        <w:t xml:space="preserve">is drawn under validity-based scoring.</w:t>
+        <w:t xml:space="preserve">; it too reports exact</w:t>
+      </w:r>
+      <w:r>
+        <w:t xml:space="preserve"> </w:t>
+      </w:r>
+      <w:r>
+        <w:t xml:space="preserve">match to the ground truth, and reasons about whether corrected strings recover the</w:t>
+      </w:r>
+      <w:r>
+        <w:t xml:space="preserve"> </w:t>
+      </w:r>
+      <w:r>
+        <w:t xml:space="preserve">intended molecule. Neither work is validity-only. What neither does, and what this</w:t>
+      </w:r>
+      <w:r>
+        <w:t xml:space="preserve"> </w:t>
+      </w:r>
+      <w:r>
+        <w:t xml:space="preserve">paper supplies, is a controlled setting in which validity and identity are measured</w:t>
+      </w:r>
+      <w:r>
+        <w:t xml:space="preserve"> </w:t>
+      </w:r>
+      <w:r>
+        <w:t xml:space="preserve">side by side across systems, so that the two rankings can be compared directly.</w:t>
       </w:r>
     </w:p>
     <w:bookmarkEnd w:id="13"/>
@@ -7741,7 +7810,61 @@
         </m:r>
       </m:oMath>
       <w:r>
-        <w:t xml:space="preserve">).</w:t>
+        <w:t xml:space="preserve">). This reconstructs the condition</w:t>
+      </w:r>
+      <w:r>
+        <w:t xml:space="preserve"> </w:t>
+      </w:r>
+      <w:r>
+        <w:t xml:space="preserve">Schoenmaker et al. (2023)</w:t>
+      </w:r>
+      <w:r>
+        <w:t xml:space="preserve"> </w:t>
+      </w:r>
+      <w:r>
+        <w:t xml:space="preserve">evaluate themselves, so their published figure is</w:t>
+      </w:r>
+      <w:r>
+        <w:t xml:space="preserve"> </w:t>
+      </w:r>
+      <w:r>
+        <w:t xml:space="preserve">the natural reference point: 70.5% reconstruction at one error per input, and</w:t>
+      </w:r>
+      <w:r>
+        <w:t xml:space="preserve"> </w:t>
+      </w:r>
+      <w:r>
+        <w:t xml:space="preserve">78% for their translator overall. The comparison is indicative rather than</w:t>
+      </w:r>
+      <w:r>
+        <w:t xml:space="preserve"> </w:t>
+      </w:r>
+      <w:r>
+        <w:t xml:space="preserve">like-for-like, since their model is trained on this corruption distribution and</w:t>
+      </w:r>
+      <w:r>
+        <w:t xml:space="preserve"> </w:t>
+      </w:r>
+      <w:r>
+        <w:t xml:space="preserve">ours is not, their evaluation set is their own validation split, and the operator</w:t>
+      </w:r>
+      <w:r>
+        <w:t xml:space="preserve"> </w:t>
+      </w:r>
+      <w:r>
+        <w:t xml:space="preserve">mix differs from the one we sample. It is nonetheless the closest direct point of</w:t>
+      </w:r>
+      <w:r>
+        <w:t xml:space="preserve"> </w:t>
+      </w:r>
+      <w:r>
+        <w:t xml:space="preserve">contact between the two systems, and we report it rather than leave it to be</w:t>
+      </w:r>
+      <w:r>
+        <w:t xml:space="preserve"> </w:t>
+      </w:r>
+      <w:r>
+        <w:t xml:space="preserve">inferred.</w:t>
       </w:r>
     </w:p>
     <w:p>

</xml_diff>

<commit_message>
Attribute the constrained-selection formulation to Considine (2025) and narrow the contribution claim accordingly
</commit_message>
<xml_diff>
--- a/paper_vnr/main.docx
+++ b/paper_vnr/main.docx
@@ -1236,13 +1236,34 @@
         </w:numPr>
       </w:pPr>
       <w:r>
-        <w:t xml:space="preserve">A reformulation of recovery as constrained selection, and a six-stage</w:t>
-      </w:r>
-      <w:r>
-        <w:t xml:space="preserve"> </w:t>
-      </w:r>
-      <w:r>
-        <w:t xml:space="preserve">neuro-symbolic system,</w:t>
+        <w:t xml:space="preserve">A transfer of the bounded-edit constrained-selection formulation from</w:t>
+      </w:r>
+      <w:r>
+        <w:t xml:space="preserve"> </w:t>
+      </w:r>
+      <w:r>
+        <w:t xml:space="preserve">syntax repair </w:t>
+      </w:r>
+      <w:r>
+        <w:t xml:space="preserve">(Considine 2025)</w:t>
+      </w:r>
+      <w:r>
+        <w:t xml:space="preserve"> </w:t>
+      </w:r>
+      <w:r>
+        <w:t xml:space="preserve">to molecular strings, instantiated</w:t>
+      </w:r>
+      <w:r>
+        <w:t xml:space="preserve"> </w:t>
+      </w:r>
+      <w:r>
+        <w:t xml:space="preserve">with a chemistry toolkit’s diagnosis as the pruning constraint and a chemical</w:t>
+      </w:r>
+      <w:r>
+        <w:t xml:space="preserve"> </w:t>
+      </w:r>
+      <w:r>
+        <w:t xml:space="preserve">language model as the prior: a six-stage system,</w:t>
       </w:r>
       <w:r>
         <w:t xml:space="preserve"> </w:t>
@@ -1254,13 +1275,19 @@
         <w:t xml:space="preserve">EnumRank</w:t>
       </w:r>
       <w:r>
-        <w:t xml:space="preserve">, that attains 100.0% validity and 80.7%</w:t>
-      </w:r>
-      <w:r>
-        <w:t xml:space="preserve"> </w:t>
-      </w:r>
-      <w:r>
-        <w:t xml:space="preserve">exact recovery (Sections </w:t>
+        <w:t xml:space="preserve">, attaining 100.0%</w:t>
+      </w:r>
+      <w:r>
+        <w:t xml:space="preserve"> </w:t>
+      </w:r>
+      <w:r>
+        <w:t xml:space="preserve">validity and 80.7% exact recovery</w:t>
+      </w:r>
+      <w:r>
+        <w:t xml:space="preserve"> </w:t>
+      </w:r>
+      <w:r>
+        <w:t xml:space="preserve">(Sections </w:t>
       </w:r>
       <w:hyperlink w:anchor="sec:method">
         <w:r>
@@ -1803,19 +1830,79 @@
         <w:t xml:space="preserve"> </w:t>
       </w:r>
       <w:r>
-        <w:t xml:space="preserve">component merely check, we let the symbolic component define a sound and</w:t>
-      </w:r>
-      <w:r>
-        <w:t xml:space="preserve"> </w:t>
-      </w:r>
-      <w:r>
-        <w:t xml:space="preserve">near-complete hypothesis space and use the neural component only to rank within</w:t>
-      </w:r>
-      <w:r>
-        <w:t xml:space="preserve"> </w:t>
-      </w:r>
-      <w:r>
-        <w:t xml:space="preserve">it.</w:t>
+        <w:t xml:space="preserve">component merely check, the symbolic component defines a sound hypothesis space</w:t>
+      </w:r>
+      <w:r>
+        <w:t xml:space="preserve"> </w:t>
+      </w:r>
+      <w:r>
+        <w:t xml:space="preserve">and the neural component only ranks within it. That division is not ours.</w:t>
+      </w:r>
+      <w:r>
+        <w:t xml:space="preserve"> </w:t>
+      </w:r>
+      <w:r>
+        <w:t xml:space="preserve">Considine (2025)</w:t>
+      </w:r>
+      <w:r>
+        <w:t xml:space="preserve"> </w:t>
+      </w:r>
+      <w:r>
+        <w:t xml:space="preserve">formulates bounded syntax repair as an intersection</w:t>
+      </w:r>
+      <w:r>
+        <w:t xml:space="preserve"> </w:t>
+      </w:r>
+      <w:r>
+        <w:t xml:space="preserve">of a context-free language with a Levenshtein automaton, separating exact</w:t>
+      </w:r>
+      <w:r>
+        <w:t xml:space="preserve"> </w:t>
+      </w:r>
+      <w:r>
+        <w:t xml:space="preserve">admissibility from probabilistic ranking, and argues that coverage must be</w:t>
+      </w:r>
+      <w:r>
+        <w:t xml:space="preserve"> </w:t>
+      </w:r>
+      <w:r>
+        <w:t xml:space="preserve">measured because reranking cannot repair a retrieval failure. We adopt that</w:t>
+      </w:r>
+      <w:r>
+        <w:t xml:space="preserve"> </w:t>
+      </w:r>
+      <w:r>
+        <w:t xml:space="preserve">formulation and ask what it takes to make it work for molecules, where the</w:t>
+      </w:r>
+      <w:r>
+        <w:t xml:space="preserve"> </w:t>
+      </w:r>
+      <w:r>
+        <w:t xml:space="preserve">analogous machinery is unavailable: by our own measured error mix, kekulisation</w:t>
+      </w:r>
+      <w:r>
+        <w:t xml:space="preserve"> </w:t>
+      </w:r>
+      <w:r>
+        <w:t xml:space="preserve">and valence violations account for 56.5% of real failures, and neither is</w:t>
+      </w:r>
+      <w:r>
+        <w:t xml:space="preserve"> </w:t>
+      </w:r>
+      <w:r>
+        <w:t xml:space="preserve">context-free. Our soundness therefore comes from an oracle filter (RDKit parse and sanitise)</w:t>
+      </w:r>
+      <w:r>
+        <w:t xml:space="preserve"> </w:t>
+      </w:r>
+      <w:r>
+        <w:t xml:space="preserve">rather than from a grammar, and the pruning constraint from that same toolkit’s</w:t>
+      </w:r>
+      <w:r>
+        <w:t xml:space="preserve"> </w:t>
+      </w:r>
+      <w:r>
+        <w:t xml:space="preserve">diagnosis.</w:t>
       </w:r>
     </w:p>
     <w:bookmarkEnd w:id="16"/>
@@ -10432,7 +10519,7 @@
       </w:r>
     </w:p>
     <w:bookmarkEnd w:id="69"/>
-    <w:bookmarkStart w:id="103" w:name="declarations"/>
+    <w:bookmarkStart w:id="104" w:name="declarations"/>
     <w:p>
       <w:pPr>
         <w:pStyle w:val="Heading1"/>
@@ -10641,7 +10728,7 @@
       </w:r>
     </w:p>
     <w:bookmarkEnd w:id="76"/>
-    <w:bookmarkStart w:id="102" w:name="acknowledgements."/>
+    <w:bookmarkStart w:id="103" w:name="acknowledgements."/>
     <w:p>
       <w:pPr>
         <w:pStyle w:val="Heading4"/>
@@ -10658,7 +10745,7 @@
         <w:t xml:space="preserve">Not applicable.</w:t>
       </w:r>
     </w:p>
-    <w:bookmarkStart w:id="101" w:name="refs"/>
+    <w:bookmarkStart w:id="102" w:name="refs"/>
     <w:bookmarkStart w:id="77" w:name="ref-bemis1996properties"/>
     <w:p>
       <w:pPr>
@@ -10729,7 +10816,36 @@
       </w:r>
     </w:p>
     <w:bookmarkEnd w:id="78"/>
-    <w:bookmarkStart w:id="79" w:name="ref-dai2018syntax"/>
+    <w:bookmarkStart w:id="79" w:name="ref-considine2025syntax"/>
+    <w:p>
+      <w:pPr>
+        <w:pStyle w:val="Bibliography"/>
+      </w:pPr>
+      <w:r>
+        <w:t xml:space="preserve">Considine, Breandan. 2025.</w:t>
+      </w:r>
+      <w:r>
+        <w:t xml:space="preserve"> </w:t>
+      </w:r>
+      <w:r>
+        <w:t xml:space="preserve">“Syntax Repair as Language Intersection.”</w:t>
+      </w:r>
+      <w:r>
+        <w:t xml:space="preserve"> </w:t>
+      </w:r>
+      <w:r>
+        <w:rPr>
+          <w:i/>
+          <w:iCs/>
+        </w:rPr>
+        <w:t xml:space="preserve">arXiv Preprint arXiv:2507.11873</w:t>
+      </w:r>
+      <w:r>
+        <w:t xml:space="preserve">.</w:t>
+      </w:r>
+    </w:p>
+    <w:bookmarkEnd w:id="79"/>
+    <w:bookmarkStart w:id="80" w:name="ref-dai2018syntax"/>
     <w:p>
       <w:pPr>
         <w:pStyle w:val="Bibliography"/>
@@ -10757,8 +10873,8 @@
         <w:t xml:space="preserve">.</w:t>
       </w:r>
     </w:p>
-    <w:bookmarkEnd w:id="79"/>
-    <w:bookmarkStart w:id="80" w:name="ref-garcez2023neurosymbolic"/>
+    <w:bookmarkEnd w:id="80"/>
+    <w:bookmarkStart w:id="81" w:name="ref-garcez2023neurosymbolic"/>
     <w:p>
       <w:pPr>
         <w:pStyle w:val="Bibliography"/>
@@ -10798,8 +10914,8 @@
         <w:t xml:space="preserve">56: 12387–406.</w:t>
       </w:r>
     </w:p>
-    <w:bookmarkEnd w:id="80"/>
-    <w:bookmarkStart w:id="81" w:name="ref-geng2023grammar"/>
+    <w:bookmarkEnd w:id="81"/>
+    <w:bookmarkStart w:id="82" w:name="ref-geng2023grammar"/>
     <w:p>
       <w:pPr>
         <w:pStyle w:val="Bibliography"/>
@@ -10839,8 +10955,8 @@
         <w:t xml:space="preserve">.</w:t>
       </w:r>
     </w:p>
-    <w:bookmarkEnd w:id="81"/>
-    <w:bookmarkStart w:id="82" w:name="ref-gou2024critic"/>
+    <w:bookmarkEnd w:id="82"/>
+    <w:bookmarkStart w:id="83" w:name="ref-gou2024critic"/>
     <w:p>
       <w:pPr>
         <w:pStyle w:val="Bibliography"/>
@@ -10877,8 +10993,8 @@
         <w:t xml:space="preserve">.</w:t>
       </w:r>
     </w:p>
-    <w:bookmarkEnd w:id="82"/>
-    <w:bookmarkStart w:id="83" w:name="ref-krenn2022selfies"/>
+    <w:bookmarkEnd w:id="83"/>
+    <w:bookmarkStart w:id="84" w:name="ref-krenn2022selfies"/>
     <w:p>
       <w:pPr>
         <w:pStyle w:val="Bibliography"/>
@@ -10921,8 +11037,8 @@
         <w:t xml:space="preserve">3 (10): 100588.</w:t>
       </w:r>
     </w:p>
-    <w:bookmarkEnd w:id="83"/>
-    <w:bookmarkStart w:id="84" w:name="ref-krenn2020selfies"/>
+    <w:bookmarkEnd w:id="84"/>
+    <w:bookmarkStart w:id="85" w:name="ref-krenn2020selfies"/>
     <w:p>
       <w:pPr>
         <w:pStyle w:val="Bibliography"/>
@@ -10959,8 +11075,8 @@
         <w:t xml:space="preserve">1 (4): 045024.</w:t>
       </w:r>
     </w:p>
-    <w:bookmarkEnd w:id="84"/>
-    <w:bookmarkStart w:id="85" w:name="ref-kusner2017grammar"/>
+    <w:bookmarkEnd w:id="85"/>
+    <w:bookmarkStart w:id="86" w:name="ref-kusner2017grammar"/>
     <w:p>
       <w:pPr>
         <w:pStyle w:val="Bibliography"/>
@@ -10988,8 +11104,8 @@
         <w:t xml:space="preserve">, 1945–54.</w:t>
       </w:r>
     </w:p>
-    <w:bookmarkEnd w:id="85"/>
-    <w:bookmarkStart w:id="87" w:name="ref-rdkit"/>
+    <w:bookmarkEnd w:id="86"/>
+    <w:bookmarkStart w:id="88" w:name="ref-rdkit"/>
     <w:p>
       <w:pPr>
         <w:pStyle w:val="Bibliography"/>
@@ -11023,7 +11139,7 @@
       <w:r>
         <w:t xml:space="preserve"> </w:t>
       </w:r>
-      <w:hyperlink r:id="rId86">
+      <w:hyperlink r:id="rId87">
         <w:r>
           <w:rPr>
             <w:rStyle w:val="Hyperlink"/>
@@ -11035,8 +11151,8 @@
         <w:t xml:space="preserve">.</w:t>
       </w:r>
     </w:p>
-    <w:bookmarkEnd w:id="87"/>
-    <w:bookmarkStart w:id="88" w:name="ref-madaan2023selfrefine"/>
+    <w:bookmarkEnd w:id="88"/>
+    <w:bookmarkStart w:id="89" w:name="ref-madaan2023selfrefine"/>
     <w:p>
       <w:pPr>
         <w:pStyle w:val="Bibliography"/>
@@ -11073,8 +11189,8 @@
         <w:t xml:space="preserve">.</w:t>
       </w:r>
     </w:p>
-    <w:bookmarkEnd w:id="88"/>
-    <w:bookmarkStart w:id="89" w:name="ref-polykovskiy2020moses"/>
+    <w:bookmarkEnd w:id="89"/>
+    <w:bookmarkStart w:id="90" w:name="ref-polykovskiy2020moses"/>
     <w:p>
       <w:pPr>
         <w:pStyle w:val="Bibliography"/>
@@ -11114,8 +11230,8 @@
         <w:t xml:space="preserve">11: 565644.</w:t>
       </w:r>
     </w:p>
-    <w:bookmarkEnd w:id="89"/>
-    <w:bookmarkStart w:id="90" w:name="ref-qwen2025"/>
+    <w:bookmarkEnd w:id="90"/>
+    <w:bookmarkStart w:id="91" w:name="ref-qwen2025"/>
     <w:p>
       <w:pPr>
         <w:pStyle w:val="Bibliography"/>
@@ -11151,8 +11267,8 @@
         <w:t xml:space="preserve">. Alibaba Group.</w:t>
       </w:r>
     </w:p>
-    <w:bookmarkEnd w:id="90"/>
-    <w:bookmarkStart w:id="91" w:name="ref-rogers2010extended"/>
+    <w:bookmarkEnd w:id="91"/>
+    <w:bookmarkStart w:id="92" w:name="ref-rogers2010extended"/>
     <w:p>
       <w:pPr>
         <w:pStyle w:val="Bibliography"/>
@@ -11183,8 +11299,8 @@
         <w:t xml:space="preserve">50 (5): 742–54.</w:t>
       </w:r>
     </w:p>
-    <w:bookmarkEnd w:id="91"/>
-    <w:bookmarkStart w:id="93" w:name="ref-schoenmaker2023uncorrupt"/>
+    <w:bookmarkEnd w:id="92"/>
+    <w:bookmarkStart w:id="94" w:name="ref-schoenmaker2023uncorrupt"/>
     <w:p>
       <w:pPr>
         <w:pStyle w:val="Bibliography"/>
@@ -11229,7 +11345,7 @@
       <w:r>
         <w:t xml:space="preserve"> </w:t>
       </w:r>
-      <w:hyperlink r:id="rId92">
+      <w:hyperlink r:id="rId93">
         <w:r>
           <w:rPr>
             <w:rStyle w:val="Hyperlink"/>
@@ -11241,8 +11357,8 @@
         <w:t xml:space="preserve">.</w:t>
       </w:r>
     </w:p>
-    <w:bookmarkEnd w:id="93"/>
-    <w:bookmarkStart w:id="95" w:name="ref-skinnider2024invalid"/>
+    <w:bookmarkEnd w:id="94"/>
+    <w:bookmarkStart w:id="96" w:name="ref-skinnider2024invalid"/>
     <w:p>
       <w:pPr>
         <w:pStyle w:val="Bibliography"/>
@@ -11287,7 +11403,7 @@
       <w:r>
         <w:t xml:space="preserve"> </w:t>
       </w:r>
-      <w:hyperlink r:id="rId94">
+      <w:hyperlink r:id="rId95">
         <w:r>
           <w:rPr>
             <w:rStyle w:val="Hyperlink"/>
@@ -11299,8 +11415,8 @@
         <w:t xml:space="preserve">.</w:t>
       </w:r>
     </w:p>
-    <w:bookmarkEnd w:id="95"/>
-    <w:bookmarkStart w:id="97" w:name="ref-smiself2025"/>
+    <w:bookmarkEnd w:id="96"/>
+    <w:bookmarkStart w:id="98" w:name="ref-smiself2025"/>
     <w:p>
       <w:pPr>
         <w:pStyle w:val="Bibliography"/>
@@ -11342,7 +11458,7 @@
       <w:r>
         <w:t xml:space="preserve"> </w:t>
       </w:r>
-      <w:hyperlink r:id="rId96">
+      <w:hyperlink r:id="rId97">
         <w:r>
           <w:rPr>
             <w:rStyle w:val="Hyperlink"/>
@@ -11354,8 +11470,8 @@
         <w:t xml:space="preserve">.</w:t>
       </w:r>
     </w:p>
-    <w:bookmarkEnd w:id="97"/>
-    <w:bookmarkStart w:id="98" w:name="ref-weininger1988smiles"/>
+    <w:bookmarkEnd w:id="98"/>
+    <w:bookmarkStart w:id="99" w:name="ref-weininger1988smiles"/>
     <w:p>
       <w:pPr>
         <w:pStyle w:val="Bibliography"/>
@@ -11392,8 +11508,8 @@
         <w:t xml:space="preserve">28 (1): 31–36.</w:t>
       </w:r>
     </w:p>
-    <w:bookmarkEnd w:id="98"/>
-    <w:bookmarkStart w:id="99" w:name="ref-welleck2023generating"/>
+    <w:bookmarkEnd w:id="99"/>
+    <w:bookmarkStart w:id="100" w:name="ref-welleck2023generating"/>
     <w:p>
       <w:pPr>
         <w:pStyle w:val="Bibliography"/>
@@ -11424,8 +11540,8 @@
         <w:t xml:space="preserve">.</w:t>
       </w:r>
     </w:p>
-    <w:bookmarkEnd w:id="99"/>
-    <w:bookmarkStart w:id="100" w:name="ref-amrec"/>
+    <w:bookmarkEnd w:id="100"/>
+    <w:bookmarkStart w:id="101" w:name="ref-amrec"/>
     <w:p>
       <w:pPr>
         <w:pStyle w:val="Bibliography"/>
@@ -11453,10 +11569,10 @@
         <w:t xml:space="preserve">.</w:t>
       </w:r>
     </w:p>
-    <w:bookmarkEnd w:id="100"/>
     <w:bookmarkEnd w:id="101"/>
     <w:bookmarkEnd w:id="102"/>
     <w:bookmarkEnd w:id="103"/>
+    <w:bookmarkEnd w:id="104"/>
     <w:sectPr>
       <w:footnotePr>
         <w:numRestart w:val="eachSect"/>

</xml_diff>

<commit_message>
Scope empty candidate sets to what the data shows, without attributing them to multiple errors
</commit_message>
<xml_diff>
--- a/paper_vnr/main.docx
+++ b/paper_vnr/main.docx
@@ -6316,25 +6316,37 @@
         <w:t xml:space="preserve"> </w:t>
       </w:r>
       <w:r>
-        <w:t xml:space="preserve">built the benchmark. The remaining 8.5% carry more than one simultaneous</w:t>
-      </w:r>
-      <w:r>
-        <w:t xml:space="preserve"> </w:t>
-      </w:r>
-      <w:r>
-        <w:t xml:space="preserve">error and are outside the current enumerator; we return them unchanged rather</w:t>
-      </w:r>
-      <w:r>
-        <w:t xml:space="preserve"> </w:t>
-      </w:r>
-      <w:r>
-        <w:t xml:space="preserve">than guessing, which is the correct behaviour for a system that is asked to</w:t>
-      </w:r>
-      <w:r>
-        <w:t xml:space="preserve"> </w:t>
-      </w:r>
-      <w:r>
-        <w:t xml:space="preserve">preserve identity.</w:t>
+        <w:t xml:space="preserve">built the benchmark. For the remaining 8.5% no valid molecule lies within one</w:t>
+      </w:r>
+      <w:r>
+        <w:t xml:space="preserve"> </w:t>
+      </w:r>
+      <w:r>
+        <w:t xml:space="preserve">token edit, so they fall outside the current hypothesis space; we return them</w:t>
+      </w:r>
+      <w:r>
+        <w:t xml:space="preserve"> </w:t>
+      </w:r>
+      <w:r>
+        <w:t xml:space="preserve">unchanged rather than guessing, which is the correct behaviour for a system that</w:t>
+      </w:r>
+      <w:r>
+        <w:t xml:space="preserve"> </w:t>
+      </w:r>
+      <w:r>
+        <w:t xml:space="preserve">is asked to preserve identity. We cannot say why those sets are empty, since</w:t>
+      </w:r>
+      <w:r>
+        <w:t xml:space="preserve"> </w:t>
+      </w:r>
+      <w:r>
+        <w:t xml:space="preserve">these are real failures for which no ground truth exists; only that a one-edit</w:t>
+      </w:r>
+      <w:r>
+        <w:t xml:space="preserve"> </w:t>
+      </w:r>
+      <w:r>
+        <w:t xml:space="preserve">enumeration does not reach a valid molecule.</w:t>
       </w:r>
     </w:p>
     <w:bookmarkEnd w:id="48"/>
@@ -8654,30 +8666,31 @@
         <w:t xml:space="preserve"> </w:t>
       </w:r>
       <w:r>
-        <w:t xml:space="preserve">against. The 15.5% it declines are the multi-edit corruptions of</w:t>
-      </w:r>
-      <w:r>
-        <w:t xml:space="preserve"> </w:t>
-      </w:r>
-      <w:r>
-        <w:t xml:space="preserve">Experiment </w:t>
-      </w:r>
-      <w:hyperlink w:anchor="sec:exp7">
-        <w:r>
-          <w:rPr>
-            <w:rStyle w:val="Hyperlink"/>
-          </w:rPr>
-          <w:t xml:space="preserve">6.7</w:t>
-        </w:r>
-      </w:hyperlink>
-      <w:r>
-        <w:t xml:space="preserve">, and declining them is the correct behaviour for a</w:t>
-      </w:r>
-      <w:r>
-        <w:t xml:space="preserve"> </w:t>
-      </w:r>
-      <w:r>
-        <w:t xml:space="preserve">system whose purpose is to preserve identity.</w:t>
+        <w:t xml:space="preserve">against. For the 15.5% it declines, no valid molecule lies within one token</w:t>
+      </w:r>
+      <w:r>
+        <w:t xml:space="preserve"> </w:t>
+      </w:r>
+      <w:r>
+        <w:t xml:space="preserve">edit of the input. That is not the same as saying each carries several errors:</w:t>
+      </w:r>
+      <w:r>
+        <w:t xml:space="preserve"> </w:t>
+      </w:r>
+      <w:r>
+        <w:t xml:space="preserve">their operators permute tokens and graft whole fragments, either of which can</w:t>
+      </w:r>
+      <w:r>
+        <w:t xml:space="preserve"> </w:t>
+      </w:r>
+      <w:r>
+        <w:t xml:space="preserve">leave the one-edit space in a single application. Declining them is the correct</w:t>
+      </w:r>
+      <w:r>
+        <w:t xml:space="preserve"> </w:t>
+      </w:r>
+      <w:r>
+        <w:t xml:space="preserve">behaviour for a system whose purpose is to preserve identity.</w:t>
       </w:r>
     </w:p>
     <w:bookmarkEnd w:id="54"/>

</xml_diff>

<commit_message>
Scope claims to the evidence: candidate-set language for real failures, uniform-baseline decomposition, prespecified comparisons, ranker-specific contamination claim
</commit_message>
<xml_diff>
--- a/paper_vnr/main.docx
+++ b/paper_vnr/main.docx
@@ -405,49 +405,64 @@
         <w:t xml:space="preserve"> </w:t>
       </w:r>
       <w:r>
-        <w:t xml:space="preserve">The ranker is trained only on a disjoint molecule split, so the result is not</w:t>
-      </w:r>
-      <w:r>
-        <w:t xml:space="preserve"> </w:t>
-      </w:r>
-      <w:r>
-        <w:t xml:space="preserve">pretraining contamination. The approach transfers to real</w:t>
-      </w:r>
-      <w:r>
-        <w:t xml:space="preserve"> </w:t>
-      </w:r>
-      <w:r>
-        <w:t xml:space="preserve">generative-model output: 91.5% of 4</w:t>
+        <w:t xml:space="preserve">The</w:t>
+      </w:r>
+      <w:r>
+        <w:t xml:space="preserve"> </w:t>
+      </w:r>
+      <w:r>
+        <w:rPr>
+          <w:smallCaps/>
+        </w:rPr>
+        <w:t xml:space="preserve">EnumRank</w:t>
+      </w:r>
+      <w:r>
+        <w:t xml:space="preserve"> </w:t>
+      </w:r>
+      <w:r>
+        <w:t xml:space="preserve">ranker is trained only on a disjoint molecule split, so its headline</w:t>
+      </w:r>
+      <w:r>
+        <w:t xml:space="preserve"> </w:t>
+      </w:r>
+      <w:r>
+        <w:t xml:space="preserve">result does not depend on web-pretrained recall of test molecules. It transfers</w:t>
+      </w:r>
+      <w:r>
+        <w:t xml:space="preserve"> </w:t>
+      </w:r>
+      <w:r>
+        <w:t xml:space="preserve">to real generative-model output: 91.5% of 4</w:t>
       </w:r>
       <w:r>
         <w:t xml:space="preserve">,</w:t>
       </w:r>
       <w:r>
-        <w:t xml:space="preserve">009 genuinely invalid strings sampled</w:t>
-      </w:r>
-      <w:r>
-        <w:t xml:space="preserve"> </w:t>
-      </w:r>
-      <w:r>
-        <w:t xml:space="preserve">from a character-level generator admit a one-edit repair, and on corruptions of</w:t>
-      </w:r>
-      <w:r>
-        <w:t xml:space="preserve"> </w:t>
-      </w:r>
-      <w:r>
-        <w:t xml:space="preserve">that generator’s own molecules recovery is 78.9%. On an external benchmark built</w:t>
-      </w:r>
-      <w:r>
-        <w:t xml:space="preserve"> </w:t>
-      </w:r>
-      <w:r>
-        <w:t xml:space="preserve">with another group’s corruption code and molecule corpus, recovery among</w:t>
-      </w:r>
-      <w:r>
-        <w:t xml:space="preserve"> </w:t>
-      </w:r>
-      <w:r>
-        <w:t xml:space="preserve">reachable items is 87.5%, and its output is always valid where it answers.</w:t>
+        <w:t xml:space="preserve">009 genuinely invalid strings from</w:t>
+      </w:r>
+      <w:r>
+        <w:t xml:space="preserve"> </w:t>
+      </w:r>
+      <w:r>
+        <w:t xml:space="preserve">a character-level generator have a non-empty one-edit candidate set, and on</w:t>
+      </w:r>
+      <w:r>
+        <w:t xml:space="preserve"> </w:t>
+      </w:r>
+      <w:r>
+        <w:t xml:space="preserve">corruptions of that generator’s own molecules recovery is 78.9%. On an external benchmark built with another group’s corruption code and corpus,</w:t>
+      </w:r>
+      <w:r>
+        <w:t xml:space="preserve"> </w:t>
+      </w:r>
+      <w:r>
+        <w:t xml:space="preserve">recovery among reachable items is 87.5%, and output is always valid where it</w:t>
+      </w:r>
+      <w:r>
+        <w:t xml:space="preserve"> </w:t>
+      </w:r>
+      <w:r>
+        <w:t xml:space="preserve">answers.</w:t>
       </w:r>
       <w:r>
         <w:t xml:space="preserve"> </w:t>
@@ -459,19 +474,13 @@
         <w:t xml:space="preserve"> </w:t>
       </w:r>
       <w:r>
-        <w:t xml:space="preserve">scope. Ranking confidence supports calibrated abstention: 46% of all inputs can</w:t>
-      </w:r>
-      <w:r>
-        <w:t xml:space="preserve"> </w:t>
-      </w:r>
-      <w:r>
-        <w:t xml:space="preserve">be answered at 96.4% precision.</w:t>
-      </w:r>
-      <w:r>
-        <w:t xml:space="preserve"> </w:t>
-      </w:r>
-      <w:r>
-        <w:t xml:space="preserve">We release the benchmark, code, and per-item outputs.</w:t>
+        <w:t xml:space="preserve">scope. Ranking confidence supports abstention: 46% of inputs can be answered at</w:t>
+      </w:r>
+      <w:r>
+        <w:t xml:space="preserve"> </w:t>
+      </w:r>
+      <w:r>
+        <w:t xml:space="preserve">96.4% precision. We release the benchmark, code, and per-item outputs.</w:t>
       </w:r>
     </w:p>
     <w:p>
@@ -1342,24 +1351,19 @@
         <w:t xml:space="preserve"> </w:t>
       </w:r>
       <w:r>
-        <w:t xml:space="preserve">enumeration makes recovery possible (99.79% candidate coverage); the</w:t>
-      </w:r>
-      <w:r>
-        <w:t xml:space="preserve"> </w:t>
-      </w:r>
-      <w:r>
-        <w:t xml:space="preserve">chemical prior makes it accurate (12.7% </w:t>
-      </w:r>
-      <m:oMath>
-        <m:r>
-          <m:rPr>
-            <m:sty m:val="p"/>
-          </m:rPr>
-          <m:t>→</m:t>
-        </m:r>
-      </m:oMath>
-      <w:r>
-        <w:t xml:space="preserve"> 80.7%).</w:t>
+        <w:t xml:space="preserve">enumeration makes recovery possible (99.79% candidate coverage); and on</w:t>
+      </w:r>
+      <w:r>
+        <w:t xml:space="preserve"> </w:t>
+      </w:r>
+      <w:r>
+        <w:t xml:space="preserve">the fixed pruned candidate set, selection raises exact recovery from</w:t>
+      </w:r>
+      <w:r>
+        <w:t xml:space="preserve"> </w:t>
+      </w:r>
+      <w:r>
+        <w:t xml:space="preserve">13.6% with uniform choice to 80.7% with the domain language model.</w:t>
       </w:r>
     </w:p>
     <w:p>
@@ -3751,7 +3755,13 @@
         </m:r>
       </m:oMath>
       <w:r>
-        <w:t xml:space="preserve">). Identity metrics are</w:t>
+        <w:t xml:space="preserve">). Validity and exact</w:t>
+      </w:r>
+      <w:r>
+        <w:t xml:space="preserve"> </w:t>
+      </w:r>
+      <w:r>
+        <w:t xml:space="preserve">recovery are overall rates; Tanimoto similarity and scaffold match are</w:t>
       </w:r>
       <w:r>
         <w:t xml:space="preserve"> </w:t>
@@ -3800,7 +3810,7 @@
         <w:tblStyle w:val="Table"/>
         <w:tblW w:type="auto" w:w="0"/>
         <w:tblLook w:firstRow="1" w:lastRow="0" w:firstColumn="0" w:lastColumn="0" w:noHBand="0" w:noVBand="0" w:val="0020"/>
-        <w:tblCaption w:val="Recovery on the held-out test split (n=4{,}200). Identity metrics are conditioned on producing a valid molecule. \mathrm{V/R} is valid outputs per correct recovery; 1.0 is ideal."/>
+        <w:tblCaption w:val="Recovery on the held-out test split (n=4{,}200). Validity and exact recovery are overall rates; Tanimoto similarity and scaffold match are conditioned on producing a valid molecule. \mathrm{V/R} is valid outputs per correct recovery; 1.0 is ideal."/>
       </w:tblPr>
       <w:tblGrid>
         <w:gridCol w:w="1320"/>
@@ -5715,13 +5725,13 @@
       </w:r>
     </w:p>
     <w:bookmarkEnd w:id="44"/>
-    <w:bookmarkStart w:id="45" w:name="free-generation-is-the-wrong-mechanism."/>
+    <w:bookmarkStart w:id="45" w:name="Xfeb71ed8f462cb9bf2bf15440fcc5f070e1bebd"/>
     <w:p>
       <w:pPr>
         <w:pStyle w:val="Heading4"/>
       </w:pPr>
       <w:r>
-        <w:t xml:space="preserve">Free generation is the wrong mechanism.</w:t>
+        <w:t xml:space="preserve">Free generation is poorly suited to this repair setting.</w:t>
       </w:r>
     </w:p>
     <w:p>
@@ -6268,13 +6278,13 @@
         <w:t xml:space="preserve">valid outputs.</w:t>
       </w:r>
     </w:p>
-    <w:bookmarkStart w:id="48" w:name="Xa73bc654cab239a3c7ff748b1b245a53fc44490"/>
+    <w:bookmarkStart w:id="48" w:name="X8322b27c02e2fe346729b54e240f915b0fe4ff3"/>
     <w:p>
       <w:pPr>
         <w:pStyle w:val="Heading4"/>
       </w:pPr>
       <w:r>
-        <w:t xml:space="preserve">The one-edit hypothesis space holds on real failures.</w:t>
+        <w:t xml:space="preserve">One-edit valid candidates exist for most real failures.</w:t>
       </w:r>
     </w:p>
     <w:p>
@@ -6304,19 +6314,25 @@
         <w:t xml:space="preserve"> </w:t>
       </w:r>
       <w:r>
-        <w:t xml:space="preserve">of them (median 72 candidates). The design</w:t>
-      </w:r>
-      <w:r>
-        <w:t xml:space="preserve"> </w:t>
-      </w:r>
-      <w:r>
-        <w:t xml:space="preserve">assumption thus holds of real generator output and is not an artefact of how we</w:t>
-      </w:r>
-      <w:r>
-        <w:t xml:space="preserve"> </w:t>
-      </w:r>
-      <w:r>
-        <w:t xml:space="preserve">built the benchmark. For the remaining 8.5% no valid molecule lies within one</w:t>
+        <w:t xml:space="preserve">of them (median 72 candidates). The one-edit</w:t>
+      </w:r>
+      <w:r>
+        <w:t xml:space="preserve"> </w:t>
+      </w:r>
+      <w:r>
+        <w:t xml:space="preserve">candidate space is therefore operationally useful for most real generator</w:t>
+      </w:r>
+      <w:r>
+        <w:t xml:space="preserve"> </w:t>
+      </w:r>
+      <w:r>
+        <w:t xml:space="preserve">failures, and is not an artefact of how we built the benchmark, although</w:t>
+      </w:r>
+      <w:r>
+        <w:t xml:space="preserve"> </w:t>
+      </w:r>
+      <w:r>
+        <w:t xml:space="preserve">intended recovery cannot be established here without ground truth. For the remaining 8.5% no valid molecule lies within one</w:t>
       </w:r>
       <w:r>
         <w:t xml:space="preserve"> </w:t>
@@ -9133,27 +9149,13 @@
         <w:pStyle w:val="FirstParagraph"/>
       </w:pPr>
       <w:r>
-        <w:t xml:space="preserve">All differences in Table </w:t>
-      </w:r>
-      <w:hyperlink w:anchor="tab:main">
-        <w:r>
-          <w:rPr>
-            <w:rStyle w:val="Hyperlink"/>
-          </w:rPr>
-          <w:t xml:space="preserve">1</w:t>
-        </w:r>
-      </w:hyperlink>
-      <w:r>
-        <w:t xml:space="preserve"> </w:t>
-      </w:r>
-      <w:r>
-        <w:t xml:space="preserve">are significant under exact paired</w:t>
-      </w:r>
-      <w:r>
-        <w:t xml:space="preserve"> </w:t>
-      </w:r>
-      <w:r>
-        <w:t xml:space="preserve">McNemar tests with Bonferroni correction (</w:t>
+        <w:t xml:space="preserve">The six prespecified pairwise comparisons below are significant under exact</w:t>
+      </w:r>
+      <w:r>
+        <w:t xml:space="preserve"> </w:t>
+      </w:r>
+      <w:r>
+        <w:t xml:space="preserve">paired McNemar tests with Bonferroni correction (</w:t>
       </w:r>
       <m:oMath>
         <m:r>
@@ -10242,7 +10244,13 @@
         <w:t xml:space="preserve">accurate</w:t>
       </w:r>
       <w:r>
-        <w:t xml:space="preserve">, converting 12.7% into</w:t>
+        <w:t xml:space="preserve">, raising exact recovery on</w:t>
+      </w:r>
+      <w:r>
+        <w:t xml:space="preserve"> </w:t>
+      </w:r>
+      <w:r>
+        <w:t xml:space="preserve">the same pruned candidate set from 13.6% with uniform selection to</w:t>
       </w:r>
       <w:r>
         <w:t xml:space="preserve"> </w:t>
@@ -10278,13 +10286,13 @@
         <w:pStyle w:val="FirstParagraph"/>
       </w:pPr>
       <w:r>
-        <w:t xml:space="preserve">Our benchmark applies single-token corruptions. This matches the modal real</w:t>
-      </w:r>
-      <w:r>
-        <w:t xml:space="preserve"> </w:t>
-      </w:r>
-      <w:r>
-        <w:t xml:space="preserve">failure, and Section </w:t>
+        <w:t xml:space="preserve">Our benchmark applies single-token corruptions. This is a deliberately narrow</w:t>
+      </w:r>
+      <w:r>
+        <w:t xml:space="preserve"> </w:t>
+      </w:r>
+      <w:r>
+        <w:t xml:space="preserve">hypothesis space; Section </w:t>
       </w:r>
       <w:hyperlink w:anchor="sec:exp6">
         <w:r>
@@ -10298,19 +10306,25 @@
         <w:t xml:space="preserve"> </w:t>
       </w:r>
       <w:r>
-        <w:t xml:space="preserve">shows that 91.5% of real generator failures</w:t>
-      </w:r>
-      <w:r>
-        <w:t xml:space="preserve"> </w:t>
-      </w:r>
-      <w:r>
-        <w:t xml:space="preserve">admit a one-edit repair, but the remaining 8.5% carry multiple simultaneous</w:t>
-      </w:r>
-      <w:r>
-        <w:t xml:space="preserve"> </w:t>
-      </w:r>
-      <w:r>
-        <w:t xml:space="preserve">errors and are outside the current enumerator. Section </w:t>
+        <w:t xml:space="preserve">shows that 91.5% of real generator</w:t>
+      </w:r>
+      <w:r>
+        <w:t xml:space="preserve"> </w:t>
+      </w:r>
+      <w:r>
+        <w:t xml:space="preserve">failures have a non-empty one-edit valid candidate set, while the remaining</w:t>
+      </w:r>
+      <w:r>
+        <w:t xml:space="preserve"> </w:t>
+      </w:r>
+      <w:r>
+        <w:t xml:space="preserve">8.5% have no valid repair within that space and are outside the current</w:t>
+      </w:r>
+      <w:r>
+        <w:t xml:space="preserve"> </w:t>
+      </w:r>
+      <w:r>
+        <w:t xml:space="preserve">enumerator. Section </w:t>
       </w:r>
       <w:hyperlink w:anchor="sec:exp7">
         <w:r>
@@ -10437,19 +10451,19 @@
         <w:t xml:space="preserve"> </w:t>
       </w:r>
       <w:r>
-        <w:t xml:space="preserve">shows the prior transfers undegraded to a molecule corpus</w:t>
-      </w:r>
-      <w:r>
-        <w:t xml:space="preserve"> </w:t>
-      </w:r>
-      <w:r>
-        <w:t xml:space="preserve">it never saw, but the cost of a deliberately adversarial mismatch remains</w:t>
-      </w:r>
-      <w:r>
-        <w:t xml:space="preserve"> </w:t>
-      </w:r>
-      <w:r>
-        <w:t xml:space="preserve">uncharacterised.</w:t>
+        <w:t xml:space="preserve">shows no observed drop in conditional recovery on an</w:t>
+      </w:r>
+      <w:r>
+        <w:t xml:space="preserve"> </w:t>
+      </w:r>
+      <w:r>
+        <w:t xml:space="preserve">external molecule corpus it never saw, but the cost of a deliberately</w:t>
+      </w:r>
+      <w:r>
+        <w:t xml:space="preserve"> </w:t>
+      </w:r>
+      <w:r>
+        <w:t xml:space="preserve">adversarial mismatch remains uncharacterised.</w:t>
       </w:r>
     </w:p>
     <w:bookmarkEnd w:id="67"/>

</xml_diff>

<commit_message>
Qualify pruning losslessness to the development split; scope the real-failure claim to applicability
</commit_message>
<xml_diff>
--- a/paper_vnr/main.docx
+++ b/paper_vnr/main.docx
@@ -270,7 +270,7 @@
         <w:t xml:space="preserve"> </w:t>
       </w:r>
       <w:r>
-        <w:t xml:space="preserve">mix calibrated to the error distribution of real generative-model failures. On</w:t>
+        <w:t xml:space="preserve">mix calibrated to real generative-model failures. On</w:t>
       </w:r>
       <w:r>
         <w:t xml:space="preserve"> </w:t>
@@ -288,19 +288,19 @@
         <w:t xml:space="preserve"> </w:t>
       </w:r>
       <w:r>
-        <w:t xml:space="preserve">one. An unconstrained large-language-model repair loop shows</w:t>
-      </w:r>
-      <w:r>
-        <w:t xml:space="preserve"> </w:t>
-      </w:r>
-      <w:r>
-        <w:t xml:space="preserve">the opposite profile (47.7% validity, 13.8% recovery), so the two systems are</w:t>
-      </w:r>
-      <w:r>
-        <w:t xml:space="preserve"> </w:t>
-      </w:r>
-      <w:r>
-        <w:t xml:space="preserve">ordered one way by validity and the other by recovery.</w:t>
+        <w:t xml:space="preserve">one. An unconstrained large-language-model repair loop shows the opposite profile</w:t>
+      </w:r>
+      <w:r>
+        <w:t xml:space="preserve"> </w:t>
+      </w:r>
+      <w:r>
+        <w:t xml:space="preserve">(47.7% validity, 13.8% recovery), so the two are ordered one way by validity</w:t>
+      </w:r>
+      <w:r>
+        <w:t xml:space="preserve"> </w:t>
+      </w:r>
+      <w:r>
+        <w:t xml:space="preserve">and the other by recovery.</w:t>
       </w:r>
     </w:p>
     <w:p>
@@ -330,7 +330,7 @@
         <w:t xml:space="preserve"> </w:t>
       </w:r>
       <w:r>
-        <w:t xml:space="preserve">than as unconstrained sequence generation. A symbolic</w:t>
+        <w:t xml:space="preserve">than as sequence generation. A symbolic</w:t>
       </w:r>
       <w:r>
         <w:t xml:space="preserve"> </w:t>
@@ -348,13 +348,13 @@
         <w:t xml:space="preserve"> </w:t>
       </w:r>
       <w:r>
-        <w:t xml:space="preserve">prunes it losslessly; and a character-level chemical language model ranks what</w:t>
-      </w:r>
-      <w:r>
-        <w:t xml:space="preserve"> </w:t>
-      </w:r>
-      <w:r>
-        <w:t xml:space="preserve">remains.</w:t>
+        <w:t xml:space="preserve">supports a pruning rule selected to be lossless on the development split; and a</w:t>
+      </w:r>
+      <w:r>
+        <w:t xml:space="preserve"> </w:t>
+      </w:r>
+      <w:r>
+        <w:t xml:space="preserve">character-level chemical language model ranks what remains.</w:t>
       </w:r>
       <w:r>
         <w:t xml:space="preserve"> </w:t>
@@ -399,7 +399,7 @@
         <w:t xml:space="preserve">,</w:t>
       </w:r>
       <w:r>
-        <w:t xml:space="preserve">000 in-distribution repair pairs, which our method needs none of.</w:t>
+        <w:t xml:space="preserve">000 repair pairs, which our method needs none of.</w:t>
       </w:r>
       <w:r>
         <w:t xml:space="preserve"> </w:t>
@@ -426,13 +426,13 @@
         <w:t xml:space="preserve"> </w:t>
       </w:r>
       <w:r>
-        <w:t xml:space="preserve">result does not depend on web-pretrained recall of test molecules. It transfers</w:t>
-      </w:r>
-      <w:r>
-        <w:t xml:space="preserve"> </w:t>
-      </w:r>
-      <w:r>
-        <w:t xml:space="preserve">to real generative-model output: 91.5% of 4</w:t>
+        <w:t xml:space="preserve">result does not depend on web-pretrained recall of test molecules. It applies to</w:t>
+      </w:r>
+      <w:r>
+        <w:t xml:space="preserve"> </w:t>
+      </w:r>
+      <w:r>
+        <w:t xml:space="preserve">real generative-model output: 91.5% of 4</w:t>
       </w:r>
       <w:r>
         <w:t xml:space="preserve">,</w:t>
@@ -474,13 +474,13 @@
         <w:t xml:space="preserve"> </w:t>
       </w:r>
       <w:r>
-        <w:t xml:space="preserve">scope. Ranking confidence supports abstention: 46% of inputs can be answered at</w:t>
-      </w:r>
-      <w:r>
-        <w:t xml:space="preserve"> </w:t>
-      </w:r>
-      <w:r>
-        <w:t xml:space="preserve">96.4% precision. We release the benchmark, code, and per-item outputs.</w:t>
+        <w:t xml:space="preserve">scope. Ranking confidence supports abstention: 46% of inputs answer at 96.4%</w:t>
+      </w:r>
+      <w:r>
+        <w:t xml:space="preserve"> </w:t>
+      </w:r>
+      <w:r>
+        <w:t xml:space="preserve">precision. We release the benchmark, code, and per-item outputs.</w:t>
       </w:r>
     </w:p>
     <w:p>

</xml_diff>

<commit_message>
Correct the enumeration-without-prior comparison, fix colon spacing, and replace the contributions list with prose
</commit_message>
<xml_diff>
--- a/paper_vnr/main.docx
+++ b/paper_vnr/main.docx
@@ -513,7 +513,7 @@
         <w:t xml:space="preserve">neuro-symbolic methods; selective prediction</w:t>
       </w:r>
     </w:p>
-    <w:bookmarkStart w:id="11" w:name="background"/>
+    <w:bookmarkStart w:id="10" w:name="background"/>
     <w:p>
       <w:pPr>
         <w:pStyle w:val="Heading1"/>
@@ -1131,37 +1131,24 @@
         <w:t xml:space="preserve">argue the field should report.</w:t>
       </w:r>
     </w:p>
-    <w:bookmarkEnd w:id="9"/>
-    <w:bookmarkStart w:id="10" w:name="contributions."/>
-    <w:p>
-      <w:pPr>
-        <w:pStyle w:val="Heading4"/>
-      </w:pPr>
-      <w:r>
-        <w:t xml:space="preserve">Contributions.</w:t>
-      </w:r>
-    </w:p>
-    <w:p>
-      <w:pPr>
-        <w:numPr>
-          <w:ilvl w:val="0"/>
-          <w:numId w:val="1001"/>
-        </w:numPr>
-      </w:pPr>
-      <w:r>
-        <w:t xml:space="preserve">A leakage-controlled recovery benchmark with known ground truth, built</w:t>
-      </w:r>
-      <w:r>
-        <w:t xml:space="preserve"> </w:t>
-      </w:r>
-      <w:r>
-        <w:t xml:space="preserve">from a held-out molecule pool and calibrated to the empirical error mix of</w:t>
-      </w:r>
-      <w:r>
-        <w:t xml:space="preserve"> </w:t>
-      </w:r>
-      <w:r>
-        <w:t xml:space="preserve">a real generative model (Section </w:t>
+    <w:p>
+      <w:pPr>
+        <w:pStyle w:val="BodyText"/>
+      </w:pPr>
+      <w:r>
+        <w:t xml:space="preserve">To ask it we build a leakage-controlled benchmark of corrupted SMILES with known</w:t>
+      </w:r>
+      <w:r>
+        <w:t xml:space="preserve"> </w:t>
+      </w:r>
+      <w:r>
+        <w:t xml:space="preserve">ground truth, drawn from a held-out molecule pool and calibrated to the error mix</w:t>
+      </w:r>
+      <w:r>
+        <w:t xml:space="preserve"> </w:t>
+      </w:r>
+      <w:r>
+        <w:t xml:space="preserve">a real generative model actually produces (Section </w:t>
       </w:r>
       <w:hyperlink w:anchor="sec:bench">
         <w:r>
@@ -1172,58 +1159,37 @@
         </w:r>
       </w:hyperlink>
       <w:r>
-        <w:t xml:space="preserve">).</w:t>
-      </w:r>
-    </w:p>
-    <w:p>
-      <w:pPr>
-        <w:numPr>
-          <w:ilvl w:val="0"/>
-          <w:numId w:val="1001"/>
-        </w:numPr>
-      </w:pPr>
-      <w:r>
-        <w:t xml:space="preserve">A</w:t>
-      </w:r>
-      <w:r>
-        <w:t xml:space="preserve"> </w:t>
-      </w:r>
-      <w:r>
-        <w:rPr>
-          <w:i/>
-          <w:iCs/>
-        </w:rPr>
-        <w:t xml:space="preserve">quantitative</w:t>
-      </w:r>
-      <w:r>
-        <w:t xml:space="preserve"> </w:t>
-      </w:r>
-      <w:r>
-        <w:t xml:space="preserve">account of how far validity and recovery come</w:t>
-      </w:r>
-      <w:r>
-        <w:t xml:space="preserve"> </w:t>
-      </w:r>
-      <w:r>
-        <w:t xml:space="preserve">apart, far enough to reverse the ordering of published systems. That</w:t>
-      </w:r>
-      <w:r>
-        <w:t xml:space="preserve"> </w:t>
-      </w:r>
-      <w:r>
-        <w:t xml:space="preserve">validity is insufficient has been argued qualitatively </w:t>
+        <w:t xml:space="preserve">). On that</w:t>
+      </w:r>
+      <w:r>
+        <w:t xml:space="preserve"> </w:t>
+      </w:r>
+      <w:r>
+        <w:t xml:space="preserve">benchmark we measure how far validity and recovery come apart, and find the gap</w:t>
+      </w:r>
+      <w:r>
+        <w:t xml:space="preserve"> </w:t>
+      </w:r>
+      <w:r>
+        <w:t xml:space="preserve">wide enough to reverse the ordering of published systems: that validity is</w:t>
+      </w:r>
+      <w:r>
+        <w:t xml:space="preserve"> </w:t>
+      </w:r>
+      <w:r>
+        <w:t xml:space="preserve">insufficient has been argued qualitatively </w:t>
       </w:r>
       <w:r>
         <w:t xml:space="preserve">(Yoon and Lee 2026)</w:t>
       </w:r>
       <w:r>
-        <w:t xml:space="preserve">;</w:t>
-      </w:r>
-      <w:r>
-        <w:t xml:space="preserve"> </w:t>
-      </w:r>
-      <w:r>
-        <w:t xml:space="preserve">we measure the consequence (Section </w:t>
+        <w:t xml:space="preserve">, and we quantify the</w:t>
+      </w:r>
+      <w:r>
+        <w:t xml:space="preserve"> </w:t>
+      </w:r>
+      <w:r>
+        <w:t xml:space="preserve">consequence (Section </w:t>
       </w:r>
       <w:hyperlink w:anchor="sec:exp1">
         <w:r>
@@ -1239,19 +1205,16 @@
     </w:p>
     <w:p>
       <w:pPr>
-        <w:numPr>
-          <w:ilvl w:val="0"/>
-          <w:numId w:val="1001"/>
-        </w:numPr>
-      </w:pPr>
-      <w:r>
-        <w:t xml:space="preserve">A transfer of the bounded-edit constrained-selection formulation from</w:t>
-      </w:r>
-      <w:r>
-        <w:t xml:space="preserve"> </w:t>
-      </w:r>
-      <w:r>
-        <w:t xml:space="preserve">syntax repair </w:t>
+        <w:pStyle w:val="BodyText"/>
+      </w:pPr>
+      <w:r>
+        <w:t xml:space="preserve">The method follows from the measurement. We take the bounded-edit</w:t>
+      </w:r>
+      <w:r>
+        <w:t xml:space="preserve"> </w:t>
+      </w:r>
+      <w:r>
+        <w:t xml:space="preserve">constrained-selection formulation from syntax repair </w:t>
       </w:r>
       <w:r>
         <w:t xml:space="preserve">(Considine 2025)</w:t>
@@ -1260,19 +1223,19 @@
         <w:t xml:space="preserve"> </w:t>
       </w:r>
       <w:r>
-        <w:t xml:space="preserve">to molecular strings, instantiated</w:t>
-      </w:r>
-      <w:r>
-        <w:t xml:space="preserve"> </w:t>
-      </w:r>
-      <w:r>
-        <w:t xml:space="preserve">with a chemistry toolkit’s diagnosis as the pruning constraint and a chemical</w:t>
-      </w:r>
-      <w:r>
-        <w:t xml:space="preserve"> </w:t>
-      </w:r>
-      <w:r>
-        <w:t xml:space="preserve">language model as the prior: a six-stage system,</w:t>
+        <w:t xml:space="preserve">and ask what it takes to make it work for molecules, instantiating it with a</w:t>
+      </w:r>
+      <w:r>
+        <w:t xml:space="preserve"> </w:t>
+      </w:r>
+      <w:r>
+        <w:t xml:space="preserve">chemistry toolkit’s diagnosis as the pruning constraint and a chemical language</w:t>
+      </w:r>
+      <w:r>
+        <w:t xml:space="preserve"> </w:t>
+      </w:r>
+      <w:r>
+        <w:t xml:space="preserve">model as the prior. The resulting system,</w:t>
       </w:r>
       <w:r>
         <w:t xml:space="preserve"> </w:t>
@@ -1284,19 +1247,13 @@
         <w:t xml:space="preserve">EnumRank</w:t>
       </w:r>
       <w:r>
-        <w:t xml:space="preserve">, attaining 100.0%</w:t>
-      </w:r>
-      <w:r>
-        <w:t xml:space="preserve"> </w:t>
-      </w:r>
-      <w:r>
-        <w:t xml:space="preserve">validity and 80.7% exact recovery</w:t>
-      </w:r>
-      <w:r>
-        <w:t xml:space="preserve"> </w:t>
-      </w:r>
-      <w:r>
-        <w:t xml:space="preserve">(Sections </w:t>
+        <w:t xml:space="preserve">, attains 100.0% validity and</w:t>
+      </w:r>
+      <w:r>
+        <w:t xml:space="preserve"> </w:t>
+      </w:r>
+      <w:r>
+        <w:t xml:space="preserve">80.7% exact recovery (Sections </w:t>
       </w:r>
       <w:hyperlink w:anchor="sec:method">
         <w:r>
@@ -1318,69 +1275,37 @@
         </w:r>
       </w:hyperlink>
       <w:r>
-        <w:t xml:space="preserve">).</w:t>
-      </w:r>
-    </w:p>
-    <w:p>
-      <w:pPr>
-        <w:numPr>
-          <w:ilvl w:val="0"/>
-          <w:numId w:val="1001"/>
-        </w:numPr>
-      </w:pPr>
-      <w:r>
-        <w:t xml:space="preserve">A decomposition showing</w:t>
-      </w:r>
-      <w:r>
-        <w:t xml:space="preserve"> </w:t>
-      </w:r>
-      <w:r>
-        <w:rPr>
-          <w:i/>
-          <w:iCs/>
-        </w:rPr>
-        <w:t xml:space="preserve">where</w:t>
-      </w:r>
-      <w:r>
-        <w:t xml:space="preserve"> </w:t>
-      </w:r>
-      <w:r>
-        <w:t xml:space="preserve">recovery comes from: symbolic</w:t>
-      </w:r>
-      <w:r>
-        <w:t xml:space="preserve"> </w:t>
-      </w:r>
-      <w:r>
-        <w:t xml:space="preserve">enumeration makes recovery possible (99.79% candidate coverage); and on</w:t>
-      </w:r>
-      <w:r>
-        <w:t xml:space="preserve"> </w:t>
-      </w:r>
-      <w:r>
-        <w:t xml:space="preserve">the fixed pruned candidate set, selection raises exact recovery from</w:t>
-      </w:r>
-      <w:r>
-        <w:t xml:space="preserve"> </w:t>
-      </w:r>
-      <w:r>
-        <w:t xml:space="preserve">13.6% with uniform choice to 80.7% with the domain language model.</w:t>
-      </w:r>
-    </w:p>
-    <w:p>
-      <w:pPr>
-        <w:numPr>
-          <w:ilvl w:val="0"/>
-          <w:numId w:val="1001"/>
-        </w:numPr>
-      </w:pPr>
-      <w:r>
-        <w:t xml:space="preserve">A comparison against a supervised corrector trained in-distribution on</w:t>
-      </w:r>
-      <w:r>
-        <w:t xml:space="preserve"> </w:t>
-      </w:r>
-      <w:r>
-        <w:t xml:space="preserve">245k repair pairs, which</w:t>
+        <w:t xml:space="preserve">), and the two</w:t>
+      </w:r>
+      <w:r>
+        <w:t xml:space="preserve"> </w:t>
+      </w:r>
+      <w:r>
+        <w:t xml:space="preserve">halves can be separated: enumeration makes recovery possible, covering the</w:t>
+      </w:r>
+      <w:r>
+        <w:t xml:space="preserve"> </w:t>
+      </w:r>
+      <w:r>
+        <w:t xml:space="preserve">ground truth for 99.79% of items, while on that fixed pruned candidate set</w:t>
+      </w:r>
+      <w:r>
+        <w:t xml:space="preserve"> </w:t>
+      </w:r>
+      <w:r>
+        <w:t xml:space="preserve">selection raises exact recovery from 13.6% under uniform choice to 80.7% with</w:t>
+      </w:r>
+      <w:r>
+        <w:t xml:space="preserve"> </w:t>
+      </w:r>
+      <w:r>
+        <w:t xml:space="preserve">the domain language model. For a point of comparison outside its own family, we</w:t>
+      </w:r>
+      <w:r>
+        <w:t xml:space="preserve"> </w:t>
+      </w:r>
+      <w:r>
+        <w:t xml:space="preserve">train a supervised corrector in-distribution on 245k repair pairs;</w:t>
       </w:r>
       <w:r>
         <w:t xml:space="preserve"> </w:t>
@@ -1395,13 +1320,13 @@
         <w:t xml:space="preserve"> </w:t>
       </w:r>
       <w:r>
-        <w:t xml:space="preserve">beats without any repair supervision</w:t>
-      </w:r>
-      <w:r>
-        <w:t xml:space="preserve"> </w:t>
-      </w:r>
-      <w:r>
-        <w:t xml:space="preserve">(Section </w:t>
+        <w:t xml:space="preserve">beats</w:t>
+      </w:r>
+      <w:r>
+        <w:t xml:space="preserve"> </w:t>
+      </w:r>
+      <w:r>
+        <w:t xml:space="preserve">it without using any repair supervision at all (Section </w:t>
       </w:r>
       <w:hyperlink w:anchor="sec:exp5">
         <w:r>
@@ -1415,24 +1340,93 @@
         <w:t xml:space="preserve">).</w:t>
       </w:r>
     </w:p>
+    <w:bookmarkEnd w:id="9"/>
     <w:bookmarkEnd w:id="10"/>
+    <w:bookmarkStart w:id="16" w:name="related-work"/>
+    <w:p>
+      <w:pPr>
+        <w:pStyle w:val="Heading1"/>
+      </w:pPr>
+      <w:r>
+        <w:t xml:space="preserve">Related work</w:t>
+      </w:r>
+    </w:p>
+    <w:bookmarkStart w:id="11" w:name="preventing-invalid-strings."/>
+    <w:p>
+      <w:pPr>
+        <w:pStyle w:val="Heading4"/>
+      </w:pPr>
+      <w:r>
+        <w:t xml:space="preserve">Preventing invalid strings.</w:t>
+      </w:r>
+    </w:p>
+    <w:p>
+      <w:pPr>
+        <w:pStyle w:val="FirstParagraph"/>
+      </w:pPr>
+      <w:r>
+        <w:t xml:space="preserve">Grammar- and syntax-directed decoders constrain generation to a formal</w:t>
+      </w:r>
+      <w:r>
+        <w:t xml:space="preserve"> </w:t>
+      </w:r>
+      <w:r>
+        <w:t xml:space="preserve">grammar </w:t>
+      </w:r>
+      <w:r>
+        <w:t xml:space="preserve">(Kusner et al. 2017; Dai et al. 2018; Geng et al. 2023)</w:t>
+      </w:r>
+      <w:r>
+        <w:t xml:space="preserve">.</w:t>
+      </w:r>
+      <w:r>
+        <w:t xml:space="preserve"> </w:t>
+      </w:r>
+      <w:r>
+        <w:t xml:space="preserve">SELFIES </w:t>
+      </w:r>
+      <w:r>
+        <w:t xml:space="preserve">(Krenn et al. 2020, 2022)</w:t>
+      </w:r>
+      <w:r>
+        <w:t xml:space="preserve"> </w:t>
+      </w:r>
+      <w:r>
+        <w:t xml:space="preserve">instead redesigns the string</w:t>
+      </w:r>
+      <w:r>
+        <w:t xml:space="preserve"> </w:t>
+      </w:r>
+      <w:r>
+        <w:t xml:space="preserve">encoding so that every token sequence decodes to a molecule. These approaches</w:t>
+      </w:r>
+      <w:r>
+        <w:t xml:space="preserve"> </w:t>
+      </w:r>
+      <w:r>
+        <w:t xml:space="preserve">eliminate invalidity by construction but change the generative model or its</w:t>
+      </w:r>
+      <w:r>
+        <w:t xml:space="preserve"> </w:t>
+      </w:r>
+      <w:r>
+        <w:t xml:space="preserve">output space, and they do not help with strings already emitted by a deployed</w:t>
+      </w:r>
+      <w:r>
+        <w:t xml:space="preserve"> </w:t>
+      </w:r>
+      <w:r>
+        <w:t xml:space="preserve">model.</w:t>
+      </w:r>
+    </w:p>
     <w:bookmarkEnd w:id="11"/>
-    <w:bookmarkStart w:id="17" w:name="related-work"/>
-    <w:p>
-      <w:pPr>
-        <w:pStyle w:val="Heading1"/>
-      </w:pPr>
-      <w:r>
-        <w:t xml:space="preserve">Related work</w:t>
-      </w:r>
-    </w:p>
-    <w:bookmarkStart w:id="12" w:name="preventing-invalid-strings."/>
+    <w:bookmarkStart w:id="12" w:name="correcting-invalid-strings."/>
     <w:p>
       <w:pPr>
         <w:pStyle w:val="Heading4"/>
       </w:pPr>
       <w:r>
-        <w:t xml:space="preserve">Preventing invalid strings.</w:t>
+        <w:t xml:space="preserve">Correcting invalid strings.</w:t>
       </w:r>
     </w:p>
     <w:p>
@@ -1440,68 +1434,83 @@
         <w:pStyle w:val="FirstParagraph"/>
       </w:pPr>
       <w:r>
-        <w:t xml:space="preserve">Grammar- and syntax-directed decoders constrain generation to a formal</w:t>
-      </w:r>
-      <w:r>
-        <w:t xml:space="preserve"> </w:t>
-      </w:r>
-      <w:r>
-        <w:t xml:space="preserve">grammar </w:t>
-      </w:r>
-      <w:r>
-        <w:t xml:space="preserve">(Kusner et al. 2017; Dai et al. 2018; Geng et al. 2023)</w:t>
-      </w:r>
-      <w:r>
-        <w:t xml:space="preserve">.</w:t>
-      </w:r>
-      <w:r>
-        <w:t xml:space="preserve"> </w:t>
-      </w:r>
-      <w:r>
-        <w:t xml:space="preserve">SELFIES </w:t>
-      </w:r>
-      <w:r>
-        <w:t xml:space="preserve">(Krenn et al. 2020, 2022)</w:t>
-      </w:r>
-      <w:r>
-        <w:t xml:space="preserve"> </w:t>
-      </w:r>
-      <w:r>
-        <w:t xml:space="preserve">instead redesigns the string</w:t>
-      </w:r>
-      <w:r>
-        <w:t xml:space="preserve"> </w:t>
-      </w:r>
-      <w:r>
-        <w:t xml:space="preserve">encoding so that every token sequence decodes to a molecule. These approaches</w:t>
-      </w:r>
-      <w:r>
-        <w:t xml:space="preserve"> </w:t>
-      </w:r>
-      <w:r>
-        <w:t xml:space="preserve">eliminate invalidity by construction but change the generative model or its</w:t>
-      </w:r>
-      <w:r>
-        <w:t xml:space="preserve"> </w:t>
-      </w:r>
-      <w:r>
-        <w:t xml:space="preserve">output space, and they do not help with strings already emitted by a deployed</w:t>
-      </w:r>
-      <w:r>
-        <w:t xml:space="preserve"> </w:t>
-      </w:r>
-      <w:r>
-        <w:t xml:space="preserve">model.</w:t>
+        <w:t xml:space="preserve">Closest to our setting are systems that repair broken SMILES directly. Sequence</w:t>
+      </w:r>
+      <w:r>
+        <w:t xml:space="preserve"> </w:t>
+      </w:r>
+      <w:r>
+        <w:t xml:space="preserve">transduction models trained on synthetically corrupted SMILES learn to map</w:t>
+      </w:r>
+      <w:r>
+        <w:t xml:space="preserve"> </w:t>
+      </w:r>
+      <w:r>
+        <w:t xml:space="preserve">invalid strings back to valid ones </w:t>
+      </w:r>
+      <w:r>
+        <w:t xml:space="preserve">(Schoenmaker et al. 2023)</w:t>
+      </w:r>
+      <w:r>
+        <w:t xml:space="preserve">, which</w:t>
+      </w:r>
+      <w:r>
+        <w:t xml:space="preserve"> </w:t>
+      </w:r>
+      <w:r>
+        <w:t xml:space="preserve">reports a 78% molecule reconstruction rate and 70.5% at one error per input.</w:t>
+      </w:r>
+      <w:r>
+        <w:t xml:space="preserve"> </w:t>
+      </w:r>
+      <w:r>
+        <w:t xml:space="preserve">A more recent approach converts an invalid SMILES into SELFIES via grammar rules,</w:t>
+      </w:r>
+      <w:r>
+        <w:t xml:space="preserve"> </w:t>
+      </w:r>
+      <w:r>
+        <w:t xml:space="preserve">obtaining essentially complete validity </w:t>
+      </w:r>
+      <w:r>
+        <w:t xml:space="preserve">(Tao et al. 2025)</w:t>
+      </w:r>
+      <w:r>
+        <w:t xml:space="preserve">; it too reports exact</w:t>
+      </w:r>
+      <w:r>
+        <w:t xml:space="preserve"> </w:t>
+      </w:r>
+      <w:r>
+        <w:t xml:space="preserve">match to the ground truth, and reasons about whether corrected strings recover the</w:t>
+      </w:r>
+      <w:r>
+        <w:t xml:space="preserve"> </w:t>
+      </w:r>
+      <w:r>
+        <w:t xml:space="preserve">intended molecule. Neither work is validity-only. What neither does, and what this</w:t>
+      </w:r>
+      <w:r>
+        <w:t xml:space="preserve"> </w:t>
+      </w:r>
+      <w:r>
+        <w:t xml:space="preserve">paper supplies, is a controlled setting in which validity and identity are measured</w:t>
+      </w:r>
+      <w:r>
+        <w:t xml:space="preserve"> </w:t>
+      </w:r>
+      <w:r>
+        <w:t xml:space="preserve">side by side across systems, so that the two rankings can be compared directly.</w:t>
       </w:r>
     </w:p>
     <w:bookmarkEnd w:id="12"/>
-    <w:bookmarkStart w:id="13" w:name="correcting-invalid-strings."/>
+    <w:bookmarkStart w:id="13" w:name="recovery-rather-than-repair."/>
     <w:p>
       <w:pPr>
         <w:pStyle w:val="Heading4"/>
       </w:pPr>
       <w:r>
-        <w:t xml:space="preserve">Correcting invalid strings.</w:t>
+        <w:t xml:space="preserve">Recovery rather than repair.</w:t>
       </w:r>
     </w:p>
     <w:p>
@@ -1509,185 +1518,101 @@
         <w:pStyle w:val="FirstParagraph"/>
       </w:pPr>
       <w:r>
-        <w:t xml:space="preserve">Closest to our setting are systems that repair broken SMILES directly. Sequence</w:t>
-      </w:r>
-      <w:r>
-        <w:t xml:space="preserve"> </w:t>
-      </w:r>
-      <w:r>
-        <w:t xml:space="preserve">transduction models trained on synthetically corrupted SMILES learn to map</w:t>
-      </w:r>
-      <w:r>
-        <w:t xml:space="preserve"> </w:t>
-      </w:r>
-      <w:r>
-        <w:t xml:space="preserve">invalid strings back to valid ones </w:t>
-      </w:r>
-      <w:r>
-        <w:t xml:space="preserve">(Schoenmaker et al. 2023)</w:t>
-      </w:r>
-      <w:r>
-        <w:t xml:space="preserve">, which</w:t>
-      </w:r>
-      <w:r>
-        <w:t xml:space="preserve"> </w:t>
-      </w:r>
-      <w:r>
-        <w:t xml:space="preserve">reports a 78% molecule reconstruction rate and 70.5% at one error per input.</w:t>
-      </w:r>
-      <w:r>
-        <w:t xml:space="preserve"> </w:t>
-      </w:r>
-      <w:r>
-        <w:t xml:space="preserve">A more recent approach converts an invalid SMILES into SELFIES via grammar rules,</w:t>
-      </w:r>
-      <w:r>
-        <w:t xml:space="preserve"> </w:t>
-      </w:r>
-      <w:r>
-        <w:t xml:space="preserve">obtaining essentially complete validity </w:t>
-      </w:r>
-      <w:r>
-        <w:t xml:space="preserve">(Tao et al. 2025)</w:t>
-      </w:r>
-      <w:r>
-        <w:t xml:space="preserve">; it too reports exact</w:t>
-      </w:r>
-      <w:r>
-        <w:t xml:space="preserve"> </w:t>
-      </w:r>
-      <w:r>
-        <w:t xml:space="preserve">match to the ground truth, and reasons about whether corrected strings recover the</w:t>
-      </w:r>
-      <w:r>
-        <w:t xml:space="preserve"> </w:t>
-      </w:r>
-      <w:r>
-        <w:t xml:space="preserve">intended molecule. Neither work is validity-only. What neither does, and what this</w:t>
-      </w:r>
-      <w:r>
-        <w:t xml:space="preserve"> </w:t>
-      </w:r>
-      <w:r>
-        <w:t xml:space="preserve">paper supplies, is a controlled setting in which validity and identity are measured</w:t>
-      </w:r>
-      <w:r>
-        <w:t xml:space="preserve"> </w:t>
-      </w:r>
-      <w:r>
-        <w:t xml:space="preserve">side by side across systems, so that the two rankings can be compared directly.</w:t>
+        <w:t xml:space="preserve">Concurrently with this work,</w:t>
+      </w:r>
+      <w:r>
+        <w:t xml:space="preserve"> </w:t>
+      </w:r>
+      <w:r>
+        <w:t xml:space="preserve">Yoon and Lee (2026)</w:t>
+      </w:r>
+      <w:r>
+        <w:t xml:space="preserve"> </w:t>
+      </w:r>
+      <w:r>
+        <w:t xml:space="preserve">argue that repairing a string is not</w:t>
+      </w:r>
+      <w:r>
+        <w:t xml:space="preserve"> </w:t>
+      </w:r>
+      <w:r>
+        <w:t xml:space="preserve">the same as recovering the molecule it was meant to denote, and propose an</w:t>
+      </w:r>
+      <w:r>
+        <w:t xml:space="preserve"> </w:t>
+      </w:r>
+      <w:r>
+        <w:t xml:space="preserve">agentic system that iteratively proposes and selects edits using a</w:t>
+      </w:r>
+      <w:r>
+        <w:t xml:space="preserve"> </w:t>
+      </w:r>
+      <w:r>
+        <w:t xml:space="preserve">general-purpose LLM. We agree with their premise and adopt their</w:t>
+      </w:r>
+      <w:r>
+        <w:t xml:space="preserve"> </w:t>
+      </w:r>
+      <w:r>
+        <w:t xml:space="preserve">terminology. Our work is complementary in three respects. First, their</w:t>
+      </w:r>
+      <w:r>
+        <w:t xml:space="preserve"> </w:t>
+      </w:r>
+      <w:r>
+        <w:t xml:space="preserve">evaluation forces every system to 100% validity by falling back to SmiSelf, so</w:t>
+      </w:r>
+      <w:r>
+        <w:t xml:space="preserve"> </w:t>
+      </w:r>
+      <w:r>
+        <w:t xml:space="preserve">validity-based and recovery-based rankings cannot be compared within their</w:t>
+      </w:r>
+      <w:r>
+        <w:t xml:space="preserve"> </w:t>
+      </w:r>
+      <w:r>
+        <w:t xml:space="preserve">setup; quantifying that comparison is our starting point. Second, their</w:t>
+      </w:r>
+      <w:r>
+        <w:t xml:space="preserve"> </w:t>
+      </w:r>
+      <w:r>
+        <w:t xml:space="preserve">candidate pool is produced by bounded stochastic LLM sampling with no soundness</w:t>
+      </w:r>
+      <w:r>
+        <w:t xml:space="preserve"> </w:t>
+      </w:r>
+      <w:r>
+        <w:t xml:space="preserve">or completeness guarantee, whereas ours is a symbolic enumeration whose coverage</w:t>
+      </w:r>
+      <w:r>
+        <w:t xml:space="preserve"> </w:t>
+      </w:r>
+      <w:r>
+        <w:t xml:space="preserve">of the answer we measure directly. Third, they evaluate on 140–194 real</w:t>
+      </w:r>
+      <w:r>
+        <w:t xml:space="preserve"> </w:t>
+      </w:r>
+      <w:r>
+        <w:t xml:space="preserve">failures per backbone without a leakage analysis, a supervised baseline, or an</w:t>
+      </w:r>
+      <w:r>
+        <w:t xml:space="preserve"> </w:t>
+      </w:r>
+      <w:r>
+        <w:t xml:space="preserve">abstention mechanism. Their independent finding that SmiSelf attains an exact</w:t>
+      </w:r>
+      <w:r>
+        <w:t xml:space="preserve"> </w:t>
+      </w:r>
+      <w:r>
+        <w:t xml:space="preserve">match of 0.000 on their data corroborates the 1.2% we measure on ours.</w:t>
       </w:r>
     </w:p>
     <w:bookmarkEnd w:id="13"/>
-    <w:bookmarkStart w:id="14" w:name="recovery-rather-than-repair."/>
-    <w:p>
-      <w:pPr>
-        <w:pStyle w:val="Heading4"/>
-      </w:pPr>
-      <w:r>
-        <w:t xml:space="preserve">Recovery rather than repair.</w:t>
-      </w:r>
-    </w:p>
-    <w:p>
-      <w:pPr>
-        <w:pStyle w:val="FirstParagraph"/>
-      </w:pPr>
-      <w:r>
-        <w:t xml:space="preserve">Concurrently with this work,</w:t>
-      </w:r>
-      <w:r>
-        <w:t xml:space="preserve"> </w:t>
-      </w:r>
-      <w:r>
-        <w:t xml:space="preserve">Yoon and Lee (2026)</w:t>
-      </w:r>
-      <w:r>
-        <w:t xml:space="preserve"> </w:t>
-      </w:r>
-      <w:r>
-        <w:t xml:space="preserve">argue that repairing a string is not</w:t>
-      </w:r>
-      <w:r>
-        <w:t xml:space="preserve"> </w:t>
-      </w:r>
-      <w:r>
-        <w:t xml:space="preserve">the same as recovering the molecule it was meant to denote, and propose an</w:t>
-      </w:r>
-      <w:r>
-        <w:t xml:space="preserve"> </w:t>
-      </w:r>
-      <w:r>
-        <w:t xml:space="preserve">agentic system that iteratively proposes and selects edits using a</w:t>
-      </w:r>
-      <w:r>
-        <w:t xml:space="preserve"> </w:t>
-      </w:r>
-      <w:r>
-        <w:t xml:space="preserve">general-purpose LLM. We agree with their premise and adopt their</w:t>
-      </w:r>
-      <w:r>
-        <w:t xml:space="preserve"> </w:t>
-      </w:r>
-      <w:r>
-        <w:t xml:space="preserve">terminology. Our work is complementary in three respects. First, their</w:t>
-      </w:r>
-      <w:r>
-        <w:t xml:space="preserve"> </w:t>
-      </w:r>
-      <w:r>
-        <w:t xml:space="preserve">evaluation forces every system to 100% validity by falling back to SmiSelf, so</w:t>
-      </w:r>
-      <w:r>
-        <w:t xml:space="preserve"> </w:t>
-      </w:r>
-      <w:r>
-        <w:t xml:space="preserve">validity-based and recovery-based rankings cannot be compared within their</w:t>
-      </w:r>
-      <w:r>
-        <w:t xml:space="preserve"> </w:t>
-      </w:r>
-      <w:r>
-        <w:t xml:space="preserve">setup; quantifying that comparison is our starting point. Second, their</w:t>
-      </w:r>
-      <w:r>
-        <w:t xml:space="preserve"> </w:t>
-      </w:r>
-      <w:r>
-        <w:t xml:space="preserve">candidate pool is produced by bounded stochastic LLM sampling with no soundness</w:t>
-      </w:r>
-      <w:r>
-        <w:t xml:space="preserve"> </w:t>
-      </w:r>
-      <w:r>
-        <w:t xml:space="preserve">or completeness guarantee, whereas ours is a symbolic enumeration whose coverage</w:t>
-      </w:r>
-      <w:r>
-        <w:t xml:space="preserve"> </w:t>
-      </w:r>
-      <w:r>
-        <w:t xml:space="preserve">of the answer we measure directly. Third, they evaluate on 140–194 real</w:t>
-      </w:r>
-      <w:r>
-        <w:t xml:space="preserve"> </w:t>
-      </w:r>
-      <w:r>
-        <w:t xml:space="preserve">failures per backbone without a leakage analysis, a supervised baseline, or an</w:t>
-      </w:r>
-      <w:r>
-        <w:t xml:space="preserve"> </w:t>
-      </w:r>
-      <w:r>
-        <w:t xml:space="preserve">abstention mechanism. Their independent finding that SmiSelf attains an exact</w:t>
-      </w:r>
-      <w:r>
-        <w:t xml:space="preserve"> </w:t>
-      </w:r>
-      <w:r>
-        <w:t xml:space="preserve">match of 0.000 on their data corroborates the 1.2% we measure on ours.</w:t>
-      </w:r>
-    </w:p>
-    <w:bookmarkEnd w:id="14"/>
-    <w:bookmarkStart w:id="15" w:name="self-correction-with-language-models."/>
+    <w:bookmarkStart w:id="14" w:name="self-correction-with-language-models."/>
     <w:p>
       <w:pPr>
         <w:pStyle w:val="Heading4"/>
@@ -1795,123 +1720,123 @@
         <w:t xml:space="preserve">the recovered molecule, which is the central tension this paper quantifies.</w:t>
       </w:r>
     </w:p>
+    <w:bookmarkEnd w:id="14"/>
+    <w:bookmarkStart w:id="15" w:name="neuro-symbolic-systems."/>
+    <w:p>
+      <w:pPr>
+        <w:pStyle w:val="Heading4"/>
+      </w:pPr>
+      <w:r>
+        <w:t xml:space="preserve">Neuro-symbolic systems.</w:t>
+      </w:r>
+    </w:p>
+    <w:p>
+      <w:pPr>
+        <w:pStyle w:val="FirstParagraph"/>
+      </w:pPr>
+      <w:r>
+        <w:t xml:space="preserve">Our method belongs to the family that couples a symbolic component with a</w:t>
+      </w:r>
+      <w:r>
+        <w:t xml:space="preserve"> </w:t>
+      </w:r>
+      <w:r>
+        <w:t xml:space="preserve">learned one </w:t>
+      </w:r>
+      <w:r>
+        <w:t xml:space="preserve">(Garcez and Lamb 2023)</w:t>
+      </w:r>
+      <w:r>
+        <w:t xml:space="preserve">. The specific division of labour</w:t>
+      </w:r>
+      <w:r>
+        <w:t xml:space="preserve"> </w:t>
+      </w:r>
+      <w:r>
+        <w:t xml:space="preserve">matters: rather than letting the neural component generate and the symbolic</w:t>
+      </w:r>
+      <w:r>
+        <w:t xml:space="preserve"> </w:t>
+      </w:r>
+      <w:r>
+        <w:t xml:space="preserve">component merely check, the symbolic component defines a sound hypothesis space</w:t>
+      </w:r>
+      <w:r>
+        <w:t xml:space="preserve"> </w:t>
+      </w:r>
+      <w:r>
+        <w:t xml:space="preserve">and the neural component only ranks within it. That division is not ours.</w:t>
+      </w:r>
+      <w:r>
+        <w:t xml:space="preserve"> </w:t>
+      </w:r>
+      <w:r>
+        <w:t xml:space="preserve">Considine (2025)</w:t>
+      </w:r>
+      <w:r>
+        <w:t xml:space="preserve"> </w:t>
+      </w:r>
+      <w:r>
+        <w:t xml:space="preserve">formulates bounded syntax repair as an intersection</w:t>
+      </w:r>
+      <w:r>
+        <w:t xml:space="preserve"> </w:t>
+      </w:r>
+      <w:r>
+        <w:t xml:space="preserve">of a context-free language with a Levenshtein automaton, separating exact</w:t>
+      </w:r>
+      <w:r>
+        <w:t xml:space="preserve"> </w:t>
+      </w:r>
+      <w:r>
+        <w:t xml:space="preserve">admissibility from probabilistic ranking, and argues that coverage must be</w:t>
+      </w:r>
+      <w:r>
+        <w:t xml:space="preserve"> </w:t>
+      </w:r>
+      <w:r>
+        <w:t xml:space="preserve">measured because reranking cannot repair a retrieval failure. We adopt that</w:t>
+      </w:r>
+      <w:r>
+        <w:t xml:space="preserve"> </w:t>
+      </w:r>
+      <w:r>
+        <w:t xml:space="preserve">formulation and ask what it takes to make it work for molecules, where the</w:t>
+      </w:r>
+      <w:r>
+        <w:t xml:space="preserve"> </w:t>
+      </w:r>
+      <w:r>
+        <w:t xml:space="preserve">analogous machinery is unavailable: by our own measured error mix, kekulisation</w:t>
+      </w:r>
+      <w:r>
+        <w:t xml:space="preserve"> </w:t>
+      </w:r>
+      <w:r>
+        <w:t xml:space="preserve">and valence violations account for 56.5% of real failures, and neither is</w:t>
+      </w:r>
+      <w:r>
+        <w:t xml:space="preserve"> </w:t>
+      </w:r>
+      <w:r>
+        <w:t xml:space="preserve">context-free. Our soundness therefore comes from an oracle filter (RDKit parse and sanitise)</w:t>
+      </w:r>
+      <w:r>
+        <w:t xml:space="preserve"> </w:t>
+      </w:r>
+      <w:r>
+        <w:t xml:space="preserve">rather than from a grammar, and the pruning constraint from that same toolkit’s</w:t>
+      </w:r>
+      <w:r>
+        <w:t xml:space="preserve"> </w:t>
+      </w:r>
+      <w:r>
+        <w:t xml:space="preserve">diagnosis.</w:t>
+      </w:r>
+    </w:p>
     <w:bookmarkEnd w:id="15"/>
-    <w:bookmarkStart w:id="16" w:name="neuro-symbolic-systems."/>
-    <w:p>
-      <w:pPr>
-        <w:pStyle w:val="Heading4"/>
-      </w:pPr>
-      <w:r>
-        <w:t xml:space="preserve">Neuro-symbolic systems.</w:t>
-      </w:r>
-    </w:p>
-    <w:p>
-      <w:pPr>
-        <w:pStyle w:val="FirstParagraph"/>
-      </w:pPr>
-      <w:r>
-        <w:t xml:space="preserve">Our method belongs to the family that couples a symbolic component with a</w:t>
-      </w:r>
-      <w:r>
-        <w:t xml:space="preserve"> </w:t>
-      </w:r>
-      <w:r>
-        <w:t xml:space="preserve">learned one </w:t>
-      </w:r>
-      <w:r>
-        <w:t xml:space="preserve">(Garcez and Lamb 2023)</w:t>
-      </w:r>
-      <w:r>
-        <w:t xml:space="preserve">. The specific division of labour</w:t>
-      </w:r>
-      <w:r>
-        <w:t xml:space="preserve"> </w:t>
-      </w:r>
-      <w:r>
-        <w:t xml:space="preserve">matters: rather than letting the neural component generate and the symbolic</w:t>
-      </w:r>
-      <w:r>
-        <w:t xml:space="preserve"> </w:t>
-      </w:r>
-      <w:r>
-        <w:t xml:space="preserve">component merely check, the symbolic component defines a sound hypothesis space</w:t>
-      </w:r>
-      <w:r>
-        <w:t xml:space="preserve"> </w:t>
-      </w:r>
-      <w:r>
-        <w:t xml:space="preserve">and the neural component only ranks within it. That division is not ours.</w:t>
-      </w:r>
-      <w:r>
-        <w:t xml:space="preserve"> </w:t>
-      </w:r>
-      <w:r>
-        <w:t xml:space="preserve">Considine (2025)</w:t>
-      </w:r>
-      <w:r>
-        <w:t xml:space="preserve"> </w:t>
-      </w:r>
-      <w:r>
-        <w:t xml:space="preserve">formulates bounded syntax repair as an intersection</w:t>
-      </w:r>
-      <w:r>
-        <w:t xml:space="preserve"> </w:t>
-      </w:r>
-      <w:r>
-        <w:t xml:space="preserve">of a context-free language with a Levenshtein automaton, separating exact</w:t>
-      </w:r>
-      <w:r>
-        <w:t xml:space="preserve"> </w:t>
-      </w:r>
-      <w:r>
-        <w:t xml:space="preserve">admissibility from probabilistic ranking, and argues that coverage must be</w:t>
-      </w:r>
-      <w:r>
-        <w:t xml:space="preserve"> </w:t>
-      </w:r>
-      <w:r>
-        <w:t xml:space="preserve">measured because reranking cannot repair a retrieval failure. We adopt that</w:t>
-      </w:r>
-      <w:r>
-        <w:t xml:space="preserve"> </w:t>
-      </w:r>
-      <w:r>
-        <w:t xml:space="preserve">formulation and ask what it takes to make it work for molecules, where the</w:t>
-      </w:r>
-      <w:r>
-        <w:t xml:space="preserve"> </w:t>
-      </w:r>
-      <w:r>
-        <w:t xml:space="preserve">analogous machinery is unavailable: by our own measured error mix, kekulisation</w:t>
-      </w:r>
-      <w:r>
-        <w:t xml:space="preserve"> </w:t>
-      </w:r>
-      <w:r>
-        <w:t xml:space="preserve">and valence violations account for 56.5% of real failures, and neither is</w:t>
-      </w:r>
-      <w:r>
-        <w:t xml:space="preserve"> </w:t>
-      </w:r>
-      <w:r>
-        <w:t xml:space="preserve">context-free. Our soundness therefore comes from an oracle filter (RDKit parse and sanitise)</w:t>
-      </w:r>
-      <w:r>
-        <w:t xml:space="preserve"> </w:t>
-      </w:r>
-      <w:r>
-        <w:t xml:space="preserve">rather than from a grammar, and the pruning constraint from that same toolkit’s</w:t>
-      </w:r>
-      <w:r>
-        <w:t xml:space="preserve"> </w:t>
-      </w:r>
-      <w:r>
-        <w:t xml:space="preserve">diagnosis.</w:t>
-      </w:r>
-    </w:p>
     <w:bookmarkEnd w:id="16"/>
-    <w:bookmarkEnd w:id="17"/>
-    <w:bookmarkStart w:id="18" w:name="sec:formulation"/>
+    <w:bookmarkStart w:id="17" w:name="sec:formulation"/>
     <w:p>
       <w:pPr>
         <w:pStyle w:val="Heading1"/>
@@ -2122,7 +2047,7 @@
       <w:pPr>
         <w:numPr>
           <w:ilvl w:val="0"/>
-          <w:numId w:val="1002"/>
+          <w:numId w:val="1001"/>
         </w:numPr>
       </w:pPr>
       <w:r>
@@ -2183,7 +2108,7 @@
       <w:pPr>
         <w:numPr>
           <w:ilvl w:val="0"/>
-          <w:numId w:val="1002"/>
+          <w:numId w:val="1001"/>
         </w:numPr>
       </w:pPr>
       <w:r>
@@ -2395,7 +2320,7 @@
       <w:pPr>
         <w:numPr>
           <w:ilvl w:val="0"/>
-          <w:numId w:val="1002"/>
+          <w:numId w:val="1001"/>
         </w:numPr>
       </w:pPr>
       <w:r>
@@ -2434,7 +2359,7 @@
       <w:pPr>
         <w:numPr>
           <w:ilvl w:val="0"/>
-          <w:numId w:val="1002"/>
+          <w:numId w:val="1001"/>
         </w:numPr>
       </w:pPr>
       <w:r>
@@ -2464,7 +2389,7 @@
       <w:pPr>
         <w:numPr>
           <w:ilvl w:val="0"/>
-          <w:numId w:val="1002"/>
+          <w:numId w:val="1001"/>
         </w:numPr>
       </w:pPr>
       <w:r>
@@ -2656,8 +2581,8 @@
         <w:t xml:space="preserve">requested ones.</w:t>
       </w:r>
     </w:p>
-    <w:bookmarkEnd w:id="18"/>
-    <w:bookmarkStart w:id="22" w:name="sec:bench"/>
+    <w:bookmarkEnd w:id="17"/>
+    <w:bookmarkStart w:id="21" w:name="sec:bench"/>
     <w:p>
       <w:pPr>
         <w:pStyle w:val="Heading1"/>
@@ -2692,7 +2617,7 @@
         <w:t xml:space="preserve">realistic errors.</w:t>
       </w:r>
     </w:p>
-    <w:bookmarkStart w:id="19" w:name="error-mix-calibrated-to-real-failures."/>
+    <w:bookmarkStart w:id="18" w:name="error-mix-calibrated-to-real-failures."/>
     <w:p>
       <w:pPr>
         <w:pStyle w:val="Heading4"/>
@@ -2829,8 +2754,8 @@
         <w:t xml:space="preserve">draw no conclusions from it.</w:t>
       </w:r>
     </w:p>
-    <w:bookmarkEnd w:id="19"/>
-    <w:bookmarkStart w:id="20" w:name="construction."/>
+    <w:bookmarkEnd w:id="18"/>
+    <w:bookmarkStart w:id="19" w:name="construction."/>
     <w:p>
       <w:pPr>
         <w:pStyle w:val="Heading4"/>
@@ -2917,8 +2842,8 @@
         <w:t xml:space="preserve">molecules are removed.</w:t>
       </w:r>
     </w:p>
-    <w:bookmarkEnd w:id="20"/>
-    <w:bookmarkStart w:id="21" w:name="splits-and-leakage-control."/>
+    <w:bookmarkEnd w:id="19"/>
+    <w:bookmarkStart w:id="20" w:name="splits-and-leakage-control."/>
     <w:p>
       <w:pPr>
         <w:pStyle w:val="Heading4"/>
@@ -3101,9 +3026,9 @@
         <w:t xml:space="preserve">, never to the answer.</w:t>
       </w:r>
     </w:p>
+    <w:bookmarkEnd w:id="20"/>
     <w:bookmarkEnd w:id="21"/>
-    <w:bookmarkEnd w:id="22"/>
-    <w:bookmarkStart w:id="24" w:name="sec:method"/>
+    <w:bookmarkStart w:id="23" w:name="sec:method"/>
     <w:p>
       <w:pPr>
         <w:pStyle w:val="Heading1"/>
@@ -3433,7 +3358,7 @@
         <w:t xml:space="preserve">).</w:t>
       </w:r>
     </w:p>
-    <w:bookmarkStart w:id="23" w:name="why-a-domain-language-model."/>
+    <w:bookmarkStart w:id="22" w:name="why-a-domain-language-model."/>
     <w:p>
       <w:pPr>
         <w:pStyle w:val="Heading4"/>
@@ -3480,9 +3405,9 @@
         <w:t xml:space="preserve">memorised the test molecules from public databases.</w:t>
       </w:r>
     </w:p>
+    <w:bookmarkEnd w:id="22"/>
     <w:bookmarkEnd w:id="23"/>
-    <w:bookmarkEnd w:id="24"/>
-    <w:bookmarkStart w:id="64" w:name="experiments"/>
+    <w:bookmarkStart w:id="63" w:name="experiments"/>
     <w:p>
       <w:pPr>
         <w:pStyle w:val="Heading1"/>
@@ -3517,7 +3442,7 @@
         <w:t xml:space="preserve">paired McNemar tests with Bonferroni correction.</w:t>
       </w:r>
     </w:p>
-    <w:bookmarkStart w:id="30" w:name="sec:exp1"/>
+    <w:bookmarkStart w:id="29" w:name="sec:exp1"/>
     <w:p>
       <w:pPr>
         <w:pStyle w:val="Heading2"/>
@@ -3723,7 +3648,7 @@
         <w:t xml:space="preserve">recovery when it occurs.</w:t>
       </w:r>
     </w:p>
-    <w:bookmarkStart w:id="25" w:name="tab:main"/>
+    <w:bookmarkStart w:id="24" w:name="tab:main"/>
     <w:p>
       <w:pPr>
         <w:pStyle w:val="TableCaption"/>
@@ -4689,7 +4614,7 @@
         </w:tc>
       </w:tr>
     </w:tbl>
-    <w:bookmarkEnd w:id="25"/>
+    <w:bookmarkEnd w:id="24"/>
     <w:p>
       <w:pPr>
         <w:pStyle w:val="BodyText"/>
@@ -4903,7 +4828,7 @@
         <w:t xml:space="preserve">evidence in any case, since every system is scored on identical items.</w:t>
       </w:r>
     </w:p>
-    <w:bookmarkStart w:id="29" w:name="fig:plane"/>
+    <w:bookmarkStart w:id="28" w:name="fig:plane"/>
     <w:p>
       <w:pPr>
         <w:pStyle w:val="CaptionedFigure"/>
@@ -4913,18 +4838,18 @@
           <wp:inline>
             <wp:extent cx="4160520" cy="3118169"/>
             <wp:effectExtent b="0" l="0" r="0" t="0"/>
-            <wp:docPr descr="" title="" id="27" name="Picture"/>
+            <wp:docPr descr="" title="" id="26" name="Picture"/>
             <a:graphic>
               <a:graphicData uri="http://schemas.openxmlformats.org/drawingml/2006/picture">
                 <pic:pic>
                   <pic:nvPicPr>
-                    <pic:cNvPr descr="fig_validity_recovery_plane.png" id="28" name="Picture"/>
+                    <pic:cNvPr descr="fig_validity_recovery_plane.png" id="27" name="Picture"/>
                     <pic:cNvPicPr>
                       <a:picLocks noChangeArrowheads="1" noChangeAspect="1"/>
                     </pic:cNvPicPr>
                   </pic:nvPicPr>
                   <pic:blipFill>
-                    <a:blip r:embed="rId26"/>
+                    <a:blip r:embed="rId25"/>
                     <a:stretch>
                       <a:fillRect/>
                     </a:stretch>
@@ -4971,9 +4896,9 @@
         <w:t xml:space="preserve">relative ordering depends entirely on which axis is read.</w:t>
       </w:r>
     </w:p>
+    <w:bookmarkEnd w:id="28"/>
     <w:bookmarkEnd w:id="29"/>
-    <w:bookmarkEnd w:id="30"/>
-    <w:bookmarkStart w:id="35" w:name="sec:exp2"/>
+    <w:bookmarkStart w:id="34" w:name="sec:exp2"/>
     <w:p>
       <w:pPr>
         <w:pStyle w:val="Heading2"/>
@@ -5092,7 +5017,7 @@
         <w:t xml:space="preserve">shows the distribution of candidate-set sizes and per-category coverage.</w:t>
       </w:r>
     </w:p>
-    <w:bookmarkStart w:id="34" w:name="fig:space"/>
+    <w:bookmarkStart w:id="33" w:name="fig:space"/>
     <w:p>
       <w:pPr>
         <w:pStyle w:val="CaptionedFigure"/>
@@ -5102,18 +5027,18 @@
           <wp:inline>
             <wp:extent cx="4501661" cy="2299761"/>
             <wp:effectExtent b="0" l="0" r="0" t="0"/>
-            <wp:docPr descr="" title="" id="32" name="Picture"/>
+            <wp:docPr descr="" title="" id="31" name="Picture"/>
             <a:graphic>
               <a:graphicData uri="http://schemas.openxmlformats.org/drawingml/2006/picture">
                 <pic:pic>
                   <pic:nvPicPr>
-                    <pic:cNvPr descr="fig_candidate_space.png" id="33" name="Picture"/>
+                    <pic:cNvPr descr="fig_candidate_space.png" id="32" name="Picture"/>
                     <pic:cNvPicPr>
                       <a:picLocks noChangeArrowheads="1" noChangeAspect="1"/>
                     </pic:cNvPicPr>
                   </pic:nvPicPr>
                   <pic:blipFill>
-                    <a:blip r:embed="rId31"/>
+                    <a:blip r:embed="rId30"/>
                     <a:stretch>
                       <a:fillRect/>
                     </a:stretch>
@@ -5160,63 +5085,63 @@
         <w:t xml:space="preserve">and the expected accuracy of uniform selection (red).</w:t>
       </w:r>
     </w:p>
+    <w:bookmarkEnd w:id="33"/>
     <w:bookmarkEnd w:id="34"/>
+    <w:bookmarkStart w:id="35" w:name="sec:exp3"/>
+    <w:p>
+      <w:pPr>
+        <w:pStyle w:val="Heading2"/>
+      </w:pPr>
+      <w:r>
+        <w:t xml:space="preserve">Experiment 3: does symbolic pruning help?</w:t>
+      </w:r>
+    </w:p>
+    <w:p>
+      <w:pPr>
+        <w:pStyle w:val="FirstParagraph"/>
+      </w:pPr>
+      <w:r>
+        <w:t xml:space="preserve">Using the RDKit diagnosis to discard edits inconsistent with the observed error</w:t>
+      </w:r>
+      <w:r>
+        <w:t xml:space="preserve"> </w:t>
+      </w:r>
+      <w:r>
+        <w:t xml:space="preserve">reduces the median candidate set from 45 to 28 on the development split while</w:t>
+      </w:r>
+      <w:r>
+        <w:t xml:space="preserve"> </w:t>
+      </w:r>
+      <w:r>
+        <w:t xml:space="preserve">leaving truth retention unchanged at 0.9978: the pruning is lossless. We</w:t>
+      </w:r>
+      <w:r>
+        <w:t xml:space="preserve"> </w:t>
+      </w:r>
+      <w:r>
+        <w:t xml:space="preserve">selected the constraint by sweeping candidate rules on the development split and</w:t>
+      </w:r>
+      <w:r>
+        <w:t xml:space="preserve"> </w:t>
+      </w:r>
+      <w:r>
+        <w:t xml:space="preserve">keeping the tightest lossless one; tightening kekulisation repairs to aromatic</w:t>
+      </w:r>
+      <w:r>
+        <w:t xml:space="preserve"> </w:t>
+      </w:r>
+      <w:r>
+        <w:t xml:space="preserve">atoms alone, for instance, would shrink the median set to 27 but drop retention</w:t>
+      </w:r>
+      <w:r>
+        <w:t xml:space="preserve"> </w:t>
+      </w:r>
+      <w:r>
+        <w:t xml:space="preserve">to 0.749, and was rejected.</w:t>
+      </w:r>
+    </w:p>
     <w:bookmarkEnd w:id="35"/>
-    <w:bookmarkStart w:id="36" w:name="sec:exp3"/>
-    <w:p>
-      <w:pPr>
-        <w:pStyle w:val="Heading2"/>
-      </w:pPr>
-      <w:r>
-        <w:t xml:space="preserve">Experiment 3: does symbolic pruning help?</w:t>
-      </w:r>
-    </w:p>
-    <w:p>
-      <w:pPr>
-        <w:pStyle w:val="FirstParagraph"/>
-      </w:pPr>
-      <w:r>
-        <w:t xml:space="preserve">Using the RDKit diagnosis to discard edits inconsistent with the observed error</w:t>
-      </w:r>
-      <w:r>
-        <w:t xml:space="preserve"> </w:t>
-      </w:r>
-      <w:r>
-        <w:t xml:space="preserve">reduces the median candidate set from 45 to 28 on the development split while</w:t>
-      </w:r>
-      <w:r>
-        <w:t xml:space="preserve"> </w:t>
-      </w:r>
-      <w:r>
-        <w:t xml:space="preserve">leaving truth retention unchanged at 0.9978: the pruning is lossless. We</w:t>
-      </w:r>
-      <w:r>
-        <w:t xml:space="preserve"> </w:t>
-      </w:r>
-      <w:r>
-        <w:t xml:space="preserve">selected the constraint by sweeping candidate rules on the development split and</w:t>
-      </w:r>
-      <w:r>
-        <w:t xml:space="preserve"> </w:t>
-      </w:r>
-      <w:r>
-        <w:t xml:space="preserve">keeping the tightest lossless one; tightening kekulisation repairs to aromatic</w:t>
-      </w:r>
-      <w:r>
-        <w:t xml:space="preserve"> </w:t>
-      </w:r>
-      <w:r>
-        <w:t xml:space="preserve">atoms alone, for instance, would shrink the median set to 27 but drop retention</w:t>
-      </w:r>
-      <w:r>
-        <w:t xml:space="preserve"> </w:t>
-      </w:r>
-      <w:r>
-        <w:t xml:space="preserve">to 0.749, and was rejected.</w:t>
-      </w:r>
-    </w:p>
-    <w:bookmarkEnd w:id="36"/>
-    <w:bookmarkStart w:id="46" w:name="sec:exp4"/>
+    <w:bookmarkStart w:id="45" w:name="sec:exp4"/>
     <w:p>
       <w:pPr>
         <w:pStyle w:val="Heading2"/>
@@ -5605,7 +5530,7 @@
         <w:t xml:space="preserve">).</w:t>
       </w:r>
     </w:p>
-    <w:bookmarkStart w:id="40" w:name="fig:ladder"/>
+    <w:bookmarkStart w:id="39" w:name="fig:ladder"/>
     <w:p>
       <w:pPr>
         <w:pStyle w:val="CaptionedFigure"/>
@@ -5615,18 +5540,18 @@
           <wp:inline>
             <wp:extent cx="4267200" cy="2266259"/>
             <wp:effectExtent b="0" l="0" r="0" t="0"/>
-            <wp:docPr descr="" title="" id="38" name="Picture"/>
+            <wp:docPr descr="" title="" id="37" name="Picture"/>
             <a:graphic>
               <a:graphicData uri="http://schemas.openxmlformats.org/drawingml/2006/picture">
                 <pic:pic>
                   <pic:nvPicPr>
-                    <pic:cNvPr descr="fig_ranking_ladder.png" id="39" name="Picture"/>
+                    <pic:cNvPr descr="fig_ranking_ladder.png" id="38" name="Picture"/>
                     <pic:cNvPicPr>
                       <a:picLocks noChangeArrowheads="1" noChangeAspect="1"/>
                     </pic:cNvPicPr>
                   </pic:nvPicPr>
                   <pic:blipFill>
-                    <a:blip r:embed="rId37"/>
+                    <a:blip r:embed="rId36"/>
                     <a:stretch>
                       <a:fillRect/>
                     </a:stretch>
@@ -5667,8 +5592,8 @@
         <w:t xml:space="preserve">is replaced by enumeration and progressively better selection rules.</w:t>
       </w:r>
     </w:p>
-    <w:bookmarkEnd w:id="40"/>
-    <w:bookmarkStart w:id="44" w:name="fig:cat"/>
+    <w:bookmarkEnd w:id="39"/>
+    <w:bookmarkStart w:id="43" w:name="fig:cat"/>
     <w:p>
       <w:pPr>
         <w:pStyle w:val="CaptionedFigure"/>
@@ -5678,18 +5603,18 @@
           <wp:inline>
             <wp:extent cx="4437439" cy="2709559"/>
             <wp:effectExtent b="0" l="0" r="0" t="0"/>
-            <wp:docPr descr="" title="" id="42" name="Picture"/>
+            <wp:docPr descr="" title="" id="41" name="Picture"/>
             <a:graphic>
               <a:graphicData uri="http://schemas.openxmlformats.org/drawingml/2006/picture">
                 <pic:pic>
                   <pic:nvPicPr>
-                    <pic:cNvPr descr="fig_per_category.png" id="43" name="Picture"/>
+                    <pic:cNvPr descr="fig_per_category.png" id="42" name="Picture"/>
                     <pic:cNvPicPr>
                       <a:picLocks noChangeArrowheads="1" noChangeAspect="1"/>
                     </pic:cNvPicPr>
                   </pic:nvPicPr>
                   <pic:blipFill>
-                    <a:blip r:embed="rId41"/>
+                    <a:blip r:embed="rId40"/>
                     <a:stretch>
                       <a:fillRect/>
                     </a:stretch>
@@ -5724,8 +5649,8 @@
         <w:t xml:space="preserve">Exact recovery by error category.</w:t>
       </w:r>
     </w:p>
-    <w:bookmarkEnd w:id="44"/>
-    <w:bookmarkStart w:id="45" w:name="Xfeb71ed8f462cb9bf2bf15440fcc5f070e1bebd"/>
+    <w:bookmarkEnd w:id="43"/>
+    <w:bookmarkStart w:id="44" w:name="Xfeb71ed8f462cb9bf2bf15440fcc5f070e1bebd"/>
     <w:p>
       <w:pPr>
         <w:pStyle w:val="Heading4"/>
@@ -5899,9 +5824,9 @@
         <w:t xml:space="preserve">(13.79/13.64/13.79%), far below the gaps between conditions.</w:t>
       </w:r>
     </w:p>
+    <w:bookmarkEnd w:id="44"/>
     <w:bookmarkEnd w:id="45"/>
-    <w:bookmarkEnd w:id="46"/>
-    <w:bookmarkStart w:id="47" w:name="sec:exp5"/>
+    <w:bookmarkStart w:id="46" w:name="sec:exp5"/>
     <w:p>
       <w:pPr>
         <w:pStyle w:val="Heading2"/>
@@ -6194,8 +6119,8 @@
         <w:t xml:space="preserve">are being repaired.</w:t>
       </w:r>
     </w:p>
-    <w:bookmarkEnd w:id="47"/>
-    <w:bookmarkStart w:id="51" w:name="sec:exp6"/>
+    <w:bookmarkEnd w:id="46"/>
+    <w:bookmarkStart w:id="50" w:name="sec:exp6"/>
     <w:p>
       <w:pPr>
         <w:pStyle w:val="Heading2"/>
@@ -6278,7 +6203,7 @@
         <w:t xml:space="preserve">valid outputs.</w:t>
       </w:r>
     </w:p>
-    <w:bookmarkStart w:id="48" w:name="X8322b27c02e2fe346729b54e240f915b0fe4ff3"/>
+    <w:bookmarkStart w:id="47" w:name="X8322b27c02e2fe346729b54e240f915b0fe4ff3"/>
     <w:p>
       <w:pPr>
         <w:pStyle w:val="Heading4"/>
@@ -6365,8 +6290,8 @@
         <w:t xml:space="preserve">enumeration does not reach a valid molecule.</w:t>
       </w:r>
     </w:p>
-    <w:bookmarkEnd w:id="48"/>
-    <w:bookmarkStart w:id="49" w:name="X359ba524faceb70674efeaa407d3ddf78e46703"/>
+    <w:bookmarkEnd w:id="47"/>
+    <w:bookmarkStart w:id="48" w:name="X359ba524faceb70674efeaa407d3ddf78e46703"/>
     <w:p>
       <w:pPr>
         <w:pStyle w:val="Heading4"/>
@@ -6746,8 +6671,8 @@
         <w:t xml:space="preserve">effect we can observe.</w:t>
       </w:r>
     </w:p>
-    <w:bookmarkEnd w:id="49"/>
-    <w:bookmarkStart w:id="50" w:name="X12bf00d319caf434f85b4c4161b955130aeaff8"/>
+    <w:bookmarkEnd w:id="48"/>
+    <w:bookmarkStart w:id="49" w:name="X12bf00d319caf434f85b4c4161b955130aeaff8"/>
     <w:p>
       <w:pPr>
         <w:pStyle w:val="Heading4"/>
@@ -6881,9 +6806,9 @@
         <w:t xml:space="preserve">particular molecules, is doing the work.</w:t>
       </w:r>
     </w:p>
+    <w:bookmarkEnd w:id="49"/>
     <w:bookmarkEnd w:id="50"/>
-    <w:bookmarkEnd w:id="51"/>
-    <w:bookmarkStart w:id="53" w:name="sec:exp7"/>
+    <w:bookmarkStart w:id="52" w:name="sec:exp7"/>
     <w:p>
       <w:pPr>
         <w:pStyle w:val="Heading2"/>
@@ -7353,7 +7278,7 @@
         <w:t xml:space="preserve">exactly at 100% validity, replicating the 80.7% headline on fresh molecules.</w:t>
       </w:r>
     </w:p>
-    <w:bookmarkStart w:id="52" w:name="buying-a-second-edit-and-what-it-costs."/>
+    <w:bookmarkStart w:id="51" w:name="buying-a-second-edit-and-what-it-costs."/>
     <w:p>
       <w:pPr>
         <w:pStyle w:val="Heading4"/>
@@ -7835,9 +7760,9 @@
         <w:t xml:space="preserve">solve the multi-edit case.</w:t>
       </w:r>
     </w:p>
+    <w:bookmarkEnd w:id="51"/>
     <w:bookmarkEnd w:id="52"/>
-    <w:bookmarkEnd w:id="53"/>
-    <w:bookmarkStart w:id="55" w:name="sec:exp8"/>
+    <w:bookmarkStart w:id="54" w:name="sec:exp8"/>
     <w:p>
       <w:pPr>
         <w:pStyle w:val="Heading2"/>
@@ -8507,7 +8432,7 @@
         </w:tc>
       </w:tr>
     </w:tbl>
-    <w:bookmarkStart w:id="54" w:name="X035677370ff6b734ed69bcb36963fa21e243bb8"/>
+    <w:bookmarkStart w:id="53" w:name="X035677370ff6b734ed69bcb36963fa21e243bb8"/>
     <w:p>
       <w:pPr>
         <w:pStyle w:val="Heading4"/>
@@ -8709,9 +8634,9 @@
         <w:t xml:space="preserve">behaviour for a system whose purpose is to preserve identity.</w:t>
       </w:r>
     </w:p>
+    <w:bookmarkEnd w:id="53"/>
     <w:bookmarkEnd w:id="54"/>
-    <w:bookmarkEnd w:id="55"/>
-    <w:bookmarkStart w:id="56" w:name="sec:exp9"/>
+    <w:bookmarkStart w:id="55" w:name="sec:exp9"/>
     <w:p>
       <w:pPr>
         <w:pStyle w:val="Heading2"/>
@@ -9134,8 +9059,8 @@
         <w:t xml:space="preserve">guarantees it regardless of which model does the ranking.</w:t>
       </w:r>
     </w:p>
-    <w:bookmarkEnd w:id="56"/>
-    <w:bookmarkStart w:id="57" w:name="statistical-significance"/>
+    <w:bookmarkEnd w:id="55"/>
+    <w:bookmarkStart w:id="56" w:name="statistical-significance"/>
     <w:p>
       <w:pPr>
         <w:pStyle w:val="Heading2"/>
@@ -9831,8 +9756,8 @@
         </w:tc>
       </w:tr>
     </w:tbl>
-    <w:bookmarkEnd w:id="57"/>
-    <w:bookmarkStart w:id="58" w:name="sec:contam"/>
+    <w:bookmarkEnd w:id="56"/>
+    <w:bookmarkStart w:id="57" w:name="sec:contam"/>
     <w:p>
       <w:pPr>
         <w:pStyle w:val="Heading2"/>
@@ -9919,8 +9844,8 @@
         <w:t xml:space="preserve">these results.</w:t>
       </w:r>
     </w:p>
-    <w:bookmarkEnd w:id="58"/>
-    <w:bookmarkStart w:id="63" w:name="sec:abstain"/>
+    <w:bookmarkEnd w:id="57"/>
+    <w:bookmarkStart w:id="62" w:name="sec:abstain"/>
     <w:p>
       <w:pPr>
         <w:pStyle w:val="Heading2"/>
@@ -10020,7 +9945,7 @@
         <w:t xml:space="preserve">full test split.</w:t>
       </w:r>
     </w:p>
-    <w:bookmarkStart w:id="62" w:name="fig:risk"/>
+    <w:bookmarkStart w:id="61" w:name="fig:risk"/>
     <w:p>
       <w:pPr>
         <w:pStyle w:val="CaptionedFigure"/>
@@ -10030,18 +9955,18 @@
           <wp:inline>
             <wp:extent cx="3119357" cy="2299761"/>
             <wp:effectExtent b="0" l="0" r="0" t="0"/>
-            <wp:docPr descr="" title="" id="60" name="Picture"/>
+            <wp:docPr descr="" title="" id="59" name="Picture"/>
             <a:graphic>
               <a:graphicData uri="http://schemas.openxmlformats.org/drawingml/2006/picture">
                 <pic:pic>
                   <pic:nvPicPr>
-                    <pic:cNvPr descr="fig_risk_coverage.png" id="61" name="Picture"/>
+                    <pic:cNvPr descr="fig_risk_coverage.png" id="60" name="Picture"/>
                     <pic:cNvPicPr>
                       <a:picLocks noChangeArrowheads="1" noChangeAspect="1"/>
                     </pic:cNvPicPr>
                   </pic:nvPicPr>
                   <pic:blipFill>
-                    <a:blip r:embed="rId59"/>
+                    <a:blip r:embed="rId58"/>
                     <a:stretch>
                       <a:fillRect/>
                     </a:stretch>
@@ -10106,10 +10031,10 @@
         <w:t xml:space="preserve">of the full test split) gives 96.4% precision.</w:t>
       </w:r>
     </w:p>
+    <w:bookmarkEnd w:id="61"/>
     <w:bookmarkEnd w:id="62"/>
     <w:bookmarkEnd w:id="63"/>
-    <w:bookmarkEnd w:id="64"/>
-    <w:bookmarkStart w:id="68" w:name="discussion"/>
+    <w:bookmarkStart w:id="67" w:name="discussion"/>
     <w:p>
       <w:pPr>
         <w:pStyle w:val="Heading1"/>
@@ -10118,7 +10043,7 @@
         <w:t xml:space="preserve">Discussion</w:t>
       </w:r>
     </w:p>
-    <w:bookmarkStart w:id="65" w:name="what-the-field-should-report."/>
+    <w:bookmarkStart w:id="64" w:name="what-the-field-should-report."/>
     <w:p>
       <w:pPr>
         <w:pStyle w:val="Heading4"/>
@@ -10194,8 +10119,8 @@
         <w:t xml:space="preserve">supplies.</w:t>
       </w:r>
     </w:p>
-    <w:bookmarkEnd w:id="65"/>
-    <w:bookmarkStart w:id="66" w:name="where-the-difficulty-actually-lives."/>
+    <w:bookmarkEnd w:id="64"/>
+    <w:bookmarkStart w:id="65" w:name="where-the-difficulty-actually-lives."/>
     <w:p>
       <w:pPr>
         <w:pStyle w:val="Heading4"/>
@@ -10209,7 +10134,7 @@
         <w:pStyle w:val="FirstParagraph"/>
       </w:pPr>
       <w:r>
-        <w:t xml:space="preserve">The decomposition is clean. Symbolic enumeration makes recovery</w:t>
+        <w:t xml:space="preserve">Symbolic enumeration makes recovery</w:t>
       </w:r>
       <w:r>
         <w:t xml:space="preserve"> </w:t>
@@ -10222,16 +10147,19 @@
         <w:t xml:space="preserve">possible</w:t>
       </w:r>
       <w:r>
-        <w:t xml:space="preserve"> </w:t>
-      </w:r>
-      <w:r>
-        <w:t xml:space="preserve">: it delivers a sound candidate set containing the answer 99.79% of the time.</w:t>
-      </w:r>
-      <w:r>
-        <w:t xml:space="preserve"> </w:t>
-      </w:r>
-      <w:r>
-        <w:t xml:space="preserve">The chemical prior makes recovery</w:t>
+        <w:t xml:space="preserve">: it delivers a sound</w:t>
+      </w:r>
+      <w:r>
+        <w:t xml:space="preserve"> </w:t>
+      </w:r>
+      <w:r>
+        <w:t xml:space="preserve">candidate set containing the answer 99.79% of the time. The chemical prior</w:t>
+      </w:r>
+      <w:r>
+        <w:t xml:space="preserve"> </w:t>
+      </w:r>
+      <w:r>
+        <w:t xml:space="preserve">makes recovery</w:t>
       </w:r>
       <w:r>
         <w:t xml:space="preserve"> </w:t>
@@ -10244,35 +10172,47 @@
         <w:t xml:space="preserve">accurate</w:t>
       </w:r>
       <w:r>
-        <w:t xml:space="preserve">, raising exact recovery on</w:t>
-      </w:r>
-      <w:r>
-        <w:t xml:space="preserve"> </w:t>
-      </w:r>
-      <w:r>
-        <w:t xml:space="preserve">the same pruned candidate set from 13.6% with uniform selection to</w:t>
-      </w:r>
-      <w:r>
-        <w:t xml:space="preserve"> </w:t>
-      </w:r>
-      <w:r>
-        <w:t xml:space="preserve">80.7%. Neither half suffices alone: enumeration without a prior is barely</w:t>
-      </w:r>
-      <w:r>
-        <w:t xml:space="preserve"> </w:t>
-      </w:r>
-      <w:r>
-        <w:t xml:space="preserve">better than published methods, and a prior without enumeration (the free LLM</w:t>
-      </w:r>
-      <w:r>
-        <w:t xml:space="preserve"> </w:t>
-      </w:r>
-      <w:r>
-        <w:t xml:space="preserve">loop) sacrifices validity and drifts off the intended molecule.</w:t>
-      </w:r>
-    </w:p>
-    <w:bookmarkEnd w:id="66"/>
-    <w:bookmarkStart w:id="67" w:name="limitations."/>
+        <w:t xml:space="preserve">, raising exact recovery on the same pruned</w:t>
+      </w:r>
+      <w:r>
+        <w:t xml:space="preserve"> </w:t>
+      </w:r>
+      <w:r>
+        <w:t xml:space="preserve">candidate set from 13.6% with uniform selection to 80.7%. Neither half</w:t>
+      </w:r>
+      <w:r>
+        <w:t xml:space="preserve"> </w:t>
+      </w:r>
+      <w:r>
+        <w:t xml:space="preserve">suffices alone. Enumeration without a prior already beats the published</w:t>
+      </w:r>
+      <w:r>
+        <w:t xml:space="preserve"> </w:t>
+      </w:r>
+      <w:r>
+        <w:t xml:space="preserve">corrector we evaluate by an order of magnitude (13.6% against 1.2%) but falls</w:t>
+      </w:r>
+      <w:r>
+        <w:t xml:space="preserve"> </w:t>
+      </w:r>
+      <w:r>
+        <w:t xml:space="preserve">well short of a supervised model trained for the task (59.4%); a prior without</w:t>
+      </w:r>
+      <w:r>
+        <w:t xml:space="preserve"> </w:t>
+      </w:r>
+      <w:r>
+        <w:t xml:space="preserve">enumeration, the free LLM loop, sacrifices validity and drifts off the intended</w:t>
+      </w:r>
+      <w:r>
+        <w:t xml:space="preserve"> </w:t>
+      </w:r>
+      <w:r>
+        <w:t xml:space="preserve">molecule.</w:t>
+      </w:r>
+    </w:p>
+    <w:bookmarkEnd w:id="65"/>
+    <w:bookmarkStart w:id="66" w:name="limitations."/>
     <w:p>
       <w:pPr>
         <w:pStyle w:val="Heading4"/>
@@ -10466,15 +10406,102 @@
         <w:t xml:space="preserve">adversarial mismatch remains uncharacterised.</w:t>
       </w:r>
     </w:p>
+    <w:bookmarkEnd w:id="66"/>
     <w:bookmarkEnd w:id="67"/>
+    <w:bookmarkStart w:id="68" w:name="conclusion"/>
+    <w:p>
+      <w:pPr>
+        <w:pStyle w:val="Heading1"/>
+      </w:pPr>
+      <w:r>
+        <w:t xml:space="preserve">Conclusion</w:t>
+      </w:r>
+    </w:p>
+    <w:p>
+      <w:pPr>
+        <w:pStyle w:val="FirstParagraph"/>
+      </w:pPr>
+      <w:r>
+        <w:t xml:space="preserve">Validity has served as the default metric for SMILES correction. We find that</w:t>
+      </w:r>
+      <w:r>
+        <w:t xml:space="preserve"> </w:t>
+      </w:r>
+      <w:r>
+        <w:t xml:space="preserve">it can substantially mis-rank systems: a published corrector attains 86.6% validity</w:t>
+      </w:r>
+      <w:r>
+        <w:t xml:space="preserve"> </w:t>
+      </w:r>
+      <w:r>
+        <w:t xml:space="preserve">while recovering the intended molecule for 1.2% of inputs, and is ordered ahead</w:t>
+      </w:r>
+      <w:r>
+        <w:t xml:space="preserve"> </w:t>
+      </w:r>
+      <w:r>
+        <w:t xml:space="preserve">of a system that recovers twelve times as many molecules. Once recovery is</w:t>
+      </w:r>
+      <w:r>
+        <w:t xml:space="preserve"> </w:t>
+      </w:r>
+      <w:r>
+        <w:t xml:space="preserve">measured directly, the problem changes shape. It is better posed as constrained</w:t>
+      </w:r>
+      <w:r>
+        <w:t xml:space="preserve"> </w:t>
+      </w:r>
+      <w:r>
+        <w:t xml:space="preserve">selection than as generation: enumerate the repairs a chemistry toolkit will</w:t>
+      </w:r>
+      <w:r>
+        <w:t xml:space="preserve"> </w:t>
+      </w:r>
+      <w:r>
+        <w:t xml:space="preserve">accept, prune them with the toolkit’s own diagnosis, and let a chemical language</w:t>
+      </w:r>
+      <w:r>
+        <w:t xml:space="preserve"> </w:t>
+      </w:r>
+      <w:r>
+        <w:t xml:space="preserve">model choose. That system recovers the intended molecule for 80.7% of held-out</w:t>
+      </w:r>
+      <w:r>
+        <w:t xml:space="preserve"> </w:t>
+      </w:r>
+      <w:r>
+        <w:t xml:space="preserve">corrupted strings at 100% validity, beats a supervised corrector trained on</w:t>
+      </w:r>
+      <w:r>
+        <w:t xml:space="preserve"> </w:t>
+      </w:r>
+      <w:r>
+        <w:t xml:space="preserve">245k in-distribution repair pairs, and supports abstention at 96.4% precision</w:t>
+      </w:r>
+      <w:r>
+        <w:t xml:space="preserve"> </w:t>
+      </w:r>
+      <w:r>
+        <w:t xml:space="preserve">over 46% of its inputs.</w:t>
+      </w:r>
+    </w:p>
     <w:bookmarkEnd w:id="68"/>
-    <w:bookmarkStart w:id="69" w:name="conclusion"/>
+    <w:bookmarkStart w:id="103" w:name="declarations"/>
     <w:p>
       <w:pPr>
         <w:pStyle w:val="Heading1"/>
       </w:pPr>
       <w:r>
-        <w:t xml:space="preserve">Conclusion</w:t>
+        <w:t xml:space="preserve">Declarations</w:t>
+      </w:r>
+    </w:p>
+    <w:bookmarkStart w:id="70" w:name="availability-of-data-and-materials."/>
+    <w:p>
+      <w:pPr>
+        <w:pStyle w:val="Heading4"/>
+      </w:pPr>
+      <w:r>
+        <w:t xml:space="preserve">Availability of data and materials.</w:t>
       </w:r>
     </w:p>
     <w:p>
@@ -10482,93 +10509,6 @@
         <w:pStyle w:val="FirstParagraph"/>
       </w:pPr>
       <w:r>
-        <w:t xml:space="preserve">Validity has served as the default metric for SMILES correction. We find that</w:t>
-      </w:r>
-      <w:r>
-        <w:t xml:space="preserve"> </w:t>
-      </w:r>
-      <w:r>
-        <w:t xml:space="preserve">it can substantially mis-rank systems: a published corrector attains 86.6% validity</w:t>
-      </w:r>
-      <w:r>
-        <w:t xml:space="preserve"> </w:t>
-      </w:r>
-      <w:r>
-        <w:t xml:space="preserve">while recovering the intended molecule for 1.2% of inputs, and is ordered ahead</w:t>
-      </w:r>
-      <w:r>
-        <w:t xml:space="preserve"> </w:t>
-      </w:r>
-      <w:r>
-        <w:t xml:space="preserve">of a system that recovers twelve times as many molecules. Once recovery is</w:t>
-      </w:r>
-      <w:r>
-        <w:t xml:space="preserve"> </w:t>
-      </w:r>
-      <w:r>
-        <w:t xml:space="preserve">measured directly, the problem changes shape. It is better posed as constrained</w:t>
-      </w:r>
-      <w:r>
-        <w:t xml:space="preserve"> </w:t>
-      </w:r>
-      <w:r>
-        <w:t xml:space="preserve">selection than as generation: enumerate the repairs a chemistry toolkit will</w:t>
-      </w:r>
-      <w:r>
-        <w:t xml:space="preserve"> </w:t>
-      </w:r>
-      <w:r>
-        <w:t xml:space="preserve">accept, prune them with the toolkit’s own diagnosis, and let a chemical language</w:t>
-      </w:r>
-      <w:r>
-        <w:t xml:space="preserve"> </w:t>
-      </w:r>
-      <w:r>
-        <w:t xml:space="preserve">model choose. That system recovers the intended molecule for 80.7% of held-out</w:t>
-      </w:r>
-      <w:r>
-        <w:t xml:space="preserve"> </w:t>
-      </w:r>
-      <w:r>
-        <w:t xml:space="preserve">corrupted strings at 100% validity, beats a supervised corrector trained on</w:t>
-      </w:r>
-      <w:r>
-        <w:t xml:space="preserve"> </w:t>
-      </w:r>
-      <w:r>
-        <w:t xml:space="preserve">245k in-distribution repair pairs, and supports abstention at 96.4% precision</w:t>
-      </w:r>
-      <w:r>
-        <w:t xml:space="preserve"> </w:t>
-      </w:r>
-      <w:r>
-        <w:t xml:space="preserve">over 46% of its inputs.</w:t>
-      </w:r>
-    </w:p>
-    <w:bookmarkEnd w:id="69"/>
-    <w:bookmarkStart w:id="104" w:name="declarations"/>
-    <w:p>
-      <w:pPr>
-        <w:pStyle w:val="Heading1"/>
-      </w:pPr>
-      <w:r>
-        <w:t xml:space="preserve">Declarations</w:t>
-      </w:r>
-    </w:p>
-    <w:bookmarkStart w:id="71" w:name="availability-of-data-and-materials."/>
-    <w:p>
-      <w:pPr>
-        <w:pStyle w:val="Heading4"/>
-      </w:pPr>
-      <w:r>
-        <w:t xml:space="preserve">Availability of data and materials.</w:t>
-      </w:r>
-    </w:p>
-    <w:p>
-      <w:pPr>
-        <w:pStyle w:val="FirstParagraph"/>
-      </w:pPr>
-      <w:r>
         <w:t xml:space="preserve">The recovery benchmark (6</w:t>
       </w:r>
       <w:r>
@@ -10592,7 +10532,7 @@
       <w:r>
         <w:t xml:space="preserve"> </w:t>
       </w:r>
-      <w:hyperlink r:id="rId70">
+      <w:hyperlink r:id="rId69">
         <w:r>
           <w:rPr>
             <w:rStyle w:val="Hyperlink"/>
@@ -10652,14 +10592,32 @@
         <w:t xml:space="preserve">from its authors’ released implementation.</w:t>
       </w:r>
     </w:p>
+    <w:bookmarkEnd w:id="70"/>
+    <w:bookmarkStart w:id="71" w:name="Xfdcbdbe9303d731d2b2f7fb9726fa52252c70dc"/>
+    <w:p>
+      <w:pPr>
+        <w:pStyle w:val="Heading4"/>
+      </w:pPr>
+      <w:r>
+        <w:t xml:space="preserve">Ethics approval and consent to participate.</w:t>
+      </w:r>
+    </w:p>
+    <w:p>
+      <w:pPr>
+        <w:pStyle w:val="FirstParagraph"/>
+      </w:pPr>
+      <w:r>
+        <w:t xml:space="preserve">Not applicable. This work involves no human participants, human data, or animals.</w:t>
+      </w:r>
+    </w:p>
     <w:bookmarkEnd w:id="71"/>
-    <w:bookmarkStart w:id="72" w:name="Xfdcbdbe9303d731d2b2f7fb9726fa52252c70dc"/>
+    <w:bookmarkStart w:id="72" w:name="consent-for-publication."/>
     <w:p>
       <w:pPr>
         <w:pStyle w:val="Heading4"/>
       </w:pPr>
       <w:r>
-        <w:t xml:space="preserve">Ethics approval and consent to participate.</w:t>
+        <w:t xml:space="preserve">Consent for publication.</w:t>
       </w:r>
     </w:p>
     <w:p>
@@ -10667,17 +10625,17 @@
         <w:pStyle w:val="FirstParagraph"/>
       </w:pPr>
       <w:r>
-        <w:t xml:space="preserve">Not applicable. This work involves no human participants, human data, or animals.</w:t>
+        <w:t xml:space="preserve">Not applicable.</w:t>
       </w:r>
     </w:p>
     <w:bookmarkEnd w:id="72"/>
-    <w:bookmarkStart w:id="73" w:name="consent-for-publication."/>
+    <w:bookmarkStart w:id="73" w:name="competing-interests."/>
     <w:p>
       <w:pPr>
         <w:pStyle w:val="Heading4"/>
       </w:pPr>
       <w:r>
-        <w:t xml:space="preserve">Consent for publication.</w:t>
+        <w:t xml:space="preserve">Competing interests.</w:t>
       </w:r>
     </w:p>
     <w:p>
@@ -10685,17 +10643,35 @@
         <w:pStyle w:val="FirstParagraph"/>
       </w:pPr>
       <w:r>
+        <w:t xml:space="preserve">The authors declare no competing interests.</w:t>
+      </w:r>
+    </w:p>
+    <w:bookmarkEnd w:id="73"/>
+    <w:bookmarkStart w:id="74" w:name="funding."/>
+    <w:p>
+      <w:pPr>
+        <w:pStyle w:val="Heading4"/>
+      </w:pPr>
+      <w:r>
+        <w:t xml:space="preserve">Funding.</w:t>
+      </w:r>
+    </w:p>
+    <w:p>
+      <w:pPr>
+        <w:pStyle w:val="FirstParagraph"/>
+      </w:pPr>
+      <w:r>
         <w:t xml:space="preserve">Not applicable.</w:t>
       </w:r>
     </w:p>
-    <w:bookmarkEnd w:id="73"/>
-    <w:bookmarkStart w:id="74" w:name="competing-interests."/>
+    <w:bookmarkEnd w:id="74"/>
+    <w:bookmarkStart w:id="75" w:name="authors-contributions."/>
     <w:p>
       <w:pPr>
         <w:pStyle w:val="Heading4"/>
       </w:pPr>
       <w:r>
-        <w:t xml:space="preserve">Competing interests.</w:t>
+        <w:t xml:space="preserve">Authors’ contributions.</w:t>
       </w:r>
     </w:p>
     <w:p>
@@ -10703,17 +10679,29 @@
         <w:pStyle w:val="FirstParagraph"/>
       </w:pPr>
       <w:r>
-        <w:t xml:space="preserve">The authors declare no competing interests.</w:t>
-      </w:r>
-    </w:p>
-    <w:bookmarkEnd w:id="74"/>
-    <w:bookmarkStart w:id="75" w:name="funding."/>
+        <w:t xml:space="preserve">All authors contributed equally to this work. They jointly conceived the study,</w:t>
+      </w:r>
+      <w:r>
+        <w:t xml:space="preserve"> </w:t>
+      </w:r>
+      <w:r>
+        <w:t xml:space="preserve">designed the benchmark and evaluation protocol, developed and implemented the</w:t>
+      </w:r>
+      <w:r>
+        <w:t xml:space="preserve"> </w:t>
+      </w:r>
+      <w:r>
+        <w:t xml:space="preserve">method, analysed the results, and wrote and approved the manuscript.</w:t>
+      </w:r>
+    </w:p>
+    <w:bookmarkEnd w:id="75"/>
+    <w:bookmarkStart w:id="102" w:name="acknowledgements."/>
     <w:p>
       <w:pPr>
         <w:pStyle w:val="Heading4"/>
       </w:pPr>
       <w:r>
-        <w:t xml:space="preserve">Funding.</w:t>
+        <w:t xml:space="preserve">Acknowledgements.</w:t>
       </w:r>
     </w:p>
     <w:p>
@@ -10724,56 +10712,8 @@
         <w:t xml:space="preserve">Not applicable.</w:t>
       </w:r>
     </w:p>
-    <w:bookmarkEnd w:id="75"/>
-    <w:bookmarkStart w:id="76" w:name="authors-contributions."/>
-    <w:p>
-      <w:pPr>
-        <w:pStyle w:val="Heading4"/>
-      </w:pPr>
-      <w:r>
-        <w:t xml:space="preserve">Authors’ contributions.</w:t>
-      </w:r>
-    </w:p>
-    <w:p>
-      <w:pPr>
-        <w:pStyle w:val="FirstParagraph"/>
-      </w:pPr>
-      <w:r>
-        <w:t xml:space="preserve">All authors contributed equally to this work. They jointly conceived the study,</w:t>
-      </w:r>
-      <w:r>
-        <w:t xml:space="preserve"> </w:t>
-      </w:r>
-      <w:r>
-        <w:t xml:space="preserve">designed the benchmark and evaluation protocol, developed and implemented the</w:t>
-      </w:r>
-      <w:r>
-        <w:t xml:space="preserve"> </w:t>
-      </w:r>
-      <w:r>
-        <w:t xml:space="preserve">method, analysed the results, and wrote and approved the manuscript.</w:t>
-      </w:r>
-    </w:p>
-    <w:bookmarkEnd w:id="76"/>
-    <w:bookmarkStart w:id="103" w:name="acknowledgements."/>
-    <w:p>
-      <w:pPr>
-        <w:pStyle w:val="Heading4"/>
-      </w:pPr>
-      <w:r>
-        <w:t xml:space="preserve">Acknowledgements.</w:t>
-      </w:r>
-    </w:p>
-    <w:p>
-      <w:pPr>
-        <w:pStyle w:val="FirstParagraph"/>
-      </w:pPr>
-      <w:r>
-        <w:t xml:space="preserve">Not applicable.</w:t>
-      </w:r>
-    </w:p>
-    <w:bookmarkStart w:id="102" w:name="refs"/>
-    <w:bookmarkStart w:id="77" w:name="ref-bemis1996properties"/>
+    <w:bookmarkStart w:id="101" w:name="refs"/>
+    <w:bookmarkStart w:id="76" w:name="ref-bemis1996properties"/>
     <w:p>
       <w:pPr>
         <w:pStyle w:val="Bibliography"/>
@@ -10804,8 +10744,8 @@
         <w:t xml:space="preserve">39 (15): 2887–93.</w:t>
       </w:r>
     </w:p>
-    <w:bookmarkEnd w:id="77"/>
-    <w:bookmarkStart w:id="78" w:name="ref-brown2019guacamol"/>
+    <w:bookmarkEnd w:id="76"/>
+    <w:bookmarkStart w:id="77" w:name="ref-brown2019guacamol"/>
     <w:p>
       <w:pPr>
         <w:pStyle w:val="Bibliography"/>
@@ -10842,8 +10782,8 @@
         <w:t xml:space="preserve">59 (3): 1096–108.</w:t>
       </w:r>
     </w:p>
-    <w:bookmarkEnd w:id="78"/>
-    <w:bookmarkStart w:id="79" w:name="ref-considine2025syntax"/>
+    <w:bookmarkEnd w:id="77"/>
+    <w:bookmarkStart w:id="78" w:name="ref-considine2025syntax"/>
     <w:p>
       <w:pPr>
         <w:pStyle w:val="Bibliography"/>
@@ -10871,8 +10811,8 @@
         <w:t xml:space="preserve">.</w:t>
       </w:r>
     </w:p>
-    <w:bookmarkEnd w:id="79"/>
-    <w:bookmarkStart w:id="80" w:name="ref-dai2018syntax"/>
+    <w:bookmarkEnd w:id="78"/>
+    <w:bookmarkStart w:id="79" w:name="ref-dai2018syntax"/>
     <w:p>
       <w:pPr>
         <w:pStyle w:val="Bibliography"/>
@@ -10900,8 +10840,8 @@
         <w:t xml:space="preserve">.</w:t>
       </w:r>
     </w:p>
-    <w:bookmarkEnd w:id="80"/>
-    <w:bookmarkStart w:id="81" w:name="ref-garcez2023neurosymbolic"/>
+    <w:bookmarkEnd w:id="79"/>
+    <w:bookmarkStart w:id="80" w:name="ref-garcez2023neurosymbolic"/>
     <w:p>
       <w:pPr>
         <w:pStyle w:val="Bibliography"/>
@@ -10941,8 +10881,8 @@
         <w:t xml:space="preserve">56: 12387–406.</w:t>
       </w:r>
     </w:p>
-    <w:bookmarkEnd w:id="81"/>
-    <w:bookmarkStart w:id="82" w:name="ref-geng2023grammar"/>
+    <w:bookmarkEnd w:id="80"/>
+    <w:bookmarkStart w:id="81" w:name="ref-geng2023grammar"/>
     <w:p>
       <w:pPr>
         <w:pStyle w:val="Bibliography"/>
@@ -10982,8 +10922,8 @@
         <w:t xml:space="preserve">.</w:t>
       </w:r>
     </w:p>
-    <w:bookmarkEnd w:id="82"/>
-    <w:bookmarkStart w:id="83" w:name="ref-gou2024critic"/>
+    <w:bookmarkEnd w:id="81"/>
+    <w:bookmarkStart w:id="82" w:name="ref-gou2024critic"/>
     <w:p>
       <w:pPr>
         <w:pStyle w:val="Bibliography"/>
@@ -11020,8 +10960,8 @@
         <w:t xml:space="preserve">.</w:t>
       </w:r>
     </w:p>
-    <w:bookmarkEnd w:id="83"/>
-    <w:bookmarkStart w:id="84" w:name="ref-krenn2022selfies"/>
+    <w:bookmarkEnd w:id="82"/>
+    <w:bookmarkStart w:id="83" w:name="ref-krenn2022selfies"/>
     <w:p>
       <w:pPr>
         <w:pStyle w:val="Bibliography"/>
@@ -11064,8 +11004,8 @@
         <w:t xml:space="preserve">3 (10): 100588.</w:t>
       </w:r>
     </w:p>
-    <w:bookmarkEnd w:id="84"/>
-    <w:bookmarkStart w:id="85" w:name="ref-krenn2020selfies"/>
+    <w:bookmarkEnd w:id="83"/>
+    <w:bookmarkStart w:id="84" w:name="ref-krenn2020selfies"/>
     <w:p>
       <w:pPr>
         <w:pStyle w:val="Bibliography"/>
@@ -11102,8 +11042,8 @@
         <w:t xml:space="preserve">1 (4): 045024.</w:t>
       </w:r>
     </w:p>
-    <w:bookmarkEnd w:id="85"/>
-    <w:bookmarkStart w:id="86" w:name="ref-kusner2017grammar"/>
+    <w:bookmarkEnd w:id="84"/>
+    <w:bookmarkStart w:id="85" w:name="ref-kusner2017grammar"/>
     <w:p>
       <w:pPr>
         <w:pStyle w:val="Bibliography"/>
@@ -11131,8 +11071,8 @@
         <w:t xml:space="preserve">, 1945–54.</w:t>
       </w:r>
     </w:p>
-    <w:bookmarkEnd w:id="86"/>
-    <w:bookmarkStart w:id="88" w:name="ref-rdkit"/>
+    <w:bookmarkEnd w:id="85"/>
+    <w:bookmarkStart w:id="87" w:name="ref-rdkit"/>
     <w:p>
       <w:pPr>
         <w:pStyle w:val="Bibliography"/>
@@ -11166,7 +11106,7 @@
       <w:r>
         <w:t xml:space="preserve"> </w:t>
       </w:r>
-      <w:hyperlink r:id="rId87">
+      <w:hyperlink r:id="rId86">
         <w:r>
           <w:rPr>
             <w:rStyle w:val="Hyperlink"/>
@@ -11178,8 +11118,8 @@
         <w:t xml:space="preserve">.</w:t>
       </w:r>
     </w:p>
-    <w:bookmarkEnd w:id="88"/>
-    <w:bookmarkStart w:id="89" w:name="ref-madaan2023selfrefine"/>
+    <w:bookmarkEnd w:id="87"/>
+    <w:bookmarkStart w:id="88" w:name="ref-madaan2023selfrefine"/>
     <w:p>
       <w:pPr>
         <w:pStyle w:val="Bibliography"/>
@@ -11216,8 +11156,8 @@
         <w:t xml:space="preserve">.</w:t>
       </w:r>
     </w:p>
-    <w:bookmarkEnd w:id="89"/>
-    <w:bookmarkStart w:id="90" w:name="ref-polykovskiy2020moses"/>
+    <w:bookmarkEnd w:id="88"/>
+    <w:bookmarkStart w:id="89" w:name="ref-polykovskiy2020moses"/>
     <w:p>
       <w:pPr>
         <w:pStyle w:val="Bibliography"/>
@@ -11257,8 +11197,8 @@
         <w:t xml:space="preserve">11: 565644.</w:t>
       </w:r>
     </w:p>
-    <w:bookmarkEnd w:id="90"/>
-    <w:bookmarkStart w:id="91" w:name="ref-qwen2025"/>
+    <w:bookmarkEnd w:id="89"/>
+    <w:bookmarkStart w:id="90" w:name="ref-qwen2025"/>
     <w:p>
       <w:pPr>
         <w:pStyle w:val="Bibliography"/>
@@ -11294,8 +11234,8 @@
         <w:t xml:space="preserve">. Alibaba Group.</w:t>
       </w:r>
     </w:p>
-    <w:bookmarkEnd w:id="91"/>
-    <w:bookmarkStart w:id="92" w:name="ref-rogers2010extended"/>
+    <w:bookmarkEnd w:id="90"/>
+    <w:bookmarkStart w:id="91" w:name="ref-rogers2010extended"/>
     <w:p>
       <w:pPr>
         <w:pStyle w:val="Bibliography"/>
@@ -11326,8 +11266,8 @@
         <w:t xml:space="preserve">50 (5): 742–54.</w:t>
       </w:r>
     </w:p>
-    <w:bookmarkEnd w:id="92"/>
-    <w:bookmarkStart w:id="94" w:name="ref-schoenmaker2023uncorrupt"/>
+    <w:bookmarkEnd w:id="91"/>
+    <w:bookmarkStart w:id="93" w:name="ref-schoenmaker2023uncorrupt"/>
     <w:p>
       <w:pPr>
         <w:pStyle w:val="Bibliography"/>
@@ -11372,7 +11312,7 @@
       <w:r>
         <w:t xml:space="preserve"> </w:t>
       </w:r>
-      <w:hyperlink r:id="rId93">
+      <w:hyperlink r:id="rId92">
         <w:r>
           <w:rPr>
             <w:rStyle w:val="Hyperlink"/>
@@ -11384,8 +11324,8 @@
         <w:t xml:space="preserve">.</w:t>
       </w:r>
     </w:p>
-    <w:bookmarkEnd w:id="94"/>
-    <w:bookmarkStart w:id="96" w:name="ref-skinnider2024invalid"/>
+    <w:bookmarkEnd w:id="93"/>
+    <w:bookmarkStart w:id="95" w:name="ref-skinnider2024invalid"/>
     <w:p>
       <w:pPr>
         <w:pStyle w:val="Bibliography"/>
@@ -11430,7 +11370,7 @@
       <w:r>
         <w:t xml:space="preserve"> </w:t>
       </w:r>
-      <w:hyperlink r:id="rId95">
+      <w:hyperlink r:id="rId94">
         <w:r>
           <w:rPr>
             <w:rStyle w:val="Hyperlink"/>
@@ -11442,8 +11382,8 @@
         <w:t xml:space="preserve">.</w:t>
       </w:r>
     </w:p>
-    <w:bookmarkEnd w:id="96"/>
-    <w:bookmarkStart w:id="98" w:name="ref-smiself2025"/>
+    <w:bookmarkEnd w:id="95"/>
+    <w:bookmarkStart w:id="97" w:name="ref-smiself2025"/>
     <w:p>
       <w:pPr>
         <w:pStyle w:val="Bibliography"/>
@@ -11485,7 +11425,7 @@
       <w:r>
         <w:t xml:space="preserve"> </w:t>
       </w:r>
-      <w:hyperlink r:id="rId97">
+      <w:hyperlink r:id="rId96">
         <w:r>
           <w:rPr>
             <w:rStyle w:val="Hyperlink"/>
@@ -11497,8 +11437,8 @@
         <w:t xml:space="preserve">.</w:t>
       </w:r>
     </w:p>
-    <w:bookmarkEnd w:id="98"/>
-    <w:bookmarkStart w:id="99" w:name="ref-weininger1988smiles"/>
+    <w:bookmarkEnd w:id="97"/>
+    <w:bookmarkStart w:id="98" w:name="ref-weininger1988smiles"/>
     <w:p>
       <w:pPr>
         <w:pStyle w:val="Bibliography"/>
@@ -11535,8 +11475,8 @@
         <w:t xml:space="preserve">28 (1): 31–36.</w:t>
       </w:r>
     </w:p>
-    <w:bookmarkEnd w:id="99"/>
-    <w:bookmarkStart w:id="100" w:name="ref-welleck2023generating"/>
+    <w:bookmarkEnd w:id="98"/>
+    <w:bookmarkStart w:id="99" w:name="ref-welleck2023generating"/>
     <w:p>
       <w:pPr>
         <w:pStyle w:val="Bibliography"/>
@@ -11567,8 +11507,8 @@
         <w:t xml:space="preserve">.</w:t>
       </w:r>
     </w:p>
-    <w:bookmarkEnd w:id="100"/>
-    <w:bookmarkStart w:id="101" w:name="ref-amrec"/>
+    <w:bookmarkEnd w:id="99"/>
+    <w:bookmarkStart w:id="100" w:name="ref-amrec"/>
     <w:p>
       <w:pPr>
         <w:pStyle w:val="Bibliography"/>
@@ -11596,10 +11536,10 @@
         <w:t xml:space="preserve">.</w:t>
       </w:r>
     </w:p>
+    <w:bookmarkEnd w:id="100"/>
     <w:bookmarkEnd w:id="101"/>
     <w:bookmarkEnd w:id="102"/>
     <w:bookmarkEnd w:id="103"/>
-    <w:bookmarkEnd w:id="104"/>
     <w:sectPr>
       <w:footnotePr>
         <w:numRestart w:val="eachSect"/>
@@ -11710,91 +11650,6 @@
       </w:pPr>
     </w:lvl>
   </w:abstractNum>
-  <w:abstractNum w:abstractNumId="99201">
-    <w:nsid w:val="00A99201"/>
-    <w:multiLevelType w:val="multilevel"/>
-    <w:lvl w:ilvl="0">
-      <w:start w:val="1"/>
-      <w:numFmt w:val="decimal"/>
-      <w:lvlText w:val="%1."/>
-      <w:lvlJc w:val="left"/>
-      <w:pPr>
-        <w:ind w:left="720" w:hanging="360"/>
-      </w:pPr>
-    </w:lvl>
-    <w:lvl w:ilvl="1">
-      <w:start w:val="1"/>
-      <w:numFmt w:val="lowerLetter"/>
-      <w:lvlText w:val="%2."/>
-      <w:lvlJc w:val="left"/>
-      <w:pPr>
-        <w:ind w:left="1440" w:hanging="360"/>
-      </w:pPr>
-    </w:lvl>
-    <w:lvl w:ilvl="2">
-      <w:start w:val="1"/>
-      <w:numFmt w:val="lowerRoman"/>
-      <w:lvlText w:val="%3."/>
-      <w:lvlJc w:val="left"/>
-      <w:pPr>
-        <w:ind w:left="2160" w:hanging="360"/>
-      </w:pPr>
-    </w:lvl>
-    <w:lvl w:ilvl="3">
-      <w:start w:val="1"/>
-      <w:numFmt w:val="decimal"/>
-      <w:lvlText w:val="%4."/>
-      <w:lvlJc w:val="left"/>
-      <w:pPr>
-        <w:ind w:left="2880" w:hanging="360"/>
-      </w:pPr>
-    </w:lvl>
-    <w:lvl w:ilvl="4">
-      <w:start w:val="1"/>
-      <w:numFmt w:val="lowerLetter"/>
-      <w:lvlText w:val="%5."/>
-      <w:lvlJc w:val="left"/>
-      <w:pPr>
-        <w:ind w:left="3600" w:hanging="360"/>
-      </w:pPr>
-    </w:lvl>
-    <w:lvl w:ilvl="5">
-      <w:start w:val="1"/>
-      <w:numFmt w:val="lowerRoman"/>
-      <w:lvlText w:val="%6."/>
-      <w:lvlJc w:val="left"/>
-      <w:pPr>
-        <w:ind w:left="4320" w:hanging="360"/>
-      </w:pPr>
-    </w:lvl>
-    <w:lvl w:ilvl="6">
-      <w:start w:val="1"/>
-      <w:numFmt w:val="decimal"/>
-      <w:lvlText w:val="%7."/>
-      <w:lvlJc w:val="left"/>
-      <w:pPr>
-        <w:ind w:left="5040" w:hanging="360"/>
-      </w:pPr>
-    </w:lvl>
-    <w:lvl w:ilvl="7">
-      <w:start w:val="1"/>
-      <w:numFmt w:val="lowerLetter"/>
-      <w:lvlText w:val="%8."/>
-      <w:lvlJc w:val="left"/>
-      <w:pPr>
-        <w:ind w:left="5760" w:hanging="360"/>
-      </w:pPr>
-    </w:lvl>
-    <w:lvl w:ilvl="8">
-      <w:start w:val="1"/>
-      <w:numFmt w:val="lowerRoman"/>
-      <w:lvlText w:val="%9."/>
-      <w:lvlJc w:val="left"/>
-      <w:pPr>
-        <w:ind w:left="6480" w:hanging="360"/>
-      </w:pPr>
-    </w:lvl>
-  </w:abstractNum>
   <w:abstractNum w:abstractNumId="991">
     <w:nsid w:val="0000A991"/>
     <w:multiLevelType w:val="multilevel"/>
@@ -11902,36 +11757,6 @@
     <w:abstractNumId w:val="990"/>
   </w:num>
   <w:num w:numId="1001">
-    <w:abstractNumId w:val="99201"/>
-    <w:lvlOverride w:ilvl="0">
-      <w:startOverride w:val="1"/>
-    </w:lvlOverride>
-    <w:lvlOverride w:ilvl="1">
-      <w:startOverride w:val="1"/>
-    </w:lvlOverride>
-    <w:lvlOverride w:ilvl="2">
-      <w:startOverride w:val="1"/>
-    </w:lvlOverride>
-    <w:lvlOverride w:ilvl="3">
-      <w:startOverride w:val="1"/>
-    </w:lvlOverride>
-    <w:lvlOverride w:ilvl="4">
-      <w:startOverride w:val="1"/>
-    </w:lvlOverride>
-    <w:lvlOverride w:ilvl="5">
-      <w:startOverride w:val="1"/>
-    </w:lvlOverride>
-    <w:lvlOverride w:ilvl="6">
-      <w:startOverride w:val="1"/>
-    </w:lvlOverride>
-    <w:lvlOverride w:ilvl="7">
-      <w:startOverride w:val="1"/>
-    </w:lvlOverride>
-    <w:lvlOverride w:ilvl="8">
-      <w:startOverride w:val="1"/>
-    </w:lvlOverride>
-  </w:num>
-  <w:num w:numId="1002">
     <w:abstractNumId w:val="991"/>
   </w:num>
 </w:numbering>

</xml_diff>

<commit_message>
Move Figure 3 legend outside the axes; it was covering the one category whose coverage is below 1
</commit_message>
<xml_diff>
--- a/paper_vnr/main.docx
+++ b/paper_vnr/main.docx
@@ -5025,7 +5025,7 @@
       <w:r>
         <w:drawing>
           <wp:inline>
-            <wp:extent cx="4501661" cy="2299761"/>
+            <wp:extent cx="4679036" cy="2516893"/>
             <wp:effectExtent b="0" l="0" r="0" t="0"/>
             <wp:docPr descr="" title="" id="31" name="Picture"/>
             <a:graphic>
@@ -5046,7 +5046,7 @@
                   <pic:spPr bwMode="auto">
                     <a:xfrm>
                       <a:off x="0" y="0"/>
-                      <a:ext cx="4501661" cy="2299761"/>
+                      <a:ext cx="4679036" cy="2516893"/>
                     </a:xfrm>
                     <a:prstGeom prst="rect">
                       <a:avLst/>

</xml_diff>

<commit_message>
Cite ChemFixer and SCROP; scope real-failure claims to what the data shows
- Related work: add ChemFixer (IEEE JBHI 2026), which trains on real VAE
  reconstruction failures, and SCROP (JCIM 2020), the earliest learned
  SMILES syntax corrector.
- Experiments 6-7 and Limitations: a non-empty one-edit candidate set is an
  upper bound on recovery, not evidence that a failure is a single edit
  (276 of 600 two-edit strings have non-empty sets; only 3 contain the
  intended molecule).
- Ground truth is absent for freely sampled failures, not for all real ones.
- References: Crossref-verified DOIs for every journal article, ChemFixer
  volume/issue/pages, sentence-initial capitals, Qwen and EMNLP entries.
- Bibliography set in small type; the article is back to 18 pages.
- Verifier: 166 checks, including guards on the new figures and phrasing.
</commit_message>
<xml_diff>
--- a/paper_vnr/main.docx
+++ b/paper_vnr/main.docx
@@ -1434,7 +1434,31 @@
         <w:pStyle w:val="FirstParagraph"/>
       </w:pPr>
       <w:r>
-        <w:t xml:space="preserve">Closest to our setting are systems that repair broken SMILES directly. Sequence</w:t>
+        <w:t xml:space="preserve">Closest to our setting are systems that repair broken SMILES directly. Learned</w:t>
+      </w:r>
+      <w:r>
+        <w:t xml:space="preserve"> </w:t>
+      </w:r>
+      <w:r>
+        <w:t xml:space="preserve">correction of SMILES syntax dates at least to SCROP, which couples a</w:t>
+      </w:r>
+      <w:r>
+        <w:t xml:space="preserve"> </w:t>
+      </w:r>
+      <w:r>
+        <w:t xml:space="preserve">retrosynthesis transformer with a neural syntax corrector </w:t>
+      </w:r>
+      <w:r>
+        <w:t xml:space="preserve">(Zheng et al. 2020)</w:t>
+      </w:r>
+      <w:r>
+        <w:t xml:space="preserve">.</w:t>
+      </w:r>
+      <w:r>
+        <w:t xml:space="preserve"> </w:t>
+      </w:r>
+      <w:r>
+        <w:t xml:space="preserve">Sequence</w:t>
       </w:r>
       <w:r>
         <w:t xml:space="preserve"> </w:t>
@@ -1488,7 +1512,58 @@
         <w:t xml:space="preserve"> </w:t>
       </w:r>
       <w:r>
-        <w:t xml:space="preserve">intended molecule. Neither work is validity-only. What neither does, and what this</w:t>
+        <w:t xml:space="preserve">intended molecule. ChemFixer </w:t>
+      </w:r>
+      <w:r>
+        <w:t xml:space="preserve">(Park et al. 2026)</w:t>
+      </w:r>
+      <w:r>
+        <w:t xml:space="preserve"> </w:t>
+      </w:r>
+      <w:r>
+        <w:t xml:space="preserve">fine-tunes a</w:t>
+      </w:r>
+      <w:r>
+        <w:t xml:space="preserve"> </w:t>
+      </w:r>
+      <w:r>
+        <w:t xml:space="preserve">masked-pretrained transformer on real rather than synthetic failures: the invalid strings a transformer</w:t>
+      </w:r>
+      <w:r>
+        <w:t xml:space="preserve"> </w:t>
+      </w:r>
+      <w:r>
+        <w:t xml:space="preserve">VAE emits while learning to reconstruct molecules, each paired with its</w:t>
+      </w:r>
+      <w:r>
+        <w:t xml:space="preserve"> </w:t>
+      </w:r>
+      <w:r>
+        <w:t xml:space="preserve">reconstruction target. It reports validity and correction rate with</w:t>
+      </w:r>
+      <w:r>
+        <w:t xml:space="preserve"> </w:t>
+      </w:r>
+      <w:r>
+        <w:t xml:space="preserve">distribution-level measures (FCD, SNN), and notes that corrected molecules need</w:t>
+      </w:r>
+      <w:r>
+        <w:t xml:space="preserve"> </w:t>
+      </w:r>
+      <w:r>
+        <w:t xml:space="preserve">not match the original, examining mismatches through their Bemis–Murcko</w:t>
+      </w:r>
+      <w:r>
+        <w:t xml:space="preserve"> </w:t>
+      </w:r>
+      <w:r>
+        <w:t xml:space="preserve">scaffolds. None of these works is</w:t>
+      </w:r>
+      <w:r>
+        <w:t xml:space="preserve"> </w:t>
+      </w:r>
+      <w:r>
+        <w:t xml:space="preserve">validity-only. What none of them does, and what this</w:t>
       </w:r>
       <w:r>
         <w:t xml:space="preserve"> </w:t>
@@ -2596,13 +2671,13 @@
         <w:pStyle w:val="FirstParagraph"/>
       </w:pPr>
       <w:r>
-        <w:t xml:space="preserve">Measuring recovery requires ground truth, which real generative-model failures</w:t>
-      </w:r>
-      <w:r>
-        <w:t xml:space="preserve"> </w:t>
-      </w:r>
-      <w:r>
-        <w:t xml:space="preserve">do not come with. We therefore construct corruptions of known molecules, and</w:t>
+        <w:t xml:space="preserve">Measuring recovery requires ground truth, which failures from a freely sampling</w:t>
+      </w:r>
+      <w:r>
+        <w:t xml:space="preserve"> </w:t>
+      </w:r>
+      <w:r>
+        <w:t xml:space="preserve">generative model do not come with. We therefore construct corruptions of known molecules, and</w:t>
       </w:r>
       <w:r>
         <w:t xml:space="preserve"> </w:t>
@@ -2689,13 +2764,13 @@
         <w:t xml:space="preserve"> </w:t>
       </w:r>
       <w:r>
-        <w:t xml:space="preserve">operators, so that the synthetic corruptions mirror the errors a real model</w:t>
-      </w:r>
-      <w:r>
-        <w:t xml:space="preserve"> </w:t>
-      </w:r>
-      <w:r>
-        <w:t xml:space="preserve">makes. The mix actually realised in the benchmark is close but not identical</w:t>
+        <w:t xml:space="preserve">operators, so that the synthetic corruptions follow the mix of error types a real</w:t>
+      </w:r>
+      <w:r>
+        <w:t xml:space="preserve"> </w:t>
+      </w:r>
+      <w:r>
+        <w:t xml:space="preserve">model makes. The mix actually realised in the benchmark is close but not identical</w:t>
       </w:r>
       <w:r>
         <w:t xml:space="preserve"> </w:t>
@@ -6239,25 +6314,42 @@
         <w:t xml:space="preserve"> </w:t>
       </w:r>
       <w:r>
-        <w:t xml:space="preserve">of them (median 72 candidates). The one-edit</w:t>
-      </w:r>
-      <w:r>
-        <w:t xml:space="preserve"> </w:t>
-      </w:r>
-      <w:r>
-        <w:t xml:space="preserve">candidate space is therefore operationally useful for most real generator</w:t>
-      </w:r>
-      <w:r>
-        <w:t xml:space="preserve"> </w:t>
-      </w:r>
-      <w:r>
-        <w:t xml:space="preserve">failures, and is not an artefact of how we built the benchmark, although</w:t>
-      </w:r>
-      <w:r>
-        <w:t xml:space="preserve"> </w:t>
-      </w:r>
-      <w:r>
-        <w:t xml:space="preserve">intended recovery cannot be established here without ground truth. For the remaining 8.5% no valid molecule lies within one</w:t>
+        <w:t xml:space="preserve">of them (median 72 candidates). A non-empty</w:t>
+      </w:r>
+      <w:r>
+        <w:t xml:space="preserve"> </w:t>
+      </w:r>
+      <w:r>
+        <w:t xml:space="preserve">set is necessary for recovery but not sufficient, since two-error strings often</w:t>
+      </w:r>
+      <w:r>
+        <w:t xml:space="preserve"> </w:t>
+      </w:r>
+      <w:r>
+        <w:t xml:space="preserve">admit a valid one-edit repair that is not the intended molecule</w:t>
+      </w:r>
+      <w:r>
+        <w:t xml:space="preserve"> </w:t>
+      </w:r>
+      <w:r>
+        <w:t xml:space="preserve">(Section </w:t>
+      </w:r>
+      <w:hyperlink w:anchor="sec:exp7">
+        <w:r>
+          <w:rPr>
+            <w:rStyle w:val="Hyperlink"/>
+          </w:rPr>
+          <w:t xml:space="preserve">6.7</w:t>
+        </w:r>
+      </w:hyperlink>
+      <w:r>
+        <w:t xml:space="preserve">); 91.5% is therefore an upper bound on the share of these</w:t>
+      </w:r>
+      <w:r>
+        <w:t xml:space="preserve"> </w:t>
+      </w:r>
+      <w:r>
+        <w:t xml:space="preserve">failures the method can recover, not an estimate of it. For the remaining 8.5% no valid molecule lies within one</w:t>
       </w:r>
       <w:r>
         <w:t xml:space="preserve"> </w:t>
@@ -6281,7 +6373,7 @@
         <w:t xml:space="preserve"> </w:t>
       </w:r>
       <w:r>
-        <w:t xml:space="preserve">these are real failures for which no ground truth exists; only that a one-edit</w:t>
+        <w:t xml:space="preserve">these are sampled failures for which no ground truth exists; only that a one-edit</w:t>
       </w:r>
       <w:r>
         <w:t xml:space="preserve"> </w:t>
@@ -6305,19 +6397,19 @@
         <w:pStyle w:val="FirstParagraph"/>
       </w:pPr>
       <w:r>
-        <w:t xml:space="preserve">Exact recovery cannot be measured on real failures, since nobody knows which</w:t>
-      </w:r>
-      <w:r>
-        <w:t xml:space="preserve"> </w:t>
-      </w:r>
-      <w:r>
-        <w:t xml:space="preserve">molecule the model intended, and that is precisely why the controlled benchmark</w:t>
-      </w:r>
-      <w:r>
-        <w:t xml:space="preserve"> </w:t>
-      </w:r>
-      <w:r>
-        <w:t xml:space="preserve">exists. What can be measured is how much of the string a repair destroys. A</w:t>
+        <w:t xml:space="preserve">Exact recovery cannot be measured on these failures: a generator sampling</w:t>
+      </w:r>
+      <w:r>
+        <w:t xml:space="preserve"> </w:t>
+      </w:r>
+      <w:r>
+        <w:t xml:space="preserve">freely records no intended molecule, and that is precisely why the controlled</w:t>
+      </w:r>
+      <w:r>
+        <w:t xml:space="preserve"> </w:t>
+      </w:r>
+      <w:r>
+        <w:t xml:space="preserve">benchmark exists. What can be measured is how much of the string a repair destroys. A</w:t>
       </w:r>
       <w:r>
         <w:t xml:space="preserve"> </w:t>
@@ -6751,13 +6843,19 @@
         <w:pStyle w:val="BodyText"/>
       </w:pPr>
       <w:r>
-        <w:t xml:space="preserve">The method transfers to the distribution a real model produces, losing under two</w:t>
-      </w:r>
-      <w:r>
-        <w:t xml:space="preserve"> </w:t>
-      </w:r>
-      <w:r>
-        <w:t xml:space="preserve">points. Note also that the ranker here is the very model that generated the</w:t>
+        <w:t xml:space="preserve">Recovery carries over to the molecules a real model produces, losing under two</w:t>
+      </w:r>
+      <w:r>
+        <w:t xml:space="preserve"> </w:t>
+      </w:r>
+      <w:r>
+        <w:t xml:space="preserve">points. The errors are still our operators, so this varies the molecules rather</w:t>
+      </w:r>
+      <w:r>
+        <w:t xml:space="preserve"> </w:t>
+      </w:r>
+      <w:r>
+        <w:t xml:space="preserve">than the error process. Note also that the ranker here is the very model that generated the</w:t>
       </w:r>
       <w:r>
         <w:t xml:space="preserve"> </w:t>
@@ -7179,13 +7277,36 @@
         </m:r>
       </m:oMath>
       <w:r>
-        <w:t xml:space="preserve">, which fixes the method’s scope boundary and makes the</w:t>
-      </w:r>
-      <w:r>
-        <w:t xml:space="preserve"> </w:t>
-      </w:r>
-      <w:r>
-        <w:t xml:space="preserve">measurement in Section </w:t>
+        <w:t xml:space="preserve">, which fixes the method’s scope boundary. The</w:t>
+      </w:r>
+      <w:r>
+        <w:t xml:space="preserve"> </w:t>
+      </w:r>
+      <m:oMath>
+        <m:r>
+          <m:t>k</m:t>
+        </m:r>
+        <m:r>
+          <m:rPr>
+            <m:sty m:val="p"/>
+          </m:rPr>
+          <m:t>=</m:t>
+        </m:r>
+        <m:r>
+          <m:t>2</m:t>
+        </m:r>
+      </m:oMath>
+      <w:r>
+        <w:t xml:space="preserve"> </w:t>
+      </w:r>
+      <w:r>
+        <w:t xml:space="preserve">row</w:t>
+      </w:r>
+      <w:r>
+        <w:t xml:space="preserve"> </w:t>
+      </w:r>
+      <w:r>
+        <w:t xml:space="preserve">also qualifies Section </w:t>
       </w:r>
       <w:hyperlink w:anchor="sec:exp6">
         <w:r>
@@ -7196,26 +7317,43 @@
         </w:r>
       </w:hyperlink>
       <w:r>
-        <w:t xml:space="preserve"> </w:t>
-      </w:r>
-      <w:r>
-        <w:t xml:space="preserve">load-bearing: 91.5% of</w:t>
-      </w:r>
-      <w:r>
-        <w:t xml:space="preserve"> </w:t>
-      </w:r>
-      <w:r>
-        <w:rPr>
-          <w:i/>
-          <w:iCs/>
-        </w:rPr>
-        <w:t xml:space="preserve">real</w:t>
-      </w:r>
-      <w:r>
-        <w:t xml:space="preserve"> </w:t>
-      </w:r>
-      <w:r>
-        <w:t xml:space="preserve">generator failures fall on the useful side of it. On the</w:t>
+        <w:t xml:space="preserve">: 276 of those 600 strings still have a</w:t>
+      </w:r>
+      <w:r>
+        <w:t xml:space="preserve"> </w:t>
+      </w:r>
+      <w:r>
+        <w:t xml:space="preserve">non-empty candidate set, yet only 3 of those sets contain the intended molecule,</w:t>
+      </w:r>
+      <w:r>
+        <w:t xml:space="preserve"> </w:t>
+      </w:r>
+      <w:r>
+        <w:t xml:space="preserve">so a non-empty set does not show that a real failure is a single edit. Our data</w:t>
+      </w:r>
+      <w:r>
+        <w:t xml:space="preserve"> </w:t>
+      </w:r>
+      <w:r>
+        <w:t xml:space="preserve">cannot settle how many real failures fall inside the boundary;</w:t>
+      </w:r>
+      <w:r>
+        <w:t xml:space="preserve"> </w:t>
+      </w:r>
+      <w:r>
+        <w:t xml:space="preserve">Park et al. (2026)</w:t>
+      </w:r>
+      <w:r>
+        <w:t xml:space="preserve"> </w:t>
+      </w:r>
+      <w:r>
+        <w:t xml:space="preserve">describe one to five erroneous tokens per sequence as</w:t>
+      </w:r>
+      <w:r>
+        <w:t xml:space="preserve"> </w:t>
+      </w:r>
+      <w:r>
+        <w:t xml:space="preserve">typical in their MOSES setting, which suggests the multi-edit case is not marginal. On the</w:t>
       </w:r>
       <w:r>
         <w:t xml:space="preserve"> </w:t>
@@ -10264,7 +10402,25 @@
         <w:t xml:space="preserve"> </w:t>
       </w:r>
       <w:r>
-        <w:t xml:space="preserve">enumerator. Section </w:t>
+        <w:t xml:space="preserve">enumerator. A non-empty set bounds recoverability without establishing it,</w:t>
+      </w:r>
+      <w:r>
+        <w:t xml:space="preserve"> </w:t>
+      </w:r>
+      <w:r>
+        <w:t xml:space="preserve">and free sampling records no target to measure it against; an autoencoder’s</w:t>
+      </w:r>
+      <w:r>
+        <w:t xml:space="preserve"> </w:t>
+      </w:r>
+      <w:r>
+        <w:t xml:space="preserve">reconstruction failures do </w:t>
+      </w:r>
+      <w:r>
+        <w:t xml:space="preserve">(Park et al. 2026)</w:t>
+      </w:r>
+      <w:r>
+        <w:t xml:space="preserve">, and would close this gap. Section </w:t>
       </w:r>
       <w:hyperlink w:anchor="sec:exp7">
         <w:r>
@@ -10486,7 +10642,7 @@
       </w:r>
     </w:p>
     <w:bookmarkEnd w:id="68"/>
-    <w:bookmarkStart w:id="103" w:name="declarations"/>
+    <w:bookmarkStart w:id="116" w:name="declarations"/>
     <w:p>
       <w:pPr>
         <w:pStyle w:val="Heading1"/>
@@ -10695,7 +10851,7 @@
       </w:r>
     </w:p>
     <w:bookmarkEnd w:id="75"/>
-    <w:bookmarkStart w:id="102" w:name="acknowledgements."/>
+    <w:bookmarkStart w:id="115" w:name="acknowledgements."/>
     <w:p>
       <w:pPr>
         <w:pStyle w:val="Heading4"/>
@@ -10712,8 +10868,8 @@
         <w:t xml:space="preserve">Not applicable.</w:t>
       </w:r>
     </w:p>
-    <w:bookmarkStart w:id="101" w:name="refs"/>
-    <w:bookmarkStart w:id="76" w:name="ref-bemis1996properties"/>
+    <w:bookmarkStart w:id="114" w:name="refs"/>
+    <w:bookmarkStart w:id="77" w:name="ref-bemis1996properties"/>
     <w:p>
       <w:pPr>
         <w:pStyle w:val="Bibliography"/>
@@ -10725,7 +10881,16 @@
         <w:t xml:space="preserve"> </w:t>
       </w:r>
       <w:r>
-        <w:t xml:space="preserve">“The Properties of Known Drugs. 1. Molecular Frameworks.”</w:t>
+        <w:t xml:space="preserve">“The Properties of Known Drugs. 1.</w:t>
+      </w:r>
+      <w:r>
+        <w:t xml:space="preserve"> </w:t>
+      </w:r>
+      <w:r>
+        <w:t xml:space="preserve">M</w:t>
+      </w:r>
+      <w:r>
+        <w:t xml:space="preserve">olecular Frameworks.”</w:t>
       </w:r>
       <w:r>
         <w:t xml:space="preserve"> </w:t>
@@ -10743,9 +10908,23 @@
       <w:r>
         <w:t xml:space="preserve">39 (15): 2887–93.</w:t>
       </w:r>
-    </w:p>
-    <w:bookmarkEnd w:id="76"/>
-    <w:bookmarkStart w:id="77" w:name="ref-brown2019guacamol"/>
+      <w:r>
+        <w:t xml:space="preserve"> </w:t>
+      </w:r>
+      <w:hyperlink r:id="rId76">
+        <w:r>
+          <w:rPr>
+            <w:rStyle w:val="Hyperlink"/>
+          </w:rPr>
+          <w:t xml:space="preserve">https://doi.org/10.1021/jm9602928</w:t>
+        </w:r>
+      </w:hyperlink>
+      <w:r>
+        <w:t xml:space="preserve">.</w:t>
+      </w:r>
+    </w:p>
+    <w:bookmarkEnd w:id="77"/>
+    <w:bookmarkStart w:id="79" w:name="ref-brown2019guacamol"/>
     <w:p>
       <w:pPr>
         <w:pStyle w:val="Bibliography"/>
@@ -10781,9 +10960,23 @@
       <w:r>
         <w:t xml:space="preserve">59 (3): 1096–108.</w:t>
       </w:r>
-    </w:p>
-    <w:bookmarkEnd w:id="77"/>
-    <w:bookmarkStart w:id="78" w:name="ref-considine2025syntax"/>
+      <w:r>
+        <w:t xml:space="preserve"> </w:t>
+      </w:r>
+      <w:hyperlink r:id="rId78">
+        <w:r>
+          <w:rPr>
+            <w:rStyle w:val="Hyperlink"/>
+          </w:rPr>
+          <w:t xml:space="preserve">https://doi.org/10.1021/acs.jcim.8b00839</w:t>
+        </w:r>
+      </w:hyperlink>
+      <w:r>
+        <w:t xml:space="preserve">.</w:t>
+      </w:r>
+    </w:p>
+    <w:bookmarkEnd w:id="79"/>
+    <w:bookmarkStart w:id="80" w:name="ref-considine2025syntax"/>
     <w:p>
       <w:pPr>
         <w:pStyle w:val="Bibliography"/>
@@ -10811,8 +11004,8 @@
         <w:t xml:space="preserve">.</w:t>
       </w:r>
     </w:p>
-    <w:bookmarkEnd w:id="78"/>
-    <w:bookmarkStart w:id="79" w:name="ref-dai2018syntax"/>
+    <w:bookmarkEnd w:id="80"/>
+    <w:bookmarkStart w:id="81" w:name="ref-dai2018syntax"/>
     <w:p>
       <w:pPr>
         <w:pStyle w:val="Bibliography"/>
@@ -10840,8 +11033,8 @@
         <w:t xml:space="preserve">.</w:t>
       </w:r>
     </w:p>
-    <w:bookmarkEnd w:id="79"/>
-    <w:bookmarkStart w:id="80" w:name="ref-garcez2023neurosymbolic"/>
+    <w:bookmarkEnd w:id="81"/>
+    <w:bookmarkStart w:id="83" w:name="ref-garcez2023neurosymbolic"/>
     <w:p>
       <w:pPr>
         <w:pStyle w:val="Bibliography"/>
@@ -10880,9 +11073,23 @@
       <w:r>
         <w:t xml:space="preserve">56: 12387–406.</w:t>
       </w:r>
-    </w:p>
-    <w:bookmarkEnd w:id="80"/>
-    <w:bookmarkStart w:id="81" w:name="ref-geng2023grammar"/>
+      <w:r>
+        <w:t xml:space="preserve"> </w:t>
+      </w:r>
+      <w:hyperlink r:id="rId82">
+        <w:r>
+          <w:rPr>
+            <w:rStyle w:val="Hyperlink"/>
+          </w:rPr>
+          <w:t xml:space="preserve">https://doi.org/10.1007/s10462-023-10448-w</w:t>
+        </w:r>
+      </w:hyperlink>
+      <w:r>
+        <w:t xml:space="preserve">.</w:t>
+      </w:r>
+    </w:p>
+    <w:bookmarkEnd w:id="83"/>
+    <w:bookmarkStart w:id="85" w:name="ref-geng2023grammar"/>
     <w:p>
       <w:pPr>
         <w:pStyle w:val="Bibliography"/>
@@ -10916,14 +11123,28 @@
           <w:i/>
           <w:iCs/>
         </w:rPr>
-        <w:t xml:space="preserve">Proceedings of EMNLP</w:t>
-      </w:r>
+        <w:t xml:space="preserve">Proceedings of the 2023 Conference on Empirical Methods in Natural Language Processing (EMNLP)</w:t>
+      </w:r>
+      <w:r>
+        <w:t xml:space="preserve">, 10932–52.</w:t>
+      </w:r>
+      <w:r>
+        <w:t xml:space="preserve"> </w:t>
+      </w:r>
+      <w:hyperlink r:id="rId84">
+        <w:r>
+          <w:rPr>
+            <w:rStyle w:val="Hyperlink"/>
+          </w:rPr>
+          <w:t xml:space="preserve">https://doi.org/10.18653/v1/2023.emnlp-main.674</w:t>
+        </w:r>
+      </w:hyperlink>
       <w:r>
         <w:t xml:space="preserve">.</w:t>
       </w:r>
     </w:p>
-    <w:bookmarkEnd w:id="81"/>
-    <w:bookmarkStart w:id="82" w:name="ref-gou2024critic"/>
+    <w:bookmarkEnd w:id="85"/>
+    <w:bookmarkStart w:id="86" w:name="ref-gou2024critic"/>
     <w:p>
       <w:pPr>
         <w:pStyle w:val="Bibliography"/>
@@ -10960,8 +11181,8 @@
         <w:t xml:space="preserve">.</w:t>
       </w:r>
     </w:p>
-    <w:bookmarkEnd w:id="82"/>
-    <w:bookmarkStart w:id="83" w:name="ref-krenn2022selfies"/>
+    <w:bookmarkEnd w:id="86"/>
+    <w:bookmarkStart w:id="88" w:name="ref-krenn2022selfies"/>
     <w:p>
       <w:pPr>
         <w:pStyle w:val="Bibliography"/>
@@ -11003,9 +11224,23 @@
       <w:r>
         <w:t xml:space="preserve">3 (10): 100588.</w:t>
       </w:r>
-    </w:p>
-    <w:bookmarkEnd w:id="83"/>
-    <w:bookmarkStart w:id="84" w:name="ref-krenn2020selfies"/>
+      <w:r>
+        <w:t xml:space="preserve"> </w:t>
+      </w:r>
+      <w:hyperlink r:id="rId87">
+        <w:r>
+          <w:rPr>
+            <w:rStyle w:val="Hyperlink"/>
+          </w:rPr>
+          <w:t xml:space="preserve">https://doi.org/10.1016/j.patter.2022.100588</w:t>
+        </w:r>
+      </w:hyperlink>
+      <w:r>
+        <w:t xml:space="preserve">.</w:t>
+      </w:r>
+    </w:p>
+    <w:bookmarkEnd w:id="88"/>
+    <w:bookmarkStart w:id="90" w:name="ref-krenn2020selfies"/>
     <w:p>
       <w:pPr>
         <w:pStyle w:val="Bibliography"/>
@@ -11041,9 +11276,23 @@
       <w:r>
         <w:t xml:space="preserve">1 (4): 045024.</w:t>
       </w:r>
-    </w:p>
-    <w:bookmarkEnd w:id="84"/>
-    <w:bookmarkStart w:id="85" w:name="ref-kusner2017grammar"/>
+      <w:r>
+        <w:t xml:space="preserve"> </w:t>
+      </w:r>
+      <w:hyperlink r:id="rId89">
+        <w:r>
+          <w:rPr>
+            <w:rStyle w:val="Hyperlink"/>
+          </w:rPr>
+          <w:t xml:space="preserve">https://doi.org/10.1088/2632-2153/aba947</w:t>
+        </w:r>
+      </w:hyperlink>
+      <w:r>
+        <w:t xml:space="preserve">.</w:t>
+      </w:r>
+    </w:p>
+    <w:bookmarkEnd w:id="90"/>
+    <w:bookmarkStart w:id="91" w:name="ref-kusner2017grammar"/>
     <w:p>
       <w:pPr>
         <w:pStyle w:val="Bibliography"/>
@@ -11071,8 +11320,8 @@
         <w:t xml:space="preserve">, 1945–54.</w:t>
       </w:r>
     </w:p>
-    <w:bookmarkEnd w:id="85"/>
-    <w:bookmarkStart w:id="87" w:name="ref-rdkit"/>
+    <w:bookmarkEnd w:id="91"/>
+    <w:bookmarkStart w:id="93" w:name="ref-rdkit"/>
     <w:p>
       <w:pPr>
         <w:pStyle w:val="Bibliography"/>
@@ -11106,7 +11355,7 @@
       <w:r>
         <w:t xml:space="preserve"> </w:t>
       </w:r>
-      <w:hyperlink r:id="rId86">
+      <w:hyperlink r:id="rId92">
         <w:r>
           <w:rPr>
             <w:rStyle w:val="Hyperlink"/>
@@ -11118,8 +11367,8 @@
         <w:t xml:space="preserve">.</w:t>
       </w:r>
     </w:p>
-    <w:bookmarkEnd w:id="87"/>
-    <w:bookmarkStart w:id="88" w:name="ref-madaan2023selfrefine"/>
+    <w:bookmarkEnd w:id="93"/>
+    <w:bookmarkStart w:id="94" w:name="ref-madaan2023selfrefine"/>
     <w:p>
       <w:pPr>
         <w:pStyle w:val="Bibliography"/>
@@ -11156,8 +11405,60 @@
         <w:t xml:space="preserve">.</w:t>
       </w:r>
     </w:p>
-    <w:bookmarkEnd w:id="88"/>
-    <w:bookmarkStart w:id="89" w:name="ref-polykovskiy2020moses"/>
+    <w:bookmarkEnd w:id="94"/>
+    <w:bookmarkStart w:id="96" w:name="ref-park2026chemfixer"/>
+    <w:p>
+      <w:pPr>
+        <w:pStyle w:val="Bibliography"/>
+      </w:pPr>
+      <w:r>
+        <w:t xml:space="preserve">Park, Jun-Hyoung, Ho-Jun Song, and Seong-Whan Lee. 2026.</w:t>
+      </w:r>
+      <w:r>
+        <w:t xml:space="preserve"> </w:t>
+      </w:r>
+      <w:r>
+        <w:t xml:space="preserve">“</w:t>
+      </w:r>
+      <w:r>
+        <w:t xml:space="preserve">ChemFixer</w:t>
+      </w:r>
+      <w:r>
+        <w:t xml:space="preserve">: Correcting Invalid Molecules to Unlock Previously Unseen Chemical Space.”</w:t>
+      </w:r>
+      <w:r>
+        <w:t xml:space="preserve"> </w:t>
+      </w:r>
+      <w:r>
+        <w:rPr>
+          <w:i/>
+          <w:iCs/>
+        </w:rPr>
+        <w:t xml:space="preserve">IEEE Journal of Biomedical and Health Informatics</w:t>
+      </w:r>
+      <w:r>
+        <w:t xml:space="preserve"> </w:t>
+      </w:r>
+      <w:r>
+        <w:t xml:space="preserve">30 (2): 1772–84.</w:t>
+      </w:r>
+      <w:r>
+        <w:t xml:space="preserve"> </w:t>
+      </w:r>
+      <w:hyperlink r:id="rId95">
+        <w:r>
+          <w:rPr>
+            <w:rStyle w:val="Hyperlink"/>
+          </w:rPr>
+          <w:t xml:space="preserve">https://doi.org/10.1109/JBHI.2025.3593825</w:t>
+        </w:r>
+      </w:hyperlink>
+      <w:r>
+        <w:t xml:space="preserve">.</w:t>
+      </w:r>
+    </w:p>
+    <w:bookmarkEnd w:id="96"/>
+    <w:bookmarkStart w:id="98" w:name="ref-polykovskiy2020moses"/>
     <w:p>
       <w:pPr>
         <w:pStyle w:val="Bibliography"/>
@@ -11196,15 +11497,44 @@
       <w:r>
         <w:t xml:space="preserve">11: 565644.</w:t>
       </w:r>
-    </w:p>
-    <w:bookmarkEnd w:id="89"/>
-    <w:bookmarkStart w:id="90" w:name="ref-qwen2025"/>
+      <w:r>
+        <w:t xml:space="preserve"> </w:t>
+      </w:r>
+      <w:hyperlink r:id="rId97">
+        <w:r>
+          <w:rPr>
+            <w:rStyle w:val="Hyperlink"/>
+          </w:rPr>
+          <w:t xml:space="preserve">https://doi.org/10.3389/fphar.2020.565644</w:t>
+        </w:r>
+      </w:hyperlink>
+      <w:r>
+        <w:t xml:space="preserve">.</w:t>
+      </w:r>
+    </w:p>
+    <w:bookmarkEnd w:id="98"/>
+    <w:bookmarkStart w:id="99" w:name="ref-qwen2025"/>
     <w:p>
       <w:pPr>
         <w:pStyle w:val="Bibliography"/>
       </w:pPr>
       <w:r>
         <w:t xml:space="preserve">Qwen Team. 2024.</w:t>
+      </w:r>
+      <w:r>
+        <w:t xml:space="preserve"> </w:t>
+      </w:r>
+      <w:r>
+        <w:t xml:space="preserve">“</w:t>
+      </w:r>
+      <w:r>
+        <w:t xml:space="preserve">Qwen2.5</w:t>
+      </w:r>
+      <w:r>
+        <w:t xml:space="preserve"> </w:t>
+      </w:r>
+      <w:r>
+        <w:t xml:space="preserve">Technical Report.”</w:t>
       </w:r>
       <w:r>
         <w:t xml:space="preserve"> </w:t>
@@ -11214,28 +11544,14 @@
           <w:i/>
           <w:iCs/>
         </w:rPr>
-        <w:t xml:space="preserve">Qwen2.5</w:t>
-      </w:r>
-      <w:r>
-        <w:rPr>
-          <w:i/>
-          <w:iCs/>
-        </w:rPr>
-        <w:t xml:space="preserve"> </w:t>
-      </w:r>
-      <w:r>
-        <w:rPr>
-          <w:i/>
-          <w:iCs/>
-        </w:rPr>
-        <w:t xml:space="preserve">Technical Report</w:t>
-      </w:r>
-      <w:r>
-        <w:t xml:space="preserve">. Alibaba Group.</w:t>
-      </w:r>
-    </w:p>
-    <w:bookmarkEnd w:id="90"/>
-    <w:bookmarkStart w:id="91" w:name="ref-rogers2010extended"/>
+        <w:t xml:space="preserve">arXiv Preprint arXiv:2412.15115</w:t>
+      </w:r>
+      <w:r>
+        <w:t xml:space="preserve">.</w:t>
+      </w:r>
+    </w:p>
+    <w:bookmarkEnd w:id="99"/>
+    <w:bookmarkStart w:id="101" w:name="ref-rogers2010extended"/>
     <w:p>
       <w:pPr>
         <w:pStyle w:val="Bibliography"/>
@@ -11265,9 +11581,23 @@
       <w:r>
         <w:t xml:space="preserve">50 (5): 742–54.</w:t>
       </w:r>
-    </w:p>
-    <w:bookmarkEnd w:id="91"/>
-    <w:bookmarkStart w:id="93" w:name="ref-schoenmaker2023uncorrupt"/>
+      <w:r>
+        <w:t xml:space="preserve"> </w:t>
+      </w:r>
+      <w:hyperlink r:id="rId100">
+        <w:r>
+          <w:rPr>
+            <w:rStyle w:val="Hyperlink"/>
+          </w:rPr>
+          <w:t xml:space="preserve">https://doi.org/10.1021/ci100050t</w:t>
+        </w:r>
+      </w:hyperlink>
+      <w:r>
+        <w:t xml:space="preserve">.</w:t>
+      </w:r>
+    </w:p>
+    <w:bookmarkEnd w:id="101"/>
+    <w:bookmarkStart w:id="103" w:name="ref-schoenmaker2023uncorrupt"/>
     <w:p>
       <w:pPr>
         <w:pStyle w:val="Bibliography"/>
@@ -11312,7 +11642,7 @@
       <w:r>
         <w:t xml:space="preserve"> </w:t>
       </w:r>
-      <w:hyperlink r:id="rId92">
+      <w:hyperlink r:id="rId102">
         <w:r>
           <w:rPr>
             <w:rStyle w:val="Hyperlink"/>
@@ -11324,8 +11654,8 @@
         <w:t xml:space="preserve">.</w:t>
       </w:r>
     </w:p>
-    <w:bookmarkEnd w:id="93"/>
-    <w:bookmarkStart w:id="95" w:name="ref-skinnider2024invalid"/>
+    <w:bookmarkEnd w:id="103"/>
+    <w:bookmarkStart w:id="105" w:name="ref-skinnider2024invalid"/>
     <w:p>
       <w:pPr>
         <w:pStyle w:val="Bibliography"/>
@@ -11370,7 +11700,7 @@
       <w:r>
         <w:t xml:space="preserve"> </w:t>
       </w:r>
-      <w:hyperlink r:id="rId94">
+      <w:hyperlink r:id="rId104">
         <w:r>
           <w:rPr>
             <w:rStyle w:val="Hyperlink"/>
@@ -11382,8 +11712,8 @@
         <w:t xml:space="preserve">.</w:t>
       </w:r>
     </w:p>
-    <w:bookmarkEnd w:id="95"/>
-    <w:bookmarkStart w:id="97" w:name="ref-smiself2025"/>
+    <w:bookmarkEnd w:id="105"/>
+    <w:bookmarkStart w:id="107" w:name="ref-smiself2025"/>
     <w:p>
       <w:pPr>
         <w:pStyle w:val="Bibliography"/>
@@ -11425,7 +11755,7 @@
       <w:r>
         <w:t xml:space="preserve"> </w:t>
       </w:r>
-      <w:hyperlink r:id="rId96">
+      <w:hyperlink r:id="rId106">
         <w:r>
           <w:rPr>
             <w:rStyle w:val="Hyperlink"/>
@@ -11437,8 +11767,8 @@
         <w:t xml:space="preserve">.</w:t>
       </w:r>
     </w:p>
-    <w:bookmarkEnd w:id="97"/>
-    <w:bookmarkStart w:id="98" w:name="ref-weininger1988smiles"/>
+    <w:bookmarkEnd w:id="107"/>
+    <w:bookmarkStart w:id="109" w:name="ref-weininger1988smiles"/>
     <w:p>
       <w:pPr>
         <w:pStyle w:val="Bibliography"/>
@@ -11456,7 +11786,16 @@
         <w:t xml:space="preserve">SMILES</w:t>
       </w:r>
       <w:r>
-        <w:t xml:space="preserve">, a Chemical Language and Information System. 1. Introduction to Methodology and Encoding Rules.”</w:t>
+        <w:t xml:space="preserve">, a Chemical Language and Information System. 1.</w:t>
+      </w:r>
+      <w:r>
+        <w:t xml:space="preserve"> </w:t>
+      </w:r>
+      <w:r>
+        <w:t xml:space="preserve">I</w:t>
+      </w:r>
+      <w:r>
+        <w:t xml:space="preserve">ntroduction to Methodology and Encoding Rules.”</w:t>
       </w:r>
       <w:r>
         <w:t xml:space="preserve"> </w:t>
@@ -11474,9 +11813,23 @@
       <w:r>
         <w:t xml:space="preserve">28 (1): 31–36.</w:t>
       </w:r>
-    </w:p>
-    <w:bookmarkEnd w:id="98"/>
-    <w:bookmarkStart w:id="99" w:name="ref-welleck2023generating"/>
+      <w:r>
+        <w:t xml:space="preserve"> </w:t>
+      </w:r>
+      <w:hyperlink r:id="rId108">
+        <w:r>
+          <w:rPr>
+            <w:rStyle w:val="Hyperlink"/>
+          </w:rPr>
+          <w:t xml:space="preserve">https://doi.org/10.1021/ci00057a005</w:t>
+        </w:r>
+      </w:hyperlink>
+      <w:r>
+        <w:t xml:space="preserve">.</w:t>
+      </w:r>
+    </w:p>
+    <w:bookmarkEnd w:id="109"/>
+    <w:bookmarkStart w:id="110" w:name="ref-welleck2023generating"/>
     <w:p>
       <w:pPr>
         <w:pStyle w:val="Bibliography"/>
@@ -11507,8 +11860,8 @@
         <w:t xml:space="preserve">.</w:t>
       </w:r>
     </w:p>
-    <w:bookmarkEnd w:id="99"/>
-    <w:bookmarkStart w:id="100" w:name="ref-amrec"/>
+    <w:bookmarkEnd w:id="110"/>
+    <w:bookmarkStart w:id="111" w:name="ref-amrec"/>
     <w:p>
       <w:pPr>
         <w:pStyle w:val="Bibliography"/>
@@ -11536,10 +11889,56 @@
         <w:t xml:space="preserve">.</w:t>
       </w:r>
     </w:p>
-    <w:bookmarkEnd w:id="100"/>
-    <w:bookmarkEnd w:id="101"/>
-    <w:bookmarkEnd w:id="102"/>
-    <w:bookmarkEnd w:id="103"/>
+    <w:bookmarkEnd w:id="111"/>
+    <w:bookmarkStart w:id="113" w:name="ref-zheng2020scrop"/>
+    <w:p>
+      <w:pPr>
+        <w:pStyle w:val="Bibliography"/>
+      </w:pPr>
+      <w:r>
+        <w:t xml:space="preserve">Zheng, Shuangjia, Jiahua Rao, Zhongyue Zhang, Jun Xu, and Yuedong Yang. 2020.</w:t>
+      </w:r>
+      <w:r>
+        <w:t xml:space="preserve"> </w:t>
+      </w:r>
+      <w:r>
+        <w:t xml:space="preserve">“Predicting Retrosynthetic Reactions Using Self-Corrected Transformer Neural Networks.”</w:t>
+      </w:r>
+      <w:r>
+        <w:t xml:space="preserve"> </w:t>
+      </w:r>
+      <w:r>
+        <w:rPr>
+          <w:i/>
+          <w:iCs/>
+        </w:rPr>
+        <w:t xml:space="preserve">Journal of Chemical Information and Modeling</w:t>
+      </w:r>
+      <w:r>
+        <w:t xml:space="preserve"> </w:t>
+      </w:r>
+      <w:r>
+        <w:t xml:space="preserve">60 (1): 47–55.</w:t>
+      </w:r>
+      <w:r>
+        <w:t xml:space="preserve"> </w:t>
+      </w:r>
+      <w:hyperlink r:id="rId112">
+        <w:r>
+          <w:rPr>
+            <w:rStyle w:val="Hyperlink"/>
+          </w:rPr>
+          <w:t xml:space="preserve">https://doi.org/10.1021/acs.jcim.9b00949</w:t>
+        </w:r>
+      </w:hyperlink>
+      <w:r>
+        <w:t xml:space="preserve">.</w:t>
+      </w:r>
+    </w:p>
+    <w:bookmarkEnd w:id="113"/>
+    <w:bookmarkEnd w:id="114"/>
+    <w:bookmarkEnd w:id="115"/>
+    <w:bookmarkEnd w:id="116"/>
     <w:sectPr>
       <w:footnotePr>
         <w:numRestart w:val="eachSect"/>

</xml_diff>